<commit_message>
Implement the Items and Category models and ability to transfer those data to and from the csv file.
</commit_message>
<xml_diff>
--- a/Documentations/SRS.docx
+++ b/Documentations/SRS.docx
@@ -107,16 +107,30 @@
           <w:sz w:val="44"/>
           <w:szCs w:val="44"/>
         </w:rPr>
-        <w:t>Invent</w:t>
-      </w:r>
-      <w:r>
+        <w:t>InventBox</w:t>
+      </w:r>
+    </w:p>
+    <w:p>
+      <w:pPr>
+        <w:pStyle w:val="Normal"/>
+        <w:bidi w:val="0"/>
+        <w:spacing w:lineRule="auto" w:line="480"/>
+        <w:jc w:val="center"/>
         <w:rPr>
           <w:b/>
           <w:bCs/>
-          <w:sz w:val="44"/>
-          <w:szCs w:val="44"/>
-        </w:rPr>
-        <w:t>Box</w:t>
+          <w:sz w:val="24"/>
+          <w:szCs w:val="24"/>
+        </w:rPr>
+      </w:pPr>
+      <w:r>
+        <w:rPr>
+          <w:b/>
+          <w:bCs/>
+          <w:sz w:val="24"/>
+          <w:szCs w:val="24"/>
+        </w:rPr>
+        <w:t>Version 1.0</w:t>
       </w:r>
     </w:p>
     <w:p>
@@ -139,16 +153,30 @@
           <w:sz w:val="24"/>
           <w:szCs w:val="24"/>
         </w:rPr>
-        <w:t xml:space="preserve">Version </w:t>
-      </w:r>
-      <w:r>
+        <w:t>Prepared by William Rose</w:t>
+      </w:r>
+    </w:p>
+    <w:p>
+      <w:pPr>
+        <w:pStyle w:val="Normal"/>
+        <w:bidi w:val="0"/>
+        <w:spacing w:lineRule="auto" w:line="480"/>
+        <w:jc w:val="center"/>
         <w:rPr>
           <w:b/>
           <w:bCs/>
           <w:sz w:val="24"/>
           <w:szCs w:val="24"/>
         </w:rPr>
-        <w:t>1.0</w:t>
+      </w:pPr>
+      <w:r>
+        <w:rPr>
+          <w:b/>
+          <w:bCs/>
+          <w:sz w:val="24"/>
+          <w:szCs w:val="24"/>
+        </w:rPr>
+        <w:t>4/13/2026</w:t>
       </w:r>
     </w:p>
     <w:p>
@@ -171,52 +199,6 @@
           <w:sz w:val="24"/>
           <w:szCs w:val="24"/>
         </w:rPr>
-        <w:t>Prepared by William Rose</w:t>
-      </w:r>
-    </w:p>
-    <w:p>
-      <w:pPr>
-        <w:pStyle w:val="Normal"/>
-        <w:bidi w:val="0"/>
-        <w:spacing w:lineRule="auto" w:line="480"/>
-        <w:jc w:val="center"/>
-        <w:rPr>
-          <w:b/>
-          <w:bCs/>
-          <w:sz w:val="24"/>
-          <w:szCs w:val="24"/>
-        </w:rPr>
-      </w:pPr>
-      <w:r>
-        <w:rPr>
-          <w:b/>
-          <w:bCs/>
-          <w:sz w:val="24"/>
-          <w:szCs w:val="24"/>
-        </w:rPr>
-        <w:t>4/13/2026</w:t>
-      </w:r>
-    </w:p>
-    <w:p>
-      <w:pPr>
-        <w:pStyle w:val="Normal"/>
-        <w:bidi w:val="0"/>
-        <w:spacing w:lineRule="auto" w:line="480"/>
-        <w:jc w:val="center"/>
-        <w:rPr>
-          <w:b/>
-          <w:bCs/>
-          <w:sz w:val="24"/>
-          <w:szCs w:val="24"/>
-        </w:rPr>
-      </w:pPr>
-      <w:r>
-        <w:rPr>
-          <w:b/>
-          <w:bCs/>
-          <w:sz w:val="24"/>
-          <w:szCs w:val="24"/>
-        </w:rPr>
       </w:r>
       <w:r>
         <w:br w:type="page"/>
@@ -226,7 +208,7 @@
       <w:pPr>
         <w:pStyle w:val="Normal"/>
         <w:bidi w:val="0"/>
-        <w:spacing w:lineRule="auto" w:line="480"/>
+        <w:spacing w:lineRule="auto" w:line="480" w:before="0" w:after="0"/>
         <w:jc w:val="center"/>
         <w:rPr>
           <w:b/>
@@ -290,16 +272,17 @@
             </w:rPr>
             <w:fldChar w:fldCharType="separate"/>
           </w:r>
-          <w:hyperlink w:anchor="__RefHeading___Toc1649_1349472584" w:tooltip="1. Project background and descriptions">
-            <w:r>
-              <w:rPr>
-                <w:rStyle w:val="IndexLink"/>
-              </w:rPr>
-              <w:t>1. Project background and descriptions</w:t>
-              <w:tab/>
-              <w:t>3</w:t>
-            </w:r>
-          </w:hyperlink>
+          <w:r>
+            <w:rPr>
+              <w:rStyle w:val="IndexLink"/>
+            </w:rPr>
+            <w:t>1. Project background and descriptions</w:t>
+          </w:r>
+          <w:r>
+            <w:rPr/>
+            <w:tab/>
+            <w:t>3</w:t>
+          </w:r>
         </w:p>
         <w:p>
           <w:pPr>
@@ -312,16 +295,12 @@
             <w:jc w:val="start"/>
             <w:rPr/>
           </w:pPr>
-          <w:hyperlink w:anchor="__RefHeading___Toc260_2378469445" w:tooltip="2. Project scope">
-            <w:r>
-              <w:rPr>
-                <w:rStyle w:val="IndexLink"/>
-              </w:rPr>
-              <w:t>2. Project scope</w:t>
-              <w:tab/>
-              <w:t>3</w:t>
-            </w:r>
-          </w:hyperlink>
+          <w:r>
+            <w:rPr/>
+            <w:t>2. Project scope</w:t>
+            <w:tab/>
+            <w:t>3</w:t>
+          </w:r>
         </w:p>
         <w:p>
           <w:pPr>
@@ -334,16 +313,12 @@
             <w:jc w:val="start"/>
             <w:rPr/>
           </w:pPr>
-          <w:hyperlink w:anchor="__RefHeading___Toc1653_1349472584" w:tooltip="3. High-level requirements">
-            <w:r>
-              <w:rPr>
-                <w:rStyle w:val="IndexLink"/>
-              </w:rPr>
-              <w:t>3. High-level requirements</w:t>
-              <w:tab/>
-              <w:t>3</w:t>
-            </w:r>
-          </w:hyperlink>
+          <w:r>
+            <w:rPr/>
+            <w:t>3. High-level requirements</w:t>
+            <w:tab/>
+            <w:t>3</w:t>
+          </w:r>
         </w:p>
         <w:p>
           <w:pPr>
@@ -356,16 +331,12 @@
             <w:jc w:val="start"/>
             <w:rPr/>
           </w:pPr>
-          <w:hyperlink w:anchor="__RefHeading___Toc1655_1349472584" w:tooltip="4. Entities">
-            <w:r>
-              <w:rPr>
-                <w:rStyle w:val="IndexLink"/>
-              </w:rPr>
-              <w:t>4. Entities</w:t>
-              <w:tab/>
-              <w:t>3</w:t>
-            </w:r>
-          </w:hyperlink>
+          <w:r>
+            <w:rPr/>
+            <w:t>4. Entities</w:t>
+            <w:tab/>
+            <w:t>3</w:t>
+          </w:r>
         </w:p>
         <w:p>
           <w:pPr>
@@ -378,16 +349,12 @@
             <w:jc w:val="start"/>
             <w:rPr/>
           </w:pPr>
-          <w:hyperlink w:anchor="__RefHeading___Toc1657_1349472584" w:tooltip="5. Success Metrics">
-            <w:r>
-              <w:rPr>
-                <w:rStyle w:val="IndexLink"/>
-              </w:rPr>
-              <w:t>5. Success Metrics</w:t>
-              <w:tab/>
-              <w:t>3</w:t>
-            </w:r>
-          </w:hyperlink>
+          <w:r>
+            <w:rPr/>
+            <w:t>5. Success Metrics</w:t>
+            <w:tab/>
+            <w:t>3</w:t>
+          </w:r>
         </w:p>
         <w:p>
           <w:pPr>
@@ -400,16 +367,12 @@
             <w:jc w:val="start"/>
             <w:rPr/>
           </w:pPr>
-          <w:hyperlink w:anchor="__RefHeading___Toc1659_1349472584" w:tooltip="6. Considerations">
-            <w:r>
-              <w:rPr>
-                <w:rStyle w:val="IndexLink"/>
-              </w:rPr>
-              <w:t>6. Considerations</w:t>
-              <w:tab/>
-              <w:t>4</w:t>
-            </w:r>
-          </w:hyperlink>
+          <w:r>
+            <w:rPr/>
+            <w:t>6. Considerations</w:t>
+            <w:tab/>
+            <w:t>4</w:t>
+          </w:r>
         </w:p>
         <w:p>
           <w:pPr>
@@ -422,16 +385,12 @@
             <w:jc w:val="start"/>
             <w:rPr/>
           </w:pPr>
-          <w:hyperlink w:anchor="__RefHeading___Toc1661_1349472584" w:tooltip="7. Specific Exclusion from Project Scope">
-            <w:r>
-              <w:rPr>
-                <w:rStyle w:val="IndexLink"/>
-              </w:rPr>
-              <w:t>7. Specific Exclusion from Project Scope</w:t>
-              <w:tab/>
-              <w:t>5</w:t>
-            </w:r>
-          </w:hyperlink>
+          <w:r>
+            <w:rPr/>
+            <w:t>7. Specific Exclusion from Project Scope</w:t>
+            <w:tab/>
+            <w:t>5</w:t>
+          </w:r>
         </w:p>
         <w:p>
           <w:pPr>
@@ -444,16 +403,12 @@
             <w:jc w:val="start"/>
             <w:rPr/>
           </w:pPr>
-          <w:hyperlink w:anchor="__RefHeading___Toc1663_1349472584" w:tooltip="8. Dependencies and Technologies">
-            <w:r>
-              <w:rPr>
-                <w:rStyle w:val="IndexLink"/>
-              </w:rPr>
-              <w:t>8. Dependencies and Technologies</w:t>
-              <w:tab/>
-              <w:t>6</w:t>
-            </w:r>
-          </w:hyperlink>
+          <w:r>
+            <w:rPr/>
+            <w:t>8. Dependencies and Technologies</w:t>
+            <w:tab/>
+            <w:t>6</w:t>
+          </w:r>
         </w:p>
         <w:p>
           <w:pPr>
@@ -466,16 +421,12 @@
             <w:jc w:val="start"/>
             <w:rPr/>
           </w:pPr>
-          <w:hyperlink w:anchor="__RefHeading___Toc1665_1349472584" w:tooltip="9. Assumptions">
-            <w:r>
-              <w:rPr>
-                <w:rStyle w:val="IndexLink"/>
-              </w:rPr>
-              <w:t>9. Assumptions</w:t>
-              <w:tab/>
-              <w:t>6</w:t>
-            </w:r>
-          </w:hyperlink>
+          <w:r>
+            <w:rPr/>
+            <w:t>9. Assumptions</w:t>
+            <w:tab/>
+            <w:t>6</w:t>
+          </w:r>
         </w:p>
         <w:p>
           <w:pPr>
@@ -488,20 +439,14 @@
             <w:jc w:val="start"/>
             <w:rPr/>
           </w:pPr>
-          <w:hyperlink w:anchor="__RefHeading___Toc1667_1349472584" w:tooltip="10. Designs and Diagrams">
-            <w:r>
-              <w:rPr>
-                <w:rStyle w:val="IndexLink"/>
-              </w:rPr>
-              <w:t>10. Designs and Diagrams</w:t>
-              <w:tab/>
-              <w:t>7</w:t>
-            </w:r>
-          </w:hyperlink>
           <w:r>
-            <w:rPr>
-              <w:rStyle w:val="IndexLink"/>
-            </w:rPr>
+            <w:rPr/>
+            <w:t>10. Designs and Diagrams</w:t>
+            <w:tab/>
+            <w:t>7</w:t>
+          </w:r>
+          <w:r>
+            <w:rPr/>
             <w:fldChar w:fldCharType="end"/>
           </w:r>
         </w:p>
@@ -562,6 +507,7 @@
           <w:numId w:val="0"/>
         </w:numPr>
         <w:bidi w:val="0"/>
+        <w:spacing w:before="0" w:after="120"/>
         <w:ind w:hanging="0" w:start="0"/>
         <w:jc w:val="start"/>
         <w:rPr>
@@ -576,14 +522,7 @@
           <w:sz w:val="24"/>
           <w:szCs w:val="24"/>
         </w:rPr>
-        <w:t xml:space="preserve">1. </w:t>
-      </w:r>
-      <w:r>
-        <w:rPr>
-          <w:sz w:val="24"/>
-          <w:szCs w:val="24"/>
-        </w:rPr>
-        <w:t>Project background and descriptions</w:t>
+        <w:t>1. Project background and descriptions</w:t>
       </w:r>
     </w:p>
     <w:p>
@@ -602,14 +541,7 @@
           <w:szCs w:val="24"/>
         </w:rPr>
         <w:tab/>
-        <w:t xml:space="preserve">Target Release: </w:t>
-      </w:r>
-      <w:r>
-        <w:rPr>
-          <w:sz w:val="24"/>
-          <w:szCs w:val="24"/>
-        </w:rPr>
-        <w:t>1.0</w:t>
+        <w:t>Target Release: 1.0</w:t>
       </w:r>
     </w:p>
     <w:p>
@@ -628,14 +560,7 @@
           <w:szCs w:val="24"/>
         </w:rPr>
         <w:tab/>
-        <w:t xml:space="preserve">Status: </w:t>
-      </w:r>
-      <w:r>
-        <w:rPr>
-          <w:sz w:val="24"/>
-          <w:szCs w:val="24"/>
-        </w:rPr>
-        <w:t>Rough Draft</w:t>
+        <w:t>Status: Rough Draft</w:t>
       </w:r>
     </w:p>
     <w:p>
@@ -654,14 +579,7 @@
           <w:szCs w:val="24"/>
         </w:rPr>
         <w:tab/>
-        <w:t xml:space="preserve">Document Owner: </w:t>
-      </w:r>
-      <w:r>
-        <w:rPr>
-          <w:sz w:val="24"/>
-          <w:szCs w:val="24"/>
-        </w:rPr>
-        <w:t>William Rose</w:t>
+        <w:t>Document Owner: William Rose</w:t>
       </w:r>
     </w:p>
     <w:p>
@@ -680,14 +598,7 @@
           <w:szCs w:val="24"/>
         </w:rPr>
         <w:tab/>
-        <w:t xml:space="preserve">Designer: </w:t>
-      </w:r>
-      <w:r>
-        <w:rPr>
-          <w:sz w:val="24"/>
-          <w:szCs w:val="24"/>
-        </w:rPr>
-        <w:t>William Rose</w:t>
+        <w:t>Designer: William Rose</w:t>
       </w:r>
     </w:p>
     <w:p>
@@ -706,14 +617,7 @@
           <w:szCs w:val="24"/>
         </w:rPr>
         <w:tab/>
-        <w:t xml:space="preserve">Tech Lead: </w:t>
-      </w:r>
-      <w:r>
-        <w:rPr>
-          <w:sz w:val="24"/>
-          <w:szCs w:val="24"/>
-        </w:rPr>
-        <w:t>William Rose</w:t>
+        <w:t>Tech Lead: William Rose</w:t>
       </w:r>
     </w:p>
     <w:p>
@@ -751,9 +655,6 @@
       <w:r>
         <w:rPr/>
         <w:tab/>
-      </w:r>
-      <w:r>
-        <w:rPr/>
         <w:t xml:space="preserve">InventBox was the inventory management that aims to create, delete, manage, or search the </w:t>
         <w:tab/>
         <w:t xml:space="preserve">inventory of items or part of the items and display them in an organized way with categories </w:t>
@@ -764,53 +665,49 @@
     <w:p>
       <w:pPr>
         <w:pStyle w:val="Heading1"/>
-        <w:bidi w:val="0"/>
-        <w:ind w:hanging="0" w:start="0"/>
-        <w:jc w:val="start"/>
-        <w:rPr>
-          <w:sz w:val="24"/>
-          <w:szCs w:val="24"/>
-        </w:rPr>
-      </w:pPr>
-      <w:bookmarkStart w:id="2" w:name="__RefHeading___Toc1653_1349472584"/>
-      <w:bookmarkEnd w:id="2"/>
-      <w:r>
-        <w:rPr>
-          <w:sz w:val="24"/>
-          <w:szCs w:val="24"/>
-        </w:rPr>
-        <w:t>3. High-level requirements</w:t>
-      </w:r>
-    </w:p>
-    <w:p>
-      <w:pPr>
-        <w:pStyle w:val="Normal"/>
-        <w:bidi w:val="0"/>
-        <w:jc w:val="start"/>
-        <w:rPr/>
-      </w:pPr>
-      <w:r>
-        <w:rPr/>
-        <w:tab/>
-        <w:t>Invent</w:t>
-      </w:r>
-      <w:r>
-        <w:rPr/>
-        <w:t>Box</w:t>
-      </w:r>
-      <w:r>
-        <w:rPr/>
-        <w:t xml:space="preserve"> will include the following:</w:t>
-      </w:r>
-    </w:p>
-    <w:p>
-      <w:pPr>
-        <w:pStyle w:val="Normal"/>
         <w:numPr>
           <w:ilvl w:val="0"/>
           <w:numId w:val="2"/>
         </w:numPr>
         <w:bidi w:val="0"/>
+        <w:ind w:hanging="0" w:start="0"/>
+        <w:jc w:val="start"/>
+        <w:rPr>
+          <w:sz w:val="24"/>
+          <w:szCs w:val="24"/>
+        </w:rPr>
+      </w:pPr>
+      <w:bookmarkStart w:id="2" w:name="__RefHeading___Toc1653_1349472584"/>
+      <w:bookmarkEnd w:id="2"/>
+      <w:r>
+        <w:rPr>
+          <w:sz w:val="24"/>
+          <w:szCs w:val="24"/>
+        </w:rPr>
+        <w:t>3. High-level requirements</w:t>
+      </w:r>
+    </w:p>
+    <w:p>
+      <w:pPr>
+        <w:pStyle w:val="Normal"/>
+        <w:bidi w:val="0"/>
+        <w:jc w:val="start"/>
+        <w:rPr/>
+      </w:pPr>
+      <w:r>
+        <w:rPr/>
+        <w:tab/>
+        <w:t>InventBox will include the following:</w:t>
+      </w:r>
+    </w:p>
+    <w:p>
+      <w:pPr>
+        <w:pStyle w:val="Normal"/>
+        <w:numPr>
+          <w:ilvl w:val="0"/>
+          <w:numId w:val="3"/>
+        </w:numPr>
+        <w:bidi w:val="0"/>
         <w:jc w:val="start"/>
         <w:rPr/>
       </w:pPr>
@@ -822,284 +719,256 @@
     <w:p>
       <w:pPr>
         <w:pStyle w:val="Normal"/>
+        <w:numPr>
+          <w:ilvl w:val="0"/>
+          <w:numId w:val="3"/>
+        </w:numPr>
+        <w:bidi w:val="0"/>
+        <w:jc w:val="start"/>
+        <w:rPr/>
+      </w:pPr>
+      <w:r>
+        <w:rPr/>
+        <w:t>An interface to show user interface</w:t>
+      </w:r>
+    </w:p>
+    <w:p>
+      <w:pPr>
+        <w:pStyle w:val="Normal"/>
+        <w:numPr>
+          <w:ilvl w:val="0"/>
+          <w:numId w:val="3"/>
+        </w:numPr>
+        <w:bidi w:val="0"/>
+        <w:jc w:val="start"/>
+        <w:rPr/>
+      </w:pPr>
+      <w:r>
+        <w:rPr/>
+        <w:t>An interface to show the items in an inventory</w:t>
+      </w:r>
+    </w:p>
+    <w:p>
+      <w:pPr>
+        <w:pStyle w:val="Normal"/>
+        <w:numPr>
+          <w:ilvl w:val="0"/>
+          <w:numId w:val="3"/>
+        </w:numPr>
+        <w:bidi w:val="0"/>
+        <w:jc w:val="start"/>
+        <w:rPr/>
+      </w:pPr>
+      <w:r>
+        <w:rPr/>
+        <w:t>A system that search for the items in an inventory</w:t>
+      </w:r>
+    </w:p>
+    <w:p>
+      <w:pPr>
+        <w:pStyle w:val="Normal"/>
+        <w:numPr>
+          <w:ilvl w:val="0"/>
+          <w:numId w:val="3"/>
+        </w:numPr>
+        <w:bidi w:val="0"/>
+        <w:jc w:val="start"/>
+        <w:rPr/>
+      </w:pPr>
+      <w:r>
+        <w:rPr/>
+        <w:t>A system that organize the items by locations and categories</w:t>
+      </w:r>
+    </w:p>
+    <w:p>
+      <w:pPr>
+        <w:pStyle w:val="Normal"/>
+        <w:numPr>
+          <w:ilvl w:val="0"/>
+          <w:numId w:val="3"/>
+        </w:numPr>
+        <w:bidi w:val="0"/>
+        <w:jc w:val="start"/>
+        <w:rPr/>
+      </w:pPr>
+      <w:r>
+        <w:rPr/>
+        <w:t>A system that create, update, or delete the items in an inventory</w:t>
+      </w:r>
+    </w:p>
+    <w:p>
+      <w:pPr>
+        <w:pStyle w:val="Normal"/>
+        <w:numPr>
+          <w:ilvl w:val="0"/>
+          <w:numId w:val="3"/>
+        </w:numPr>
+        <w:bidi w:val="0"/>
+        <w:jc w:val="start"/>
+        <w:rPr/>
+      </w:pPr>
+      <w:r>
+        <w:rPr/>
+        <w:t>A system that scan the bar code to add or grab the items</w:t>
+      </w:r>
+    </w:p>
+    <w:p>
+      <w:pPr>
+        <w:pStyle w:val="Normal"/>
+        <w:numPr>
+          <w:ilvl w:val="0"/>
+          <w:numId w:val="3"/>
+        </w:numPr>
+        <w:bidi w:val="0"/>
+        <w:jc w:val="start"/>
+        <w:rPr/>
+      </w:pPr>
+      <w:r>
+        <w:rPr/>
+        <w:t>A system that calculate the total prices for items that needed</w:t>
+      </w:r>
+    </w:p>
+    <w:p>
+      <w:pPr>
+        <w:pStyle w:val="Normal"/>
+        <w:numPr>
+          <w:ilvl w:val="0"/>
+          <w:numId w:val="3"/>
+        </w:numPr>
+        <w:bidi w:val="0"/>
+        <w:jc w:val="start"/>
+        <w:rPr/>
+      </w:pPr>
+      <w:r>
+        <w:rPr/>
+        <w:t>A system that export and import data for easy transfer</w:t>
+      </w:r>
+    </w:p>
+    <w:p>
+      <w:pPr>
+        <w:pStyle w:val="Normal"/>
+        <w:numPr>
+          <w:ilvl w:val="0"/>
+          <w:numId w:val="3"/>
+        </w:numPr>
+        <w:bidi w:val="0"/>
+        <w:jc w:val="start"/>
+        <w:rPr/>
+      </w:pPr>
+      <w:r>
+        <w:rPr/>
+        <w:t>A system that filter the items by specific information</w:t>
+      </w:r>
+    </w:p>
+    <w:p>
+      <w:pPr>
+        <w:pStyle w:val="Heading1"/>
         <w:numPr>
           <w:ilvl w:val="0"/>
           <w:numId w:val="2"/>
         </w:numPr>
         <w:bidi w:val="0"/>
-        <w:jc w:val="start"/>
-        <w:rPr/>
-      </w:pPr>
-      <w:r>
-        <w:rPr/>
-        <w:t>An interface to show user interface</w:t>
-      </w:r>
-    </w:p>
-    <w:p>
-      <w:pPr>
-        <w:pStyle w:val="Normal"/>
+        <w:ind w:hanging="0" w:start="0"/>
+        <w:jc w:val="start"/>
+        <w:rPr>
+          <w:sz w:val="24"/>
+          <w:szCs w:val="24"/>
+        </w:rPr>
+      </w:pPr>
+      <w:bookmarkStart w:id="3" w:name="__RefHeading___Toc1655_1349472584"/>
+      <w:bookmarkEnd w:id="3"/>
+      <w:r>
+        <w:rPr>
+          <w:sz w:val="24"/>
+          <w:szCs w:val="24"/>
+        </w:rPr>
+        <w:t>4. Entities</w:t>
+      </w:r>
+    </w:p>
+    <w:p>
+      <w:pPr>
+        <w:pStyle w:val="Normal"/>
+        <w:bidi w:val="0"/>
+        <w:jc w:val="start"/>
+        <w:rPr/>
+      </w:pPr>
+      <w:r>
+        <w:rPr/>
+        <w:tab/>
+        <w:t>InventBox will affect the following entities:</w:t>
+      </w:r>
+    </w:p>
+    <w:p>
+      <w:pPr>
+        <w:pStyle w:val="Normal"/>
+        <w:numPr>
+          <w:ilvl w:val="0"/>
+          <w:numId w:val="4"/>
+        </w:numPr>
+        <w:bidi w:val="0"/>
+        <w:jc w:val="start"/>
+        <w:rPr/>
+      </w:pPr>
+      <w:r>
+        <w:rPr/>
+        <w:t>InventBox System – Also known as this system that display the interface to the user on the frontend</w:t>
+      </w:r>
+    </w:p>
+    <w:p>
+      <w:pPr>
+        <w:pStyle w:val="Normal"/>
+        <w:numPr>
+          <w:ilvl w:val="0"/>
+          <w:numId w:val="4"/>
+        </w:numPr>
+        <w:bidi w:val="0"/>
+        <w:jc w:val="start"/>
+        <w:rPr/>
+      </w:pPr>
+      <w:r>
+        <w:rPr/>
+        <w:t>InventBox Backend – The API layer that manage the data on the backend</w:t>
+      </w:r>
+    </w:p>
+    <w:p>
+      <w:pPr>
+        <w:pStyle w:val="Normal"/>
+        <w:numPr>
+          <w:ilvl w:val="0"/>
+          <w:numId w:val="4"/>
+        </w:numPr>
+        <w:bidi w:val="0"/>
+        <w:jc w:val="start"/>
+        <w:rPr/>
+      </w:pPr>
+      <w:r>
+        <w:rPr/>
+        <w:t>User – The user that uses the InventBox</w:t>
+      </w:r>
+    </w:p>
+    <w:p>
+      <w:pPr>
+        <w:pStyle w:val="Normal"/>
+        <w:numPr>
+          <w:ilvl w:val="0"/>
+          <w:numId w:val="4"/>
+        </w:numPr>
+        <w:bidi w:val="0"/>
+        <w:jc w:val="start"/>
+        <w:rPr/>
+      </w:pPr>
+      <w:r>
+        <w:rPr/>
+        <w:t>System Admin – The user that is responsible for managing and maintaining the InventBox</w:t>
+      </w:r>
+    </w:p>
+    <w:p>
+      <w:pPr>
+        <w:pStyle w:val="Heading1"/>
         <w:numPr>
           <w:ilvl w:val="0"/>
           <w:numId w:val="2"/>
         </w:numPr>
-        <w:bidi w:val="0"/>
-        <w:jc w:val="start"/>
-        <w:rPr/>
-      </w:pPr>
-      <w:r>
-        <w:rPr/>
-        <w:t>An interface to show the items in an inventory</w:t>
-      </w:r>
-    </w:p>
-    <w:p>
-      <w:pPr>
-        <w:pStyle w:val="Normal"/>
-        <w:numPr>
-          <w:ilvl w:val="0"/>
-          <w:numId w:val="2"/>
-        </w:numPr>
-        <w:bidi w:val="0"/>
-        <w:jc w:val="start"/>
-        <w:rPr/>
-      </w:pPr>
-      <w:r>
-        <w:rPr/>
-        <w:t>A system that search for the items in an inventory</w:t>
-      </w:r>
-    </w:p>
-    <w:p>
-      <w:pPr>
-        <w:pStyle w:val="Normal"/>
-        <w:numPr>
-          <w:ilvl w:val="0"/>
-          <w:numId w:val="2"/>
-        </w:numPr>
-        <w:bidi w:val="0"/>
-        <w:jc w:val="start"/>
-        <w:rPr/>
-      </w:pPr>
-      <w:r>
-        <w:rPr/>
-        <w:t xml:space="preserve">A system that </w:t>
-      </w:r>
-      <w:r>
-        <w:rPr/>
-        <w:t>organize</w:t>
-      </w:r>
-      <w:r>
-        <w:rPr/>
-        <w:t xml:space="preserve"> the items by locations and categories</w:t>
-      </w:r>
-    </w:p>
-    <w:p>
-      <w:pPr>
-        <w:pStyle w:val="Normal"/>
-        <w:numPr>
-          <w:ilvl w:val="0"/>
-          <w:numId w:val="2"/>
-        </w:numPr>
-        <w:bidi w:val="0"/>
-        <w:jc w:val="start"/>
-        <w:rPr/>
-      </w:pPr>
-      <w:r>
-        <w:rPr/>
-        <w:t>A system that create, update, or delete the items in an inventory</w:t>
-      </w:r>
-    </w:p>
-    <w:p>
-      <w:pPr>
-        <w:pStyle w:val="Normal"/>
-        <w:numPr>
-          <w:ilvl w:val="0"/>
-          <w:numId w:val="2"/>
-        </w:numPr>
-        <w:bidi w:val="0"/>
-        <w:jc w:val="start"/>
-        <w:rPr/>
-      </w:pPr>
-      <w:r>
-        <w:rPr/>
-        <w:t>A system that scan the bar code to add or grab the items</w:t>
-      </w:r>
-    </w:p>
-    <w:p>
-      <w:pPr>
-        <w:pStyle w:val="Normal"/>
-        <w:numPr>
-          <w:ilvl w:val="0"/>
-          <w:numId w:val="2"/>
-        </w:numPr>
-        <w:bidi w:val="0"/>
-        <w:jc w:val="start"/>
-        <w:rPr/>
-      </w:pPr>
-      <w:r>
-        <w:rPr/>
-        <w:t>A system that calculate the total prices for items that needed</w:t>
-      </w:r>
-    </w:p>
-    <w:p>
-      <w:pPr>
-        <w:pStyle w:val="Normal"/>
-        <w:numPr>
-          <w:ilvl w:val="0"/>
-          <w:numId w:val="2"/>
-        </w:numPr>
-        <w:bidi w:val="0"/>
-        <w:jc w:val="start"/>
-        <w:rPr/>
-      </w:pPr>
-      <w:r>
-        <w:rPr/>
-        <w:t>A system that export and import data for easy transfer</w:t>
-      </w:r>
-    </w:p>
-    <w:p>
-      <w:pPr>
-        <w:pStyle w:val="Normal"/>
-        <w:numPr>
-          <w:ilvl w:val="0"/>
-          <w:numId w:val="2"/>
-        </w:numPr>
-        <w:bidi w:val="0"/>
-        <w:jc w:val="start"/>
-        <w:rPr/>
-      </w:pPr>
-      <w:r>
-        <w:rPr/>
-        <w:t>A system that filter the items by specific information</w:t>
-      </w:r>
-    </w:p>
-    <w:p>
-      <w:pPr>
-        <w:pStyle w:val="Heading1"/>
-        <w:bidi w:val="0"/>
-        <w:ind w:hanging="0" w:start="0"/>
-        <w:jc w:val="start"/>
-        <w:rPr>
-          <w:sz w:val="24"/>
-          <w:szCs w:val="24"/>
-        </w:rPr>
-      </w:pPr>
-      <w:bookmarkStart w:id="3" w:name="__RefHeading___Toc1655_1349472584"/>
-      <w:bookmarkEnd w:id="3"/>
-      <w:r>
-        <w:rPr>
-          <w:sz w:val="24"/>
-          <w:szCs w:val="24"/>
-        </w:rPr>
-        <w:t>4. Entities</w:t>
-      </w:r>
-    </w:p>
-    <w:p>
-      <w:pPr>
-        <w:pStyle w:val="Normal"/>
-        <w:bidi w:val="0"/>
-        <w:jc w:val="start"/>
-        <w:rPr/>
-      </w:pPr>
-      <w:r>
-        <w:rPr/>
-        <w:tab/>
-        <w:t>Invent</w:t>
-      </w:r>
-      <w:r>
-        <w:rPr/>
-        <w:t>Box</w:t>
-      </w:r>
-      <w:r>
-        <w:rPr/>
-        <w:t xml:space="preserve"> will affect the following entities:</w:t>
-      </w:r>
-    </w:p>
-    <w:p>
-      <w:pPr>
-        <w:pStyle w:val="Normal"/>
-        <w:numPr>
-          <w:ilvl w:val="0"/>
-          <w:numId w:val="3"/>
-        </w:numPr>
-        <w:bidi w:val="0"/>
-        <w:jc w:val="start"/>
-        <w:rPr/>
-      </w:pPr>
-      <w:r>
-        <w:rPr/>
-        <w:t xml:space="preserve">InventBox System – Also known as this system </w:t>
-      </w:r>
-      <w:r>
-        <w:rPr/>
-        <w:t xml:space="preserve">that display the </w:t>
-      </w:r>
-      <w:r>
-        <w:rPr/>
-        <w:t>interface to the user</w:t>
-      </w:r>
-      <w:r>
-        <w:rPr/>
-        <w:t xml:space="preserve"> on the frontend</w:t>
-      </w:r>
-    </w:p>
-    <w:p>
-      <w:pPr>
-        <w:pStyle w:val="Normal"/>
-        <w:numPr>
-          <w:ilvl w:val="0"/>
-          <w:numId w:val="3"/>
-        </w:numPr>
-        <w:bidi w:val="0"/>
-        <w:jc w:val="start"/>
-        <w:rPr/>
-      </w:pPr>
-      <w:r>
-        <w:rPr/>
-        <w:t xml:space="preserve">InventBox Backend – </w:t>
-      </w:r>
-      <w:r>
-        <w:rPr/>
-        <w:t>The API layer that manage the data on the backend</w:t>
-      </w:r>
-    </w:p>
-    <w:p>
-      <w:pPr>
-        <w:pStyle w:val="Normal"/>
-        <w:numPr>
-          <w:ilvl w:val="0"/>
-          <w:numId w:val="3"/>
-        </w:numPr>
-        <w:bidi w:val="0"/>
-        <w:jc w:val="start"/>
-        <w:rPr/>
-      </w:pPr>
-      <w:r>
-        <w:rPr/>
-        <w:t xml:space="preserve">User – </w:t>
-      </w:r>
-      <w:r>
-        <w:rPr/>
-        <w:t>The user that uses the InventBox</w:t>
-      </w:r>
-    </w:p>
-    <w:p>
-      <w:pPr>
-        <w:pStyle w:val="Normal"/>
-        <w:numPr>
-          <w:ilvl w:val="0"/>
-          <w:numId w:val="3"/>
-        </w:numPr>
-        <w:bidi w:val="0"/>
-        <w:jc w:val="start"/>
-        <w:rPr/>
-      </w:pPr>
-      <w:r>
-        <w:rPr/>
-        <w:t>System Admin – The user that is responsible for managing and maintaining the InventBox</w:t>
-      </w:r>
-    </w:p>
-    <w:p>
-      <w:pPr>
-        <w:pStyle w:val="Heading1"/>
         <w:bidi w:val="0"/>
         <w:ind w:hanging="0" w:start="0"/>
         <w:jc w:val="start"/>
@@ -1238,11 +1107,7 @@
             </w:pPr>
             <w:r>
               <w:rPr/>
-              <w:t xml:space="preserve">User can create items into a inventory </w:t>
-            </w:r>
-            <w:r>
-              <w:rPr/>
-              <w:t>via manually or scanning through bar code.</w:t>
+              <w:t>User can create items into a inventory via manually or scanning through bar code.</w:t>
             </w:r>
           </w:p>
         </w:tc>
@@ -1402,11 +1267,7 @@
             </w:pPr>
             <w:r>
               <w:rPr/>
-              <w:t xml:space="preserve">All of relevant information is reachable </w:t>
-            </w:r>
-            <w:r>
-              <w:rPr/>
-              <w:t>from all sort of UI</w:t>
+              <w:t>All of relevant information is reachable from all sort of UI</w:t>
             </w:r>
           </w:p>
         </w:tc>
@@ -1516,6 +1377,10 @@
     <w:p>
       <w:pPr>
         <w:pStyle w:val="Heading1"/>
+        <w:numPr>
+          <w:ilvl w:val="0"/>
+          <w:numId w:val="2"/>
+        </w:numPr>
         <w:bidi w:val="0"/>
         <w:ind w:hanging="0" w:start="0"/>
         <w:jc w:val="start"/>
@@ -1767,11 +1632,7 @@
             </w:pPr>
             <w:r>
               <w:rPr/>
-              <w:t xml:space="preserve">As a user, I want to update and delete the account </w:t>
-            </w:r>
-            <w:r>
-              <w:rPr/>
-              <w:t>if I want to edit information or delete the information from the system.</w:t>
+              <w:t>As a user, I want to update and delete the account if I want to edit information or delete the information from the system.</w:t>
             </w:r>
           </w:p>
         </w:tc>
@@ -2383,11 +2244,7 @@
             </w:pPr>
             <w:r>
               <w:rPr/>
-              <w:t xml:space="preserve">As a system, I want to be able to </w:t>
-            </w:r>
-            <w:r>
-              <w:rPr/>
-              <w:t>organize the items into different locations or categories so user can see the items from those information.</w:t>
+              <w:t>As a system, I want to be able to organize the items into different locations or categories so user can see the items from those information.</w:t>
             </w:r>
           </w:p>
         </w:tc>
@@ -2434,11 +2291,7 @@
             </w:pPr>
             <w:r>
               <w:rPr/>
-              <w:t xml:space="preserve">System can add the total costs </w:t>
-            </w:r>
-            <w:r>
-              <w:rPr/>
-              <w:t>from all of the prices in the shopping lists.</w:t>
+              <w:t>System can add the total costs from all of the prices in the shopping lists.</w:t>
             </w:r>
           </w:p>
         </w:tc>
@@ -2574,11 +2427,7 @@
             </w:pPr>
             <w:r>
               <w:rPr/>
-              <w:t xml:space="preserve">Admin can </w:t>
-            </w:r>
-            <w:r>
-              <w:rPr/>
-              <w:t>manage the data in the backend</w:t>
+              <w:t>Admin can manage the data in the backend</w:t>
             </w:r>
           </w:p>
         </w:tc>
@@ -2646,28 +2495,52 @@
             </w:pPr>
             <w:r>
               <w:rPr/>
-              <w:t>User can export and import the items from or into the inventory.</w:t>
-            </w:r>
-          </w:p>
-        </w:tc>
-        <w:tc>
-          <w:tcPr>
-            <w:tcW w:w="3324" w:type="dxa"/>
-            <w:tcBorders>
-              <w:start w:val="single" w:sz="4" w:space="0" w:color="000000"/>
-              <w:bottom w:val="single" w:sz="4" w:space="0" w:color="000000"/>
-            </w:tcBorders>
-          </w:tcPr>
-          <w:p>
-            <w:pPr>
-              <w:pStyle w:val="TableContents"/>
-              <w:bidi w:val="0"/>
-              <w:jc w:val="start"/>
-              <w:rPr/>
-            </w:pPr>
-            <w:r>
-              <w:rPr/>
-              <w:t>As a user, I want to be able to export and import the data from the inventory so I can transfer from one device to another.</w:t>
+              <w:t xml:space="preserve">User can export and import the </w:t>
+            </w:r>
+            <w:r>
+              <w:rPr/>
+              <w:t>data</w:t>
+            </w:r>
+            <w:r>
+              <w:rPr/>
+              <w:t xml:space="preserve"> from or into the </w:t>
+            </w:r>
+            <w:r>
+              <w:rPr/>
+              <w:t>app</w:t>
+            </w:r>
+            <w:r>
+              <w:rPr/>
+              <w:t>.</w:t>
+            </w:r>
+          </w:p>
+        </w:tc>
+        <w:tc>
+          <w:tcPr>
+            <w:tcW w:w="3324" w:type="dxa"/>
+            <w:tcBorders>
+              <w:start w:val="single" w:sz="4" w:space="0" w:color="000000"/>
+              <w:bottom w:val="single" w:sz="4" w:space="0" w:color="000000"/>
+            </w:tcBorders>
+          </w:tcPr>
+          <w:p>
+            <w:pPr>
+              <w:pStyle w:val="TableContents"/>
+              <w:bidi w:val="0"/>
+              <w:jc w:val="start"/>
+              <w:rPr/>
+            </w:pPr>
+            <w:r>
+              <w:rPr/>
+              <w:t xml:space="preserve">As a user, I want to be able to export and import the data from the </w:t>
+            </w:r>
+            <w:r>
+              <w:rPr/>
+              <w:t>application</w:t>
+            </w:r>
+            <w:r>
+              <w:rPr/>
+              <w:t xml:space="preserve"> so I can transfer from one device to another.</w:t>
             </w:r>
           </w:p>
         </w:tc>
@@ -2691,6 +2564,7 @@
             </w:pPr>
             <w:r>
               <w:rPr/>
+              <w:t>In Progress</w:t>
             </w:r>
           </w:p>
         </w:tc>
@@ -2763,6 +2637,143 @@
           </w:p>
         </w:tc>
       </w:tr>
+      <w:tr>
+        <w:trPr/>
+        <w:tc>
+          <w:tcPr>
+            <w:tcW w:w="3324" w:type="dxa"/>
+            <w:tcBorders>
+              <w:start w:val="single" w:sz="4" w:space="0" w:color="000000"/>
+              <w:bottom w:val="single" w:sz="4" w:space="0" w:color="000000"/>
+            </w:tcBorders>
+          </w:tcPr>
+          <w:p>
+            <w:pPr>
+              <w:pStyle w:val="TableContents"/>
+              <w:bidi w:val="0"/>
+              <w:jc w:val="start"/>
+              <w:rPr/>
+            </w:pPr>
+            <w:r>
+              <w:rPr/>
+              <w:t>Developer can check the logs file for debugging the application.</w:t>
+            </w:r>
+          </w:p>
+        </w:tc>
+        <w:tc>
+          <w:tcPr>
+            <w:tcW w:w="3324" w:type="dxa"/>
+            <w:tcBorders>
+              <w:start w:val="single" w:sz="4" w:space="0" w:color="000000"/>
+              <w:bottom w:val="single" w:sz="4" w:space="0" w:color="000000"/>
+            </w:tcBorders>
+          </w:tcPr>
+          <w:p>
+            <w:pPr>
+              <w:pStyle w:val="TableContents"/>
+              <w:bidi w:val="0"/>
+              <w:jc w:val="start"/>
+              <w:rPr/>
+            </w:pPr>
+            <w:r>
+              <w:rPr/>
+              <w:t>As a developer, I want to be able to check the log files for any bugs or weird behavior from the systems.</w:t>
+            </w:r>
+          </w:p>
+        </w:tc>
+        <w:tc>
+          <w:tcPr>
+            <w:tcW w:w="3324" w:type="dxa"/>
+            <w:tcBorders>
+              <w:start w:val="single" w:sz="4" w:space="0" w:color="000000"/>
+              <w:bottom w:val="single" w:sz="4" w:space="0" w:color="000000"/>
+              <w:end w:val="single" w:sz="4" w:space="0" w:color="000000"/>
+            </w:tcBorders>
+          </w:tcPr>
+          <w:p>
+            <w:pPr>
+              <w:pStyle w:val="TableContents"/>
+              <w:widowControl w:val="false"/>
+              <w:suppressLineNumbers/>
+              <w:bidi w:val="0"/>
+              <w:jc w:val="start"/>
+              <w:rPr/>
+            </w:pPr>
+            <w:r>
+              <w:rPr/>
+              <w:t>Completed</w:t>
+            </w:r>
+          </w:p>
+        </w:tc>
+      </w:tr>
+      <w:tr>
+        <w:trPr/>
+        <w:tc>
+          <w:tcPr>
+            <w:tcW w:w="3324" w:type="dxa"/>
+            <w:tcBorders>
+              <w:start w:val="single" w:sz="4" w:space="0" w:color="000000"/>
+              <w:bottom w:val="single" w:sz="4" w:space="0" w:color="000000"/>
+            </w:tcBorders>
+          </w:tcPr>
+          <w:p>
+            <w:pPr>
+              <w:pStyle w:val="TableContents"/>
+              <w:bidi w:val="0"/>
+              <w:jc w:val="start"/>
+              <w:rPr/>
+            </w:pPr>
+            <w:r>
+              <w:rPr/>
+              <w:t>User can export the data to the PDF file for printing.</w:t>
+            </w:r>
+          </w:p>
+        </w:tc>
+        <w:tc>
+          <w:tcPr>
+            <w:tcW w:w="3324" w:type="dxa"/>
+            <w:tcBorders>
+              <w:start w:val="single" w:sz="4" w:space="0" w:color="000000"/>
+              <w:bottom w:val="single" w:sz="4" w:space="0" w:color="000000"/>
+            </w:tcBorders>
+          </w:tcPr>
+          <w:p>
+            <w:pPr>
+              <w:pStyle w:val="TableContents"/>
+              <w:bidi w:val="0"/>
+              <w:jc w:val="start"/>
+              <w:rPr/>
+            </w:pPr>
+            <w:r>
+              <w:rPr/>
+              <w:t>As a user, I want to be able to export the data into a .pdf file so I can print it on a paper.</w:t>
+            </w:r>
+          </w:p>
+        </w:tc>
+        <w:tc>
+          <w:tcPr>
+            <w:tcW w:w="3324" w:type="dxa"/>
+            <w:tcBorders>
+              <w:start w:val="single" w:sz="4" w:space="0" w:color="000000"/>
+              <w:bottom w:val="single" w:sz="4" w:space="0" w:color="000000"/>
+              <w:end w:val="single" w:sz="4" w:space="0" w:color="000000"/>
+            </w:tcBorders>
+          </w:tcPr>
+          <w:p>
+            <w:pPr>
+              <w:pStyle w:val="TableContents"/>
+              <w:widowControl w:val="false"/>
+              <w:suppressLineNumbers/>
+              <w:bidi w:val="0"/>
+              <w:jc w:val="start"/>
+              <w:rPr/>
+            </w:pPr>
+            <w:r>
+              <w:rPr/>
+            </w:r>
+          </w:p>
+        </w:tc>
+      </w:tr>
     </w:tbl>
     <w:p>
       <w:pPr>
@@ -2778,6 +2789,10 @@
     <w:p>
       <w:pPr>
         <w:pStyle w:val="Heading1"/>
+        <w:numPr>
+          <w:ilvl w:val="0"/>
+          <w:numId w:val="2"/>
+        </w:numPr>
         <w:bidi w:val="0"/>
         <w:ind w:hanging="0" w:start="0"/>
         <w:jc w:val="start"/>
@@ -2818,379 +2833,116 @@
     <w:p>
       <w:pPr>
         <w:pStyle w:val="BodyText"/>
-        <w:numPr>
-          <w:ilvl w:val="0"/>
-          <w:numId w:val="4"/>
-        </w:numPr>
-        <w:bidi w:val="0"/>
-        <w:jc w:val="start"/>
-        <w:rPr>
-          <w:sz w:val="24"/>
-          <w:szCs w:val="24"/>
-        </w:rPr>
-      </w:pPr>
-      <w:r>
-        <w:rPr>
-          <w:sz w:val="24"/>
-          <w:szCs w:val="24"/>
-        </w:rPr>
-        <w:t>Maintenance</w:t>
-      </w:r>
-      <w:r>
-        <w:rPr>
-          <w:sz w:val="24"/>
-          <w:szCs w:val="24"/>
-        </w:rPr>
-        <w:t xml:space="preserve"> functionality like repair logs.</w:t>
-      </w:r>
-    </w:p>
-    <w:p>
-      <w:pPr>
-        <w:pStyle w:val="BodyText"/>
-        <w:numPr>
-          <w:ilvl w:val="0"/>
-          <w:numId w:val="4"/>
-        </w:numPr>
-        <w:bidi w:val="0"/>
-        <w:jc w:val="start"/>
-        <w:rPr>
-          <w:sz w:val="24"/>
-          <w:szCs w:val="24"/>
-        </w:rPr>
-      </w:pPr>
-      <w:r>
-        <w:rPr>
-          <w:sz w:val="24"/>
-          <w:szCs w:val="24"/>
-        </w:rPr>
-        <w:t>Multiple inventory management functionality.</w:t>
-      </w:r>
-    </w:p>
-    <w:p>
-      <w:pPr>
-        <w:pStyle w:val="BodyText"/>
-        <w:numPr>
-          <w:ilvl w:val="0"/>
-          <w:numId w:val="4"/>
-        </w:numPr>
-        <w:bidi w:val="0"/>
-        <w:jc w:val="start"/>
-        <w:rPr>
-          <w:sz w:val="24"/>
-          <w:szCs w:val="24"/>
-        </w:rPr>
-      </w:pPr>
-      <w:r>
-        <w:rPr>
-          <w:sz w:val="24"/>
-          <w:szCs w:val="24"/>
-        </w:rPr>
-        <w:t>Reporting functionality.</w:t>
-      </w:r>
-    </w:p>
-    <w:p>
-      <w:pPr>
-        <w:pStyle w:val="BodyText"/>
-        <w:numPr>
-          <w:ilvl w:val="0"/>
-          <w:numId w:val="4"/>
-        </w:numPr>
-        <w:bidi w:val="0"/>
-        <w:jc w:val="start"/>
-        <w:rPr>
-          <w:sz w:val="24"/>
-          <w:szCs w:val="24"/>
-        </w:rPr>
-      </w:pPr>
-      <w:r>
-        <w:rPr>
-          <w:sz w:val="24"/>
-          <w:szCs w:val="24"/>
-        </w:rPr>
-        <w:t xml:space="preserve">User </w:t>
-      </w:r>
-      <w:r>
-        <w:rPr>
-          <w:sz w:val="24"/>
-          <w:szCs w:val="24"/>
-        </w:rPr>
-        <w:t>sharing functionality for multiple peoples.</w:t>
-      </w:r>
-    </w:p>
-    <w:p>
-      <w:pPr>
-        <w:pStyle w:val="BodyText"/>
-        <w:bidi w:val="0"/>
-        <w:jc w:val="end"/>
-        <w:rPr>
-          <w:sz w:val="24"/>
-          <w:szCs w:val="24"/>
-        </w:rPr>
-      </w:pPr>
-      <w:r>
-        <w:rPr>
-          <w:sz w:val="24"/>
-          <w:szCs w:val="24"/>
-        </w:rPr>
-      </w:r>
-    </w:p>
-    <w:p>
-      <w:pPr>
-        <w:pStyle w:val="Heading1"/>
-        <w:bidi w:val="0"/>
-        <w:ind w:hanging="0" w:start="0"/>
-        <w:jc w:val="start"/>
-        <w:rPr>
-          <w:sz w:val="24"/>
-          <w:szCs w:val="24"/>
-        </w:rPr>
-      </w:pPr>
-      <w:bookmarkStart w:id="7" w:name="__RefHeading___Toc1663_1349472584"/>
-      <w:bookmarkEnd w:id="7"/>
-      <w:r>
-        <w:rPr>
-          <w:sz w:val="24"/>
-          <w:szCs w:val="24"/>
-        </w:rPr>
-        <w:t>8. Dependencies and Technologies</w:t>
-      </w:r>
-    </w:p>
-    <w:p>
-      <w:pPr>
-        <w:pStyle w:val="Normal"/>
-        <w:bidi w:val="0"/>
-        <w:jc w:val="start"/>
-        <w:rPr/>
-      </w:pPr>
-      <w:r>
-        <w:rPr/>
-        <w:tab/>
-        <w:t>The following technologies and dependencies are required:</w:t>
-      </w:r>
-    </w:p>
-    <w:p>
-      <w:pPr>
-        <w:pStyle w:val="Normal"/>
         <w:numPr>
           <w:ilvl w:val="0"/>
           <w:numId w:val="5"/>
         </w:numPr>
         <w:bidi w:val="0"/>
         <w:jc w:val="start"/>
-        <w:rPr/>
-      </w:pPr>
-      <w:r>
-        <w:rPr/>
-        <w:t>Docker</w:t>
-      </w:r>
-    </w:p>
-    <w:p>
-      <w:pPr>
-        <w:pStyle w:val="Normal"/>
+        <w:rPr>
+          <w:sz w:val="24"/>
+          <w:szCs w:val="24"/>
+        </w:rPr>
+      </w:pPr>
+      <w:r>
+        <w:rPr>
+          <w:sz w:val="24"/>
+          <w:szCs w:val="24"/>
+        </w:rPr>
+        <w:t>Maintenance functionality like repair logs.</w:t>
+      </w:r>
+    </w:p>
+    <w:p>
+      <w:pPr>
+        <w:pStyle w:val="BodyText"/>
         <w:numPr>
           <w:ilvl w:val="0"/>
           <w:numId w:val="5"/>
         </w:numPr>
         <w:bidi w:val="0"/>
         <w:jc w:val="start"/>
-        <w:rPr/>
-      </w:pPr>
-      <w:r>
-        <w:rPr/>
-        <w:t>SQLite</w:t>
-      </w:r>
-    </w:p>
-    <w:p>
-      <w:pPr>
-        <w:pStyle w:val="Normal"/>
+        <w:rPr>
+          <w:sz w:val="24"/>
+          <w:szCs w:val="24"/>
+        </w:rPr>
+      </w:pPr>
+      <w:r>
+        <w:rPr>
+          <w:sz w:val="24"/>
+          <w:szCs w:val="24"/>
+        </w:rPr>
+        <w:t>Multiple inventory management functionality.</w:t>
+      </w:r>
+    </w:p>
+    <w:p>
+      <w:pPr>
+        <w:pStyle w:val="BodyText"/>
         <w:numPr>
           <w:ilvl w:val="0"/>
           <w:numId w:val="5"/>
         </w:numPr>
         <w:bidi w:val="0"/>
         <w:jc w:val="start"/>
-        <w:rPr/>
-      </w:pPr>
-      <w:r>
-        <w:rPr/>
-        <w:t>Angular</w:t>
-      </w:r>
-    </w:p>
-    <w:p>
-      <w:pPr>
-        <w:pStyle w:val="Normal"/>
+        <w:rPr>
+          <w:sz w:val="24"/>
+          <w:szCs w:val="24"/>
+        </w:rPr>
+      </w:pPr>
+      <w:r>
+        <w:rPr>
+          <w:sz w:val="24"/>
+          <w:szCs w:val="24"/>
+        </w:rPr>
+        <w:t>Reporting functionality.</w:t>
+      </w:r>
+    </w:p>
+    <w:p>
+      <w:pPr>
+        <w:pStyle w:val="BodyText"/>
         <w:numPr>
           <w:ilvl w:val="0"/>
           <w:numId w:val="5"/>
         </w:numPr>
         <w:bidi w:val="0"/>
         <w:jc w:val="start"/>
-        <w:rPr/>
-      </w:pPr>
-      <w:r>
-        <w:rPr/>
-        <w:t>Bootstrap</w:t>
-      </w:r>
-    </w:p>
-    <w:p>
-      <w:pPr>
-        <w:pStyle w:val="Normal"/>
+        <w:rPr>
+          <w:sz w:val="24"/>
+          <w:szCs w:val="24"/>
+        </w:rPr>
+      </w:pPr>
+      <w:r>
+        <w:rPr>
+          <w:sz w:val="24"/>
+          <w:szCs w:val="24"/>
+        </w:rPr>
+        <w:t>User sharing functionality for multiple peoples.</w:t>
+      </w:r>
+    </w:p>
+    <w:p>
+      <w:pPr>
+        <w:pStyle w:val="BodyText"/>
+        <w:bidi w:val="0"/>
+        <w:jc w:val="end"/>
+        <w:rPr>
+          <w:sz w:val="24"/>
+          <w:szCs w:val="24"/>
+        </w:rPr>
+      </w:pPr>
+      <w:r>
+        <w:rPr>
+          <w:sz w:val="24"/>
+          <w:szCs w:val="24"/>
+        </w:rPr>
+      </w:r>
+    </w:p>
+    <w:p>
+      <w:pPr>
+        <w:pStyle w:val="Heading1"/>
         <w:numPr>
           <w:ilvl w:val="0"/>
-          <w:numId w:val="5"/>
+          <w:numId w:val="2"/>
         </w:numPr>
         <w:bidi w:val="0"/>
-        <w:jc w:val="start"/>
-        <w:rPr/>
-      </w:pPr>
-      <w:r>
-        <w:rPr/>
-        <w:t>NodeJS</w:t>
-      </w:r>
-    </w:p>
-    <w:p>
-      <w:pPr>
-        <w:pStyle w:val="Normal"/>
-        <w:numPr>
-          <w:ilvl w:val="0"/>
-          <w:numId w:val="5"/>
-        </w:numPr>
-        <w:bidi w:val="0"/>
-        <w:jc w:val="start"/>
-        <w:rPr/>
-      </w:pPr>
-      <w:r>
-        <w:rPr/>
-        <w:t>ASP.NET</w:t>
-      </w:r>
-    </w:p>
-    <w:p>
-      <w:pPr>
-        <w:pStyle w:val="Normal"/>
-        <w:numPr>
-          <w:ilvl w:val="0"/>
-          <w:numId w:val="5"/>
-        </w:numPr>
-        <w:bidi w:val="0"/>
-        <w:jc w:val="start"/>
-        <w:rPr/>
-      </w:pPr>
-      <w:r>
-        <w:rPr/>
-        <w:t>Entity Framework</w:t>
-      </w:r>
-    </w:p>
-    <w:p>
-      <w:pPr>
-        <w:pStyle w:val="Normal"/>
-        <w:numPr>
-          <w:ilvl w:val="0"/>
-          <w:numId w:val="5"/>
-        </w:numPr>
-        <w:bidi w:val="0"/>
-        <w:jc w:val="start"/>
-        <w:rPr/>
-      </w:pPr>
-      <w:r>
-        <w:rPr/>
-        <w:t>ETO.Forms</w:t>
-      </w:r>
-    </w:p>
-    <w:p>
-      <w:pPr>
-        <w:pStyle w:val="Normal"/>
-        <w:numPr>
-          <w:ilvl w:val="0"/>
-          <w:numId w:val="5"/>
-        </w:numPr>
-        <w:bidi w:val="0"/>
-        <w:jc w:val="start"/>
-        <w:rPr/>
-      </w:pPr>
-      <w:r>
-        <w:rPr/>
-        <w:t>Avalonia</w:t>
-      </w:r>
-    </w:p>
-    <w:p>
-      <w:pPr>
-        <w:pStyle w:val="Normal"/>
-        <w:numPr>
-          <w:ilvl w:val="0"/>
-          <w:numId w:val="5"/>
-        </w:numPr>
-        <w:bidi w:val="0"/>
-        <w:jc w:val="start"/>
-        <w:rPr/>
-      </w:pPr>
-      <w:r>
-        <w:rPr/>
-        <w:t>Nunit</w:t>
-      </w:r>
-    </w:p>
-    <w:p>
-      <w:pPr>
-        <w:pStyle w:val="Normal"/>
-        <w:numPr>
-          <w:ilvl w:val="0"/>
-          <w:numId w:val="5"/>
-        </w:numPr>
-        <w:bidi w:val="0"/>
-        <w:jc w:val="start"/>
-        <w:rPr/>
-      </w:pPr>
-      <w:r>
-        <w:rPr/>
-        <w:t>Xunit</w:t>
-      </w:r>
-    </w:p>
-    <w:p>
-      <w:pPr>
-        <w:pStyle w:val="Normal"/>
-        <w:numPr>
-          <w:ilvl w:val="0"/>
-          <w:numId w:val="5"/>
-        </w:numPr>
-        <w:bidi w:val="0"/>
-        <w:jc w:val="start"/>
-        <w:rPr/>
-      </w:pPr>
-      <w:r>
-        <w:rPr/>
-        <w:t>Jasmine</w:t>
-      </w:r>
-    </w:p>
-    <w:p>
-      <w:pPr>
-        <w:pStyle w:val="Normal"/>
-        <w:numPr>
-          <w:ilvl w:val="0"/>
-          <w:numId w:val="5"/>
-        </w:numPr>
-        <w:bidi w:val="0"/>
-        <w:jc w:val="start"/>
-        <w:rPr/>
-      </w:pPr>
-      <w:r>
-        <w:rPr/>
-        <w:t>Vitest</w:t>
-      </w:r>
-    </w:p>
-    <w:p>
-      <w:pPr>
-        <w:pStyle w:val="Normal"/>
-        <w:bidi w:val="0"/>
-        <w:jc w:val="start"/>
-        <w:rPr/>
-      </w:pPr>
-      <w:r>
-        <w:rPr/>
-      </w:r>
-    </w:p>
-    <w:p>
-      <w:pPr>
-        <w:pStyle w:val="Heading1"/>
-        <w:bidi w:val="0"/>
         <w:ind w:hanging="0" w:start="0"/>
         <w:jc w:val="start"/>
         <w:rPr>
@@ -3198,14 +2950,14 @@
           <w:szCs w:val="24"/>
         </w:rPr>
       </w:pPr>
-      <w:bookmarkStart w:id="8" w:name="__RefHeading___Toc1665_1349472584"/>
-      <w:bookmarkEnd w:id="8"/>
-      <w:r>
-        <w:rPr>
-          <w:sz w:val="24"/>
-          <w:szCs w:val="24"/>
-        </w:rPr>
-        <w:t>9. Assumptions</w:t>
+      <w:bookmarkStart w:id="7" w:name="__RefHeading___Toc1663_1349472584"/>
+      <w:bookmarkEnd w:id="7"/>
+      <w:r>
+        <w:rPr>
+          <w:sz w:val="24"/>
+          <w:szCs w:val="24"/>
+        </w:rPr>
+        <w:t>8. Dependencies and Technologies</w:t>
       </w:r>
     </w:p>
     <w:p>
@@ -3218,7 +2970,7 @@
       <w:r>
         <w:rPr/>
         <w:tab/>
-        <w:t>InventBox is designed under the assumptions:</w:t>
+        <w:t>The following technologies and dependencies are required:</w:t>
       </w:r>
     </w:p>
     <w:p>
@@ -3234,7 +2986,7 @@
       </w:pPr>
       <w:r>
         <w:rPr/>
-        <w:t>The system will be used to manage the inventory in their home or businesses.</w:t>
+        <w:t>Docker</w:t>
       </w:r>
     </w:p>
     <w:p>
@@ -3250,7 +3002,7 @@
       </w:pPr>
       <w:r>
         <w:rPr/>
-        <w:t>The user will provide the metadata needed to manage their inventories.</w:t>
+        <w:t>SQLite</w:t>
       </w:r>
     </w:p>
     <w:p>
@@ -3266,7 +3018,7 @@
       </w:pPr>
       <w:r>
         <w:rPr/>
-        <w:t>The metadata collected for the user will be protected with the data protection schemes.</w:t>
+        <w:t>Angular</w:t>
       </w:r>
     </w:p>
     <w:p>
@@ -3282,7 +3034,7 @@
       </w:pPr>
       <w:r>
         <w:rPr/>
-        <w:t>The user will provide an options to use CLI, Desktop, Mobile, or self hosting.</w:t>
+        <w:t>Bootstrap</w:t>
       </w:r>
     </w:p>
     <w:p>
@@ -3291,6 +3043,247 @@
         <w:numPr>
           <w:ilvl w:val="0"/>
           <w:numId w:val="6"/>
+        </w:numPr>
+        <w:bidi w:val="0"/>
+        <w:jc w:val="start"/>
+        <w:rPr/>
+      </w:pPr>
+      <w:r>
+        <w:rPr/>
+        <w:t>NodeJS</w:t>
+      </w:r>
+    </w:p>
+    <w:p>
+      <w:pPr>
+        <w:pStyle w:val="Normal"/>
+        <w:numPr>
+          <w:ilvl w:val="0"/>
+          <w:numId w:val="6"/>
+        </w:numPr>
+        <w:bidi w:val="0"/>
+        <w:jc w:val="start"/>
+        <w:rPr/>
+      </w:pPr>
+      <w:r>
+        <w:rPr/>
+        <w:t>ASP.NET</w:t>
+      </w:r>
+    </w:p>
+    <w:p>
+      <w:pPr>
+        <w:pStyle w:val="Normal"/>
+        <w:numPr>
+          <w:ilvl w:val="0"/>
+          <w:numId w:val="6"/>
+        </w:numPr>
+        <w:bidi w:val="0"/>
+        <w:jc w:val="start"/>
+        <w:rPr/>
+      </w:pPr>
+      <w:r>
+        <w:rPr/>
+        <w:t>Entity Framework</w:t>
+      </w:r>
+    </w:p>
+    <w:p>
+      <w:pPr>
+        <w:pStyle w:val="Normal"/>
+        <w:numPr>
+          <w:ilvl w:val="0"/>
+          <w:numId w:val="6"/>
+        </w:numPr>
+        <w:bidi w:val="0"/>
+        <w:jc w:val="start"/>
+        <w:rPr/>
+      </w:pPr>
+      <w:r>
+        <w:rPr/>
+        <w:t>ETO.Forms</w:t>
+      </w:r>
+    </w:p>
+    <w:p>
+      <w:pPr>
+        <w:pStyle w:val="Normal"/>
+        <w:numPr>
+          <w:ilvl w:val="0"/>
+          <w:numId w:val="6"/>
+        </w:numPr>
+        <w:bidi w:val="0"/>
+        <w:jc w:val="start"/>
+        <w:rPr/>
+      </w:pPr>
+      <w:r>
+        <w:rPr/>
+        <w:t>Avalonia</w:t>
+      </w:r>
+    </w:p>
+    <w:p>
+      <w:pPr>
+        <w:pStyle w:val="Normal"/>
+        <w:numPr>
+          <w:ilvl w:val="0"/>
+          <w:numId w:val="6"/>
+        </w:numPr>
+        <w:bidi w:val="0"/>
+        <w:jc w:val="start"/>
+        <w:rPr/>
+      </w:pPr>
+      <w:r>
+        <w:rPr/>
+        <w:t>Xunit</w:t>
+      </w:r>
+    </w:p>
+    <w:p>
+      <w:pPr>
+        <w:pStyle w:val="Normal"/>
+        <w:numPr>
+          <w:ilvl w:val="0"/>
+          <w:numId w:val="6"/>
+        </w:numPr>
+        <w:bidi w:val="0"/>
+        <w:jc w:val="start"/>
+        <w:rPr/>
+      </w:pPr>
+      <w:r>
+        <w:rPr/>
+        <w:t>Jasmine</w:t>
+      </w:r>
+    </w:p>
+    <w:p>
+      <w:pPr>
+        <w:pStyle w:val="Normal"/>
+        <w:numPr>
+          <w:ilvl w:val="0"/>
+          <w:numId w:val="6"/>
+        </w:numPr>
+        <w:bidi w:val="0"/>
+        <w:jc w:val="start"/>
+        <w:rPr/>
+      </w:pPr>
+      <w:r>
+        <w:rPr/>
+        <w:t>Vitest</w:t>
+      </w:r>
+    </w:p>
+    <w:p>
+      <w:pPr>
+        <w:pStyle w:val="Normal"/>
+        <w:bidi w:val="0"/>
+        <w:jc w:val="start"/>
+        <w:rPr/>
+      </w:pPr>
+      <w:r>
+        <w:rPr/>
+      </w:r>
+    </w:p>
+    <w:p>
+      <w:pPr>
+        <w:pStyle w:val="Heading1"/>
+        <w:numPr>
+          <w:ilvl w:val="0"/>
+          <w:numId w:val="2"/>
+        </w:numPr>
+        <w:bidi w:val="0"/>
+        <w:ind w:hanging="0" w:start="0"/>
+        <w:jc w:val="start"/>
+        <w:rPr>
+          <w:sz w:val="24"/>
+          <w:szCs w:val="24"/>
+        </w:rPr>
+      </w:pPr>
+      <w:bookmarkStart w:id="8" w:name="__RefHeading___Toc1665_1349472584"/>
+      <w:bookmarkEnd w:id="8"/>
+      <w:r>
+        <w:rPr>
+          <w:sz w:val="24"/>
+          <w:szCs w:val="24"/>
+        </w:rPr>
+        <w:t>9. Assumptions</w:t>
+      </w:r>
+    </w:p>
+    <w:p>
+      <w:pPr>
+        <w:pStyle w:val="Normal"/>
+        <w:bidi w:val="0"/>
+        <w:jc w:val="start"/>
+        <w:rPr/>
+      </w:pPr>
+      <w:r>
+        <w:rPr/>
+        <w:tab/>
+        <w:t>InventBox is designed under the assumptions:</w:t>
+      </w:r>
+    </w:p>
+    <w:p>
+      <w:pPr>
+        <w:pStyle w:val="Normal"/>
+        <w:numPr>
+          <w:ilvl w:val="0"/>
+          <w:numId w:val="7"/>
+        </w:numPr>
+        <w:bidi w:val="0"/>
+        <w:jc w:val="start"/>
+        <w:rPr/>
+      </w:pPr>
+      <w:r>
+        <w:rPr/>
+        <w:t>The system will be used to manage the inventory in their home or businesses.</w:t>
+      </w:r>
+    </w:p>
+    <w:p>
+      <w:pPr>
+        <w:pStyle w:val="Normal"/>
+        <w:numPr>
+          <w:ilvl w:val="0"/>
+          <w:numId w:val="7"/>
+        </w:numPr>
+        <w:bidi w:val="0"/>
+        <w:jc w:val="start"/>
+        <w:rPr/>
+      </w:pPr>
+      <w:r>
+        <w:rPr/>
+        <w:t>The user will provide the metadata needed to manage their inventories.</w:t>
+      </w:r>
+    </w:p>
+    <w:p>
+      <w:pPr>
+        <w:pStyle w:val="Normal"/>
+        <w:numPr>
+          <w:ilvl w:val="0"/>
+          <w:numId w:val="7"/>
+        </w:numPr>
+        <w:bidi w:val="0"/>
+        <w:jc w:val="start"/>
+        <w:rPr/>
+      </w:pPr>
+      <w:r>
+        <w:rPr/>
+        <w:t>The metadata collected for the user will be protected with the data protection schemes.</w:t>
+      </w:r>
+    </w:p>
+    <w:p>
+      <w:pPr>
+        <w:pStyle w:val="Normal"/>
+        <w:numPr>
+          <w:ilvl w:val="0"/>
+          <w:numId w:val="7"/>
+        </w:numPr>
+        <w:bidi w:val="0"/>
+        <w:jc w:val="start"/>
+        <w:rPr/>
+      </w:pPr>
+      <w:r>
+        <w:rPr/>
+        <w:t>The user will provide an options to use CLI, Desktop, Mobile, or self hosting.</w:t>
+      </w:r>
+    </w:p>
+    <w:p>
+      <w:pPr>
+        <w:pStyle w:val="Normal"/>
+        <w:numPr>
+          <w:ilvl w:val="0"/>
+          <w:numId w:val="7"/>
         </w:numPr>
         <w:bidi w:val="0"/>
         <w:jc w:val="start"/>
@@ -3309,6 +3302,7 @@
           <w:numId w:val="0"/>
         </w:numPr>
         <w:bidi w:val="0"/>
+        <w:ind w:hanging="0" w:start="0"/>
         <w:jc w:val="start"/>
         <w:rPr>
           <w:sz w:val="24"/>
@@ -3333,6 +3327,7 @@
           <w:numId w:val="0"/>
         </w:numPr>
         <w:bidi w:val="0"/>
+        <w:spacing w:before="0" w:after="120"/>
         <w:ind w:hanging="0" w:start="0"/>
         <w:jc w:val="start"/>
         <w:rPr>
@@ -3793,7 +3788,6 @@
     <w:lvl w:ilvl="0">
       <w:start w:val="1"/>
       <w:numFmt w:val="none"/>
-      <w:pStyle w:val="Heading1"/>
       <w:suff w:val="nothing"/>
       <w:lvlText w:val="%1"/>
       <w:lvlJc w:val="start"/>
@@ -3807,7 +3801,6 @@
     <w:lvl w:ilvl="1">
       <w:start w:val="1"/>
       <w:numFmt w:val="none"/>
-      <w:pStyle w:val="Heading2"/>
       <w:suff w:val="nothing"/>
       <w:lvlText w:val="%2"/>
       <w:lvlJc w:val="start"/>
@@ -3913,6 +3906,134 @@
   <w:abstractNum w:abstractNumId="2">
     <w:lvl w:ilvl="0">
       <w:start w:val="1"/>
+      <w:numFmt w:val="none"/>
+      <w:suff w:val="nothing"/>
+      <w:lvlText w:val="%1"/>
+      <w:lvlJc w:val="start"/>
+      <w:pPr>
+        <w:tabs>
+          <w:tab w:val="num" w:pos="0"/>
+        </w:tabs>
+        <w:ind w:start="0" w:hanging="0"/>
+      </w:pPr>
+      <w:rPr/>
+    </w:lvl>
+    <w:lvl w:ilvl="1">
+      <w:start w:val="1"/>
+      <w:numFmt w:val="none"/>
+      <w:suff w:val="nothing"/>
+      <w:lvlText w:val="%2"/>
+      <w:lvlJc w:val="start"/>
+      <w:pPr>
+        <w:tabs>
+          <w:tab w:val="num" w:pos="0"/>
+        </w:tabs>
+        <w:ind w:start="0" w:hanging="0"/>
+      </w:pPr>
+      <w:rPr/>
+    </w:lvl>
+    <w:lvl w:ilvl="2">
+      <w:start w:val="1"/>
+      <w:numFmt w:val="none"/>
+      <w:suff w:val="nothing"/>
+      <w:lvlText w:val="%3"/>
+      <w:lvlJc w:val="start"/>
+      <w:pPr>
+        <w:tabs>
+          <w:tab w:val="num" w:pos="0"/>
+        </w:tabs>
+        <w:ind w:start="0" w:hanging="0"/>
+      </w:pPr>
+      <w:rPr/>
+    </w:lvl>
+    <w:lvl w:ilvl="3">
+      <w:start w:val="1"/>
+      <w:numFmt w:val="none"/>
+      <w:suff w:val="nothing"/>
+      <w:lvlText w:val="%4"/>
+      <w:lvlJc w:val="start"/>
+      <w:pPr>
+        <w:tabs>
+          <w:tab w:val="num" w:pos="0"/>
+        </w:tabs>
+        <w:ind w:start="0" w:hanging="0"/>
+      </w:pPr>
+      <w:rPr/>
+    </w:lvl>
+    <w:lvl w:ilvl="4">
+      <w:start w:val="1"/>
+      <w:numFmt w:val="none"/>
+      <w:suff w:val="nothing"/>
+      <w:lvlText w:val="%5"/>
+      <w:lvlJc w:val="start"/>
+      <w:pPr>
+        <w:tabs>
+          <w:tab w:val="num" w:pos="0"/>
+        </w:tabs>
+        <w:ind w:start="0" w:hanging="0"/>
+      </w:pPr>
+      <w:rPr/>
+    </w:lvl>
+    <w:lvl w:ilvl="5">
+      <w:start w:val="1"/>
+      <w:numFmt w:val="none"/>
+      <w:suff w:val="nothing"/>
+      <w:lvlText w:val="%6"/>
+      <w:lvlJc w:val="start"/>
+      <w:pPr>
+        <w:tabs>
+          <w:tab w:val="num" w:pos="0"/>
+        </w:tabs>
+        <w:ind w:start="0" w:hanging="0"/>
+      </w:pPr>
+      <w:rPr/>
+    </w:lvl>
+    <w:lvl w:ilvl="6">
+      <w:start w:val="1"/>
+      <w:numFmt w:val="none"/>
+      <w:suff w:val="nothing"/>
+      <w:lvlText w:val="%7"/>
+      <w:lvlJc w:val="start"/>
+      <w:pPr>
+        <w:tabs>
+          <w:tab w:val="num" w:pos="0"/>
+        </w:tabs>
+        <w:ind w:start="0" w:hanging="0"/>
+      </w:pPr>
+      <w:rPr/>
+    </w:lvl>
+    <w:lvl w:ilvl="7">
+      <w:start w:val="1"/>
+      <w:numFmt w:val="none"/>
+      <w:suff w:val="nothing"/>
+      <w:lvlText w:val="%8"/>
+      <w:lvlJc w:val="start"/>
+      <w:pPr>
+        <w:tabs>
+          <w:tab w:val="num" w:pos="0"/>
+        </w:tabs>
+        <w:ind w:start="0" w:hanging="0"/>
+      </w:pPr>
+      <w:rPr/>
+    </w:lvl>
+    <w:lvl w:ilvl="8">
+      <w:start w:val="1"/>
+      <w:numFmt w:val="none"/>
+      <w:suff w:val="nothing"/>
+      <w:lvlText w:val="%9"/>
+      <w:lvlJc w:val="start"/>
+      <w:pPr>
+        <w:tabs>
+          <w:tab w:val="num" w:pos="0"/>
+        </w:tabs>
+        <w:ind w:start="0" w:hanging="0"/>
+      </w:pPr>
+      <w:rPr/>
+    </w:lvl>
+  </w:abstractNum>
+  <w:abstractNum w:abstractNumId="3">
+    <w:lvl w:ilvl="0">
+      <w:start w:val="1"/>
       <w:numFmt w:val="bullet"/>
       <w:lvlText w:val=""/>
       <w:lvlJc w:val="start"/>
@@ -4047,7 +4168,7 @@
       </w:rPr>
     </w:lvl>
   </w:abstractNum>
-  <w:abstractNum w:abstractNumId="3">
+  <w:abstractNum w:abstractNumId="4">
     <w:lvl w:ilvl="0">
       <w:start w:val="1"/>
       <w:numFmt w:val="bullet"/>
@@ -4184,7 +4305,7 @@
       </w:rPr>
     </w:lvl>
   </w:abstractNum>
-  <w:abstractNum w:abstractNumId="4">
+  <w:abstractNum w:abstractNumId="5">
     <w:lvl w:ilvl="0">
       <w:start w:val="1"/>
       <w:numFmt w:val="bullet"/>
@@ -4321,7 +4442,7 @@
       </w:rPr>
     </w:lvl>
   </w:abstractNum>
-  <w:abstractNum w:abstractNumId="5">
+  <w:abstractNum w:abstractNumId="6">
     <w:lvl w:ilvl="0">
       <w:start w:val="1"/>
       <w:numFmt w:val="bullet"/>
@@ -4458,7 +4579,7 @@
       </w:rPr>
     </w:lvl>
   </w:abstractNum>
-  <w:abstractNum w:abstractNumId="6">
+  <w:abstractNum w:abstractNumId="7">
     <w:lvl w:ilvl="0">
       <w:start w:val="1"/>
       <w:numFmt w:val="bullet"/>
@@ -4613,6 +4734,9 @@
   <w:num w:numId="6">
     <w:abstractNumId w:val="6"/>
   </w:num>
+  <w:num w:numId="7">
+    <w:abstractNumId w:val="7"/>
+  </w:num>
 </w:numbering>
 </file>
 
@@ -4630,7 +4754,6 @@
     </w:rPrDefault>
     <w:pPrDefault>
       <w:pPr>
-        <w:widowControl/>
         <w:suppressAutoHyphens w:val="true"/>
       </w:pPr>
     </w:pPrDefault>
@@ -4640,10 +4763,13 @@
     <w:qFormat/>
     <w:pPr>
       <w:widowControl/>
+      <w:suppressAutoHyphens w:val="true"/>
       <w:kinsoku w:val="true"/>
-      <w:overflowPunct w:val="true"/>
+      <w:overflowPunct w:val="false"/>
       <w:autoSpaceDE w:val="true"/>
       <w:bidi w:val="0"/>
+      <w:spacing w:before="0" w:after="0"/>
+      <w:jc w:val="start"/>
     </w:pPr>
     <w:rPr>
       <w:rFonts w:ascii="Liberation Serif" w:hAnsi="Liberation Serif" w:eastAsia="Noto Sans" w:cs="Noto Sans Devanagari"/>
@@ -4662,7 +4788,7 @@
     <w:pPr>
       <w:numPr>
         <w:ilvl w:val="0"/>
-        <w:numId w:val="1"/>
+        <w:numId w:val="2"/>
       </w:numPr>
       <w:spacing w:before="240" w:after="120"/>
       <w:outlineLvl w:val="0"/>
@@ -4682,7 +4808,7 @@
     <w:pPr>
       <w:numPr>
         <w:ilvl w:val="1"/>
-        <w:numId w:val="1"/>
+        <w:numId w:val="2"/>
       </w:numPr>
       <w:spacing w:before="200" w:after="120"/>
       <w:outlineLvl w:val="1"/>
@@ -4706,8 +4832,8 @@
     <w:qFormat/>
     <w:rPr/>
   </w:style>
-  <w:style w:type="character" w:styleId="Bullets">
-    <w:name w:val="Bullets"/>
+  <w:style w:type="character" w:styleId="Bulletsuser">
+    <w:name w:val="Bullets (user)"/>
     <w:qFormat/>
     <w:rPr>
       <w:rFonts w:ascii="OpenSymbol" w:hAnsi="OpenSymbol" w:eastAsia="OpenSymbol" w:cs="OpenSymbol"/>
@@ -4788,8 +4914,8 @@
       <w:szCs w:val="12"/>
     </w:rPr>
   </w:style>
-  <w:style w:type="paragraph" w:styleId="FrameContents">
-    <w:name w:val="Frame Contents"/>
+  <w:style w:type="paragraph" w:styleId="FrameContentsuser">
+    <w:name w:val="Frame Contents (user)"/>
     <w:basedOn w:val="Normal"/>
     <w:qFormat/>
     <w:pPr/>

</xml_diff>

<commit_message>
rename the data transfer class to data management class for saving and loading functionality and add the remaining models
</commit_message>
<xml_diff>
--- a/Documentations/SRS.docx
+++ b/Documentations/SRS.docx
@@ -1724,6 +1724,7 @@
             </w:pPr>
             <w:r>
               <w:rPr/>
+              <w:t>In Progress</w:t>
             </w:r>
           </w:p>
         </w:tc>
@@ -2495,52 +2496,28 @@
             </w:pPr>
             <w:r>
               <w:rPr/>
-              <w:t xml:space="preserve">User can export and import the </w:t>
-            </w:r>
-            <w:r>
-              <w:rPr/>
-              <w:t>data</w:t>
-            </w:r>
-            <w:r>
-              <w:rPr/>
-              <w:t xml:space="preserve"> from or into the </w:t>
-            </w:r>
-            <w:r>
-              <w:rPr/>
-              <w:t>app</w:t>
-            </w:r>
-            <w:r>
-              <w:rPr/>
-              <w:t>.</w:t>
-            </w:r>
-          </w:p>
-        </w:tc>
-        <w:tc>
-          <w:tcPr>
-            <w:tcW w:w="3324" w:type="dxa"/>
-            <w:tcBorders>
-              <w:start w:val="single" w:sz="4" w:space="0" w:color="000000"/>
-              <w:bottom w:val="single" w:sz="4" w:space="0" w:color="000000"/>
-            </w:tcBorders>
-          </w:tcPr>
-          <w:p>
-            <w:pPr>
-              <w:pStyle w:val="TableContents"/>
-              <w:bidi w:val="0"/>
-              <w:jc w:val="start"/>
-              <w:rPr/>
-            </w:pPr>
-            <w:r>
-              <w:rPr/>
-              <w:t xml:space="preserve">As a user, I want to be able to export and import the data from the </w:t>
-            </w:r>
-            <w:r>
-              <w:rPr/>
-              <w:t>application</w:t>
-            </w:r>
-            <w:r>
-              <w:rPr/>
-              <w:t xml:space="preserve"> so I can transfer from one device to another.</w:t>
+              <w:t>User can export and import the data from or into the app.</w:t>
+            </w:r>
+          </w:p>
+        </w:tc>
+        <w:tc>
+          <w:tcPr>
+            <w:tcW w:w="3324" w:type="dxa"/>
+            <w:tcBorders>
+              <w:start w:val="single" w:sz="4" w:space="0" w:color="000000"/>
+              <w:bottom w:val="single" w:sz="4" w:space="0" w:color="000000"/>
+            </w:tcBorders>
+          </w:tcPr>
+          <w:p>
+            <w:pPr>
+              <w:pStyle w:val="TableContents"/>
+              <w:bidi w:val="0"/>
+              <w:jc w:val="start"/>
+              <w:rPr/>
+            </w:pPr>
+            <w:r>
+              <w:rPr/>
+              <w:t>As a user, I want to be able to export and import the data from the application so I can transfer from one device to another.</w:t>
             </w:r>
           </w:p>
         </w:tc>
@@ -2564,7 +2541,7 @@
             </w:pPr>
             <w:r>
               <w:rPr/>
-              <w:t>In Progress</w:t>
+              <w:t>Completed</w:t>
             </w:r>
           </w:p>
         </w:tc>
@@ -3734,7 +3711,9 @@
       </w:r>
     </w:p>
     <w:sectPr>
-      <w:headerReference w:type="default" r:id="rId8"/>
+      <w:headerReference w:type="even" r:id="rId8"/>
+      <w:headerReference w:type="default" r:id="rId9"/>
+      <w:headerReference w:type="first" r:id="rId10"/>
       <w:type w:val="nextPage"/>
       <w:pgSz w:w="12240" w:h="15840"/>
       <w:pgMar w:left="1134" w:right="1134" w:gutter="0" w:header="1134" w:top="1693" w:footer="0" w:bottom="1134"/>
@@ -3748,6 +3727,20 @@
 </file>
 
 <file path=word/header1.xml><?xml version="1.0" encoding="utf-8"?>
+<w:hdr xmlns:o="urn:schemas-microsoft-com:office:office" xmlns:r="http://schemas.openxmlformats.org/officeDocument/2006/relationships" xmlns:v="urn:schemas-microsoft-com:vml" xmlns:w="http://schemas.openxmlformats.org/wordprocessingml/2006/main" xmlns:w10="urn:schemas-microsoft-com:office:word" xmlns:wp="http://schemas.openxmlformats.org/drawingml/2006/wordprocessingDrawing" xmlns:pic="http://schemas.openxmlformats.org/drawingml/2006/picture" xmlns:wps="http://schemas.microsoft.com/office/word/2010/wordprocessingShape" xmlns:wpg="http://schemas.microsoft.com/office/word/2010/wordprocessingGroup" xmlns:mc="http://schemas.openxmlformats.org/markup-compatibility/2006" xmlns:wp14="http://schemas.microsoft.com/office/word/2010/wordprocessingDrawing" xmlns:w14="http://schemas.microsoft.com/office/word/2010/wordml" xmlns:w15="http://schemas.microsoft.com/office/word/2012/wordml" mc:Ignorable="w14 wp14 w15">
+  <w:p>
+    <w:pPr>
+      <w:pStyle w:val="Header"/>
+      <w:rPr/>
+    </w:pPr>
+    <w:r>
+      <w:rPr/>
+    </w:r>
+  </w:p>
+</w:hdr>
+</file>
+
+<file path=word/header2.xml><?xml version="1.0" encoding="utf-8"?>
 <w:hdr xmlns:o="urn:schemas-microsoft-com:office:office" xmlns:r="http://schemas.openxmlformats.org/officeDocument/2006/relationships" xmlns:v="urn:schemas-microsoft-com:vml" xmlns:w="http://schemas.openxmlformats.org/wordprocessingml/2006/main" xmlns:w10="urn:schemas-microsoft-com:office:word" xmlns:wp="http://schemas.openxmlformats.org/drawingml/2006/wordprocessingDrawing" xmlns:pic="http://schemas.openxmlformats.org/drawingml/2006/picture" xmlns:wps="http://schemas.microsoft.com/office/word/2010/wordprocessingShape" xmlns:wpg="http://schemas.microsoft.com/office/word/2010/wordprocessingGroup" xmlns:mc="http://schemas.openxmlformats.org/markup-compatibility/2006" xmlns:wp14="http://schemas.microsoft.com/office/word/2010/wordprocessingDrawing" xmlns:w14="http://schemas.microsoft.com/office/word/2010/wordml" xmlns:w15="http://schemas.microsoft.com/office/word/2012/wordml" mc:Ignorable="w14 wp14 w15">
   <w:p>
     <w:pPr>
@@ -3782,6 +3775,41 @@
 </w:hdr>
 </file>
 
+<file path=word/header3.xml><?xml version="1.0" encoding="utf-8"?>
+<w:hdr xmlns:o="urn:schemas-microsoft-com:office:office" xmlns:r="http://schemas.openxmlformats.org/officeDocument/2006/relationships" xmlns:v="urn:schemas-microsoft-com:vml" xmlns:w="http://schemas.openxmlformats.org/wordprocessingml/2006/main" xmlns:w10="urn:schemas-microsoft-com:office:word" xmlns:wp="http://schemas.openxmlformats.org/drawingml/2006/wordprocessingDrawing" xmlns:pic="http://schemas.openxmlformats.org/drawingml/2006/picture" xmlns:wps="http://schemas.microsoft.com/office/word/2010/wordprocessingShape" xmlns:wpg="http://schemas.microsoft.com/office/word/2010/wordprocessingGroup" xmlns:mc="http://schemas.openxmlformats.org/markup-compatibility/2006" xmlns:wp14="http://schemas.microsoft.com/office/word/2010/wordprocessingDrawing" xmlns:w14="http://schemas.microsoft.com/office/word/2010/wordml" xmlns:w15="http://schemas.microsoft.com/office/word/2012/wordml" mc:Ignorable="w14 wp14 w15">
+  <w:p>
+    <w:pPr>
+      <w:pStyle w:val="Header"/>
+      <w:bidi w:val="0"/>
+      <w:jc w:val="end"/>
+      <w:rPr/>
+    </w:pPr>
+    <w:bookmarkStart w:id="11" w:name="PageNumWizard_HEADER_Default_Page_Style1"/>
+    <w:r>
+      <w:rPr/>
+      <w:fldChar w:fldCharType="begin"/>
+    </w:r>
+    <w:r>
+      <w:rPr/>
+      <w:instrText xml:space="preserve"> PAGE </w:instrText>
+    </w:r>
+    <w:r>
+      <w:rPr/>
+      <w:fldChar w:fldCharType="separate"/>
+    </w:r>
+    <w:r>
+      <w:rPr/>
+      <w:t>9</w:t>
+    </w:r>
+    <w:r>
+      <w:rPr/>
+      <w:fldChar w:fldCharType="end"/>
+    </w:r>
+    <w:bookmarkEnd w:id="11"/>
+  </w:p>
+</w:hdr>
+</file>
+
 <file path=word/numbering.xml><?xml version="1.0" encoding="utf-8"?>
 <w:numbering xmlns:w="http://schemas.openxmlformats.org/wordprocessingml/2006/main" xmlns:o="urn:schemas-microsoft-com:office:office" xmlns:r="http://schemas.openxmlformats.org/officeDocument/2006/relationships" xmlns:v="urn:schemas-microsoft-com:vml" xmlns:mc="http://schemas.openxmlformats.org/markup-compatibility/2006" xmlns:w14="http://schemas.microsoft.com/office/word/2010/wordml" mc:Ignorable="w14">
   <w:abstractNum w:abstractNumId="1">
@@ -3789,7 +3817,7 @@
       <w:start w:val="1"/>
       <w:numFmt w:val="none"/>
       <w:suff w:val="nothing"/>
-      <w:lvlText w:val="%1"/>
+      <w:lvlText w:val=""/>
       <w:lvlJc w:val="start"/>
       <w:pPr>
         <w:tabs>
@@ -3802,7 +3830,7 @@
       <w:start w:val="1"/>
       <w:numFmt w:val="none"/>
       <w:suff w:val="nothing"/>
-      <w:lvlText w:val="%2"/>
+      <w:lvlText w:val=""/>
       <w:lvlJc w:val="start"/>
       <w:pPr>
         <w:tabs>
@@ -3815,7 +3843,7 @@
       <w:start w:val="1"/>
       <w:numFmt w:val="none"/>
       <w:suff w:val="nothing"/>
-      <w:lvlText w:val="%3"/>
+      <w:lvlText w:val=""/>
       <w:lvlJc w:val="start"/>
       <w:pPr>
         <w:tabs>
@@ -3828,7 +3856,7 @@
       <w:start w:val="1"/>
       <w:numFmt w:val="none"/>
       <w:suff w:val="nothing"/>
-      <w:lvlText w:val="%4"/>
+      <w:lvlText w:val=""/>
       <w:lvlJc w:val="start"/>
       <w:pPr>
         <w:tabs>
@@ -3841,7 +3869,7 @@
       <w:start w:val="1"/>
       <w:numFmt w:val="none"/>
       <w:suff w:val="nothing"/>
-      <w:lvlText w:val="%5"/>
+      <w:lvlText w:val=""/>
       <w:lvlJc w:val="start"/>
       <w:pPr>
         <w:tabs>
@@ -3854,7 +3882,7 @@
       <w:start w:val="1"/>
       <w:numFmt w:val="none"/>
       <w:suff w:val="nothing"/>
-      <w:lvlText w:val="%6"/>
+      <w:lvlText w:val=""/>
       <w:lvlJc w:val="start"/>
       <w:pPr>
         <w:tabs>
@@ -3867,7 +3895,7 @@
       <w:start w:val="1"/>
       <w:numFmt w:val="none"/>
       <w:suff w:val="nothing"/>
-      <w:lvlText w:val="%7"/>
+      <w:lvlText w:val=""/>
       <w:lvlJc w:val="start"/>
       <w:pPr>
         <w:tabs>
@@ -3880,7 +3908,7 @@
       <w:start w:val="1"/>
       <w:numFmt w:val="none"/>
       <w:suff w:val="nothing"/>
-      <w:lvlText w:val="%8"/>
+      <w:lvlText w:val=""/>
       <w:lvlJc w:val="start"/>
       <w:pPr>
         <w:tabs>
@@ -3893,7 +3921,7 @@
       <w:start w:val="1"/>
       <w:numFmt w:val="none"/>
       <w:suff w:val="nothing"/>
-      <w:lvlText w:val="%9"/>
+      <w:lvlText w:val=""/>
       <w:lvlJc w:val="start"/>
       <w:pPr>
         <w:tabs>
@@ -4764,9 +4792,7 @@
     <w:pPr>
       <w:widowControl/>
       <w:suppressAutoHyphens w:val="true"/>
-      <w:kinsoku w:val="true"/>
-      <w:overflowPunct w:val="false"/>
-      <w:autoSpaceDE w:val="true"/>
+      <w:overflowPunct w:val="true"/>
       <w:bidi w:val="0"/>
       <w:spacing w:before="0" w:after="0"/>
       <w:jc w:val="start"/>
@@ -4832,8 +4858,8 @@
     <w:qFormat/>
     <w:rPr/>
   </w:style>
-  <w:style w:type="character" w:styleId="Bulletsuser">
-    <w:name w:val="Bullets (user)"/>
+  <w:style w:type="character" w:styleId="Bullets">
+    <w:name w:val="Bullets"/>
     <w:qFormat/>
     <w:rPr>
       <w:rFonts w:ascii="OpenSymbol" w:hAnsi="OpenSymbol" w:eastAsia="OpenSymbol" w:cs="OpenSymbol"/>
@@ -4914,8 +4940,8 @@
       <w:szCs w:val="12"/>
     </w:rPr>
   </w:style>
-  <w:style w:type="paragraph" w:styleId="FrameContentsuser">
-    <w:name w:val="Frame Contents (user)"/>
+  <w:style w:type="paragraph" w:styleId="FrameContents">
+    <w:name w:val="Frame Contents"/>
     <w:basedOn w:val="Normal"/>
     <w:qFormat/>
     <w:pPr/>

</xml_diff>

<commit_message>
Added the Items List and Creating Item UI to the Desktop
</commit_message>
<xml_diff>
--- a/Documentations/SRS.docx
+++ b/Documentations/SRS.docx
@@ -2683,74 +2683,6 @@
           </w:p>
         </w:tc>
       </w:tr>
-      <w:tr>
-        <w:trPr/>
-        <w:tc>
-          <w:tcPr>
-            <w:tcW w:w="3324" w:type="dxa"/>
-            <w:tcBorders>
-              <w:start w:val="single" w:sz="4" w:space="0" w:color="000000"/>
-              <w:bottom w:val="single" w:sz="4" w:space="0" w:color="000000"/>
-            </w:tcBorders>
-          </w:tcPr>
-          <w:p>
-            <w:pPr>
-              <w:pStyle w:val="TableContents"/>
-              <w:bidi w:val="0"/>
-              <w:jc w:val="start"/>
-              <w:rPr/>
-            </w:pPr>
-            <w:r>
-              <w:rPr/>
-              <w:t>User can export the data to the PDF file for printing.</w:t>
-            </w:r>
-          </w:p>
-        </w:tc>
-        <w:tc>
-          <w:tcPr>
-            <w:tcW w:w="3324" w:type="dxa"/>
-            <w:tcBorders>
-              <w:start w:val="single" w:sz="4" w:space="0" w:color="000000"/>
-              <w:bottom w:val="single" w:sz="4" w:space="0" w:color="000000"/>
-            </w:tcBorders>
-          </w:tcPr>
-          <w:p>
-            <w:pPr>
-              <w:pStyle w:val="TableContents"/>
-              <w:bidi w:val="0"/>
-              <w:jc w:val="start"/>
-              <w:rPr/>
-            </w:pPr>
-            <w:r>
-              <w:rPr/>
-              <w:t>As a user, I want to be able to export the data into a .pdf file so I can print it on a paper.</w:t>
-            </w:r>
-          </w:p>
-        </w:tc>
-        <w:tc>
-          <w:tcPr>
-            <w:tcW w:w="3324" w:type="dxa"/>
-            <w:tcBorders>
-              <w:start w:val="single" w:sz="4" w:space="0" w:color="000000"/>
-              <w:bottom w:val="single" w:sz="4" w:space="0" w:color="000000"/>
-              <w:end w:val="single" w:sz="4" w:space="0" w:color="000000"/>
-            </w:tcBorders>
-          </w:tcPr>
-          <w:p>
-            <w:pPr>
-              <w:pStyle w:val="TableContents"/>
-              <w:widowControl w:val="false"/>
-              <w:suppressLineNumbers/>
-              <w:bidi w:val="0"/>
-              <w:jc w:val="start"/>
-              <w:rPr/>
-            </w:pPr>
-            <w:r>
-              <w:rPr/>
-            </w:r>
-          </w:p>
-        </w:tc>
-      </w:tr>
     </w:tbl>
     <w:p>
       <w:pPr>
@@ -2893,6 +2825,28 @@
           <w:szCs w:val="24"/>
         </w:rPr>
         <w:t>User sharing functionality for multiple peoples.</w:t>
+      </w:r>
+    </w:p>
+    <w:p>
+      <w:pPr>
+        <w:pStyle w:val="BodyText"/>
+        <w:numPr>
+          <w:ilvl w:val="0"/>
+          <w:numId w:val="5"/>
+        </w:numPr>
+        <w:bidi w:val="0"/>
+        <w:jc w:val="start"/>
+        <w:rPr>
+          <w:sz w:val="24"/>
+          <w:szCs w:val="24"/>
+        </w:rPr>
+      </w:pPr>
+      <w:r>
+        <w:rPr>
+          <w:sz w:val="24"/>
+          <w:szCs w:val="24"/>
+        </w:rPr>
+        <w:t>Export data to the pdf file for printing</w:t>
       </w:r>
     </w:p>
     <w:p>
@@ -4792,7 +4746,7 @@
     <w:pPr>
       <w:widowControl/>
       <w:suppressAutoHyphens w:val="true"/>
-      <w:overflowPunct w:val="true"/>
+      <w:overflowPunct w:val="false"/>
       <w:bidi w:val="0"/>
       <w:spacing w:before="0" w:after="0"/>
       <w:jc w:val="start"/>
@@ -4858,8 +4812,8 @@
     <w:qFormat/>
     <w:rPr/>
   </w:style>
-  <w:style w:type="character" w:styleId="Bullets">
-    <w:name w:val="Bullets"/>
+  <w:style w:type="character" w:styleId="Bulletsuser">
+    <w:name w:val="Bullets (user)"/>
     <w:qFormat/>
     <w:rPr>
       <w:rFonts w:ascii="OpenSymbol" w:hAnsi="OpenSymbol" w:eastAsia="OpenSymbol" w:cs="OpenSymbol"/>
@@ -4940,8 +4894,8 @@
       <w:szCs w:val="12"/>
     </w:rPr>
   </w:style>
-  <w:style w:type="paragraph" w:styleId="FrameContents">
-    <w:name w:val="Frame Contents"/>
+  <w:style w:type="paragraph" w:styleId="FrameContentsuser">
+    <w:name w:val="Frame Contents (user)"/>
     <w:basedOn w:val="Normal"/>
     <w:qFormat/>
     <w:pPr/>

</xml_diff>

<commit_message>
Finished the functionality to create items in Desktop UI
</commit_message>
<xml_diff>
--- a/Documentations/SRS.docx
+++ b/Documentations/SRS.docx
@@ -1724,7 +1724,7 @@
             </w:pPr>
             <w:r>
               <w:rPr/>
-              <w:t>In Progress</w:t>
+              <w:t>Completed</w:t>
             </w:r>
           </w:p>
         </w:tc>
@@ -4746,7 +4746,7 @@
     <w:pPr>
       <w:widowControl/>
       <w:suppressAutoHyphens w:val="true"/>
-      <w:overflowPunct w:val="false"/>
+      <w:overflowPunct w:val="true"/>
       <w:bidi w:val="0"/>
       <w:spacing w:before="0" w:after="0"/>
       <w:jc w:val="start"/>
@@ -4812,8 +4812,8 @@
     <w:qFormat/>
     <w:rPr/>
   </w:style>
-  <w:style w:type="character" w:styleId="Bulletsuser">
-    <w:name w:val="Bullets (user)"/>
+  <w:style w:type="character" w:styleId="Bullets">
+    <w:name w:val="Bullets"/>
     <w:qFormat/>
     <w:rPr>
       <w:rFonts w:ascii="OpenSymbol" w:hAnsi="OpenSymbol" w:eastAsia="OpenSymbol" w:cs="OpenSymbol"/>
@@ -4894,8 +4894,8 @@
       <w:szCs w:val="12"/>
     </w:rPr>
   </w:style>
-  <w:style w:type="paragraph" w:styleId="FrameContentsuser">
-    <w:name w:val="Frame Contents (user)"/>
+  <w:style w:type="paragraph" w:styleId="FrameContents">
+    <w:name w:val="Frame Contents"/>
     <w:basedOn w:val="Normal"/>
     <w:qFormat/>
     <w:pPr/>

</xml_diff>

<commit_message>
Added the Import and Export (Save/Load) functionality to Desktop UI
</commit_message>
<xml_diff>
--- a/Documentations/SRS.docx
+++ b/Documentations/SRS.docx
@@ -1724,7 +1724,7 @@
             </w:pPr>
             <w:r>
               <w:rPr/>
-              <w:t>Completed</w:t>
+              <w:t>In Progress</w:t>
             </w:r>
           </w:p>
         </w:tc>
@@ -1793,6 +1793,7 @@
             </w:pPr>
             <w:r>
               <w:rPr/>
+              <w:t>In Progress</w:t>
             </w:r>
           </w:p>
         </w:tc>
@@ -1861,6 +1862,7 @@
             </w:pPr>
             <w:r>
               <w:rPr/>
+              <w:t>In Progress</w:t>
             </w:r>
           </w:p>
         </w:tc>
@@ -4746,7 +4748,7 @@
     <w:pPr>
       <w:widowControl/>
       <w:suppressAutoHyphens w:val="true"/>
-      <w:overflowPunct w:val="true"/>
+      <w:overflowPunct w:val="false"/>
       <w:bidi w:val="0"/>
       <w:spacing w:before="0" w:after="0"/>
       <w:jc w:val="start"/>
@@ -4812,8 +4814,8 @@
     <w:qFormat/>
     <w:rPr/>
   </w:style>
-  <w:style w:type="character" w:styleId="Bullets">
-    <w:name w:val="Bullets"/>
+  <w:style w:type="character" w:styleId="Bulletsuser">
+    <w:name w:val="Bullets (user)"/>
     <w:qFormat/>
     <w:rPr>
       <w:rFonts w:ascii="OpenSymbol" w:hAnsi="OpenSymbol" w:eastAsia="OpenSymbol" w:cs="OpenSymbol"/>
@@ -4894,8 +4896,8 @@
       <w:szCs w:val="12"/>
     </w:rPr>
   </w:style>
-  <w:style w:type="paragraph" w:styleId="FrameContents">
-    <w:name w:val="Frame Contents"/>
+  <w:style w:type="paragraph" w:styleId="FrameContentsuser">
+    <w:name w:val="Frame Contents (user)"/>
     <w:basedOn w:val="Normal"/>
     <w:qFormat/>
     <w:pPr/>

</xml_diff>

<commit_message>
Fix the bug where the conditions were not stored correctly during creation
</commit_message>
<xml_diff>
--- a/Documentations/SRS.docx
+++ b/Documentations/SRS.docx
@@ -1724,7 +1724,7 @@
             </w:pPr>
             <w:r>
               <w:rPr/>
-              <w:t>In Progress</w:t>
+              <w:t>Completed</w:t>
             </w:r>
           </w:p>
         </w:tc>
@@ -4748,7 +4748,7 @@
     <w:pPr>
       <w:widowControl/>
       <w:suppressAutoHyphens w:val="true"/>
-      <w:overflowPunct w:val="false"/>
+      <w:overflowPunct w:val="true"/>
       <w:bidi w:val="0"/>
       <w:spacing w:before="0" w:after="0"/>
       <w:jc w:val="start"/>
@@ -4814,8 +4814,8 @@
     <w:qFormat/>
     <w:rPr/>
   </w:style>
-  <w:style w:type="character" w:styleId="Bulletsuser">
-    <w:name w:val="Bullets (user)"/>
+  <w:style w:type="character" w:styleId="Bullets">
+    <w:name w:val="Bullets"/>
     <w:qFormat/>
     <w:rPr>
       <w:rFonts w:ascii="OpenSymbol" w:hAnsi="OpenSymbol" w:eastAsia="OpenSymbol" w:cs="OpenSymbol"/>
@@ -4896,8 +4896,8 @@
       <w:szCs w:val="12"/>
     </w:rPr>
   </w:style>
-  <w:style w:type="paragraph" w:styleId="FrameContentsuser">
-    <w:name w:val="Frame Contents (user)"/>
+  <w:style w:type="paragraph" w:styleId="FrameContents">
+    <w:name w:val="Frame Contents"/>
     <w:basedOn w:val="Normal"/>
     <w:qFormat/>
     <w:pPr/>

</xml_diff>

<commit_message>
Added the functionality to edit the item
</commit_message>
<xml_diff>
--- a/Documentations/SRS.docx
+++ b/Documentations/SRS.docx
@@ -1793,7 +1793,7 @@
             </w:pPr>
             <w:r>
               <w:rPr/>
-              <w:t>In Progress</w:t>
+              <w:t>Completed</w:t>
             </w:r>
           </w:p>
         </w:tc>
@@ -4748,7 +4748,7 @@
     <w:pPr>
       <w:widowControl/>
       <w:suppressAutoHyphens w:val="true"/>
-      <w:overflowPunct w:val="true"/>
+      <w:overflowPunct w:val="false"/>
       <w:bidi w:val="0"/>
       <w:spacing w:before="0" w:after="0"/>
       <w:jc w:val="start"/>
@@ -4814,8 +4814,8 @@
     <w:qFormat/>
     <w:rPr/>
   </w:style>
-  <w:style w:type="character" w:styleId="Bullets">
-    <w:name w:val="Bullets"/>
+  <w:style w:type="character" w:styleId="Bulletsuser">
+    <w:name w:val="Bullets (user)"/>
     <w:qFormat/>
     <w:rPr>
       <w:rFonts w:ascii="OpenSymbol" w:hAnsi="OpenSymbol" w:eastAsia="OpenSymbol" w:cs="OpenSymbol"/>
@@ -4896,8 +4896,8 @@
       <w:szCs w:val="12"/>
     </w:rPr>
   </w:style>
-  <w:style w:type="paragraph" w:styleId="FrameContents">
-    <w:name w:val="Frame Contents"/>
+  <w:style w:type="paragraph" w:styleId="FrameContentsuser">
+    <w:name w:val="Frame Contents (user)"/>
     <w:basedOn w:val="Normal"/>
     <w:qFormat/>
     <w:pPr/>

</xml_diff>

<commit_message>
Added the delete functionality for the item
</commit_message>
<xml_diff>
--- a/Documentations/SRS.docx
+++ b/Documentations/SRS.docx
@@ -1862,7 +1862,7 @@
             </w:pPr>
             <w:r>
               <w:rPr/>
-              <w:t>In Progress</w:t>
+              <w:t>Completed</w:t>
             </w:r>
           </w:p>
         </w:tc>
@@ -4748,7 +4748,7 @@
     <w:pPr>
       <w:widowControl/>
       <w:suppressAutoHyphens w:val="true"/>
-      <w:overflowPunct w:val="false"/>
+      <w:overflowPunct w:val="true"/>
       <w:bidi w:val="0"/>
       <w:spacing w:before="0" w:after="0"/>
       <w:jc w:val="start"/>
@@ -4814,8 +4814,8 @@
     <w:qFormat/>
     <w:rPr/>
   </w:style>
-  <w:style w:type="character" w:styleId="Bulletsuser">
-    <w:name w:val="Bullets (user)"/>
+  <w:style w:type="character" w:styleId="Bullets">
+    <w:name w:val="Bullets"/>
     <w:qFormat/>
     <w:rPr>
       <w:rFonts w:ascii="OpenSymbol" w:hAnsi="OpenSymbol" w:eastAsia="OpenSymbol" w:cs="OpenSymbol"/>
@@ -4896,8 +4896,8 @@
       <w:szCs w:val="12"/>
     </w:rPr>
   </w:style>
-  <w:style w:type="paragraph" w:styleId="FrameContentsuser">
-    <w:name w:val="Frame Contents (user)"/>
+  <w:style w:type="paragraph" w:styleId="FrameContents">
+    <w:name w:val="Frame Contents"/>
     <w:basedOn w:val="Normal"/>
     <w:qFormat/>
     <w:pPr/>

</xml_diff>

<commit_message>
Further refactor the Desktop UI for maintainability
</commit_message>
<xml_diff>
--- a/Documentations/SRS.docx
+++ b/Documentations/SRS.docx
@@ -1931,6 +1931,7 @@
             </w:pPr>
             <w:r>
               <w:rPr/>
+              <w:t>In Progress</w:t>
             </w:r>
           </w:p>
         </w:tc>
@@ -2135,6 +2136,7 @@
             </w:pPr>
             <w:r>
               <w:rPr/>
+              <w:t>In Progress</w:t>
             </w:r>
           </w:p>
         </w:tc>
@@ -4748,7 +4750,7 @@
     <w:pPr>
       <w:widowControl/>
       <w:suppressAutoHyphens w:val="true"/>
-      <w:overflowPunct w:val="true"/>
+      <w:overflowPunct w:val="false"/>
       <w:bidi w:val="0"/>
       <w:spacing w:before="0" w:after="0"/>
       <w:jc w:val="start"/>
@@ -4814,8 +4816,8 @@
     <w:qFormat/>
     <w:rPr/>
   </w:style>
-  <w:style w:type="character" w:styleId="Bullets">
-    <w:name w:val="Bullets"/>
+  <w:style w:type="character" w:styleId="Bulletsuser">
+    <w:name w:val="Bullets (user)"/>
     <w:qFormat/>
     <w:rPr>
       <w:rFonts w:ascii="OpenSymbol" w:hAnsi="OpenSymbol" w:eastAsia="OpenSymbol" w:cs="OpenSymbol"/>
@@ -4896,8 +4898,8 @@
       <w:szCs w:val="12"/>
     </w:rPr>
   </w:style>
-  <w:style w:type="paragraph" w:styleId="FrameContents">
-    <w:name w:val="Frame Contents"/>
+  <w:style w:type="paragraph" w:styleId="FrameContentsuser">
+    <w:name w:val="Frame Contents (user)"/>
     <w:basedOn w:val="Normal"/>
     <w:qFormat/>
     <w:pPr/>

</xml_diff>

<commit_message>
Implement the bar code functionality
</commit_message>
<xml_diff>
--- a/Documentations/SRS.docx
+++ b/Documentations/SRS.docx
@@ -4750,7 +4750,7 @@
     <w:pPr>
       <w:widowControl/>
       <w:suppressAutoHyphens w:val="true"/>
-      <w:overflowPunct w:val="false"/>
+      <w:overflowPunct w:val="true"/>
       <w:bidi w:val="0"/>
       <w:spacing w:before="0" w:after="0"/>
       <w:jc w:val="start"/>
@@ -4816,8 +4816,8 @@
     <w:qFormat/>
     <w:rPr/>
   </w:style>
-  <w:style w:type="character" w:styleId="Bulletsuser">
-    <w:name w:val="Bullets (user)"/>
+  <w:style w:type="character" w:styleId="Bullets">
+    <w:name w:val="Bullets"/>
     <w:qFormat/>
     <w:rPr>
       <w:rFonts w:ascii="OpenSymbol" w:hAnsi="OpenSymbol" w:eastAsia="OpenSymbol" w:cs="OpenSymbol"/>
@@ -4898,8 +4898,8 @@
       <w:szCs w:val="12"/>
     </w:rPr>
   </w:style>
-  <w:style w:type="paragraph" w:styleId="FrameContentsuser">
-    <w:name w:val="Frame Contents (user)"/>
+  <w:style w:type="paragraph" w:styleId="FrameContents">
+    <w:name w:val="Frame Contents"/>
     <w:basedOn w:val="Normal"/>
     <w:qFormat/>
     <w:pPr/>

</xml_diff>

<commit_message>
Created the category list panel for managing categories data
</commit_message>
<xml_diff>
--- a/Documentations/SRS.docx
+++ b/Documentations/SRS.docx
@@ -2069,6 +2069,7 @@
             </w:pPr>
             <w:r>
               <w:rPr/>
+              <w:t>In Progress</w:t>
             </w:r>
           </w:p>
         </w:tc>
@@ -2274,6 +2275,7 @@
             </w:pPr>
             <w:r>
               <w:rPr/>
+              <w:t>In Progress</w:t>
             </w:r>
           </w:p>
         </w:tc>
@@ -4751,7 +4753,7 @@
     <w:pPr>
       <w:widowControl/>
       <w:suppressAutoHyphens w:val="true"/>
-      <w:overflowPunct w:val="true"/>
+      <w:overflowPunct w:val="false"/>
       <w:bidi w:val="0"/>
       <w:spacing w:before="0" w:after="0"/>
       <w:jc w:val="start"/>
@@ -4817,8 +4819,8 @@
     <w:qFormat/>
     <w:rPr/>
   </w:style>
-  <w:style w:type="character" w:styleId="Bullets">
-    <w:name w:val="Bullets"/>
+  <w:style w:type="character" w:styleId="Bulletsuser">
+    <w:name w:val="Bullets (user)"/>
     <w:qFormat/>
     <w:rPr>
       <w:rFonts w:ascii="OpenSymbol" w:hAnsi="OpenSymbol" w:eastAsia="OpenSymbol" w:cs="OpenSymbol"/>
@@ -4899,8 +4901,8 @@
       <w:szCs w:val="12"/>
     </w:rPr>
   </w:style>
-  <w:style w:type="paragraph" w:styleId="FrameContents">
-    <w:name w:val="Frame Contents"/>
+  <w:style w:type="paragraph" w:styleId="FrameContentsuser">
+    <w:name w:val="Frame Contents (user)"/>
     <w:basedOn w:val="Normal"/>
     <w:qFormat/>
     <w:pPr/>

</xml_diff>

<commit_message>
Added the Search drop down for searching into different information
</commit_message>
<xml_diff>
--- a/Documentations/SRS.docx
+++ b/Documentations/SRS.docx
@@ -713,7 +713,7 @@
       </w:pPr>
       <w:r>
         <w:rPr/>
-        <w:t>A login system to store and grab the user information</w:t>
+        <w:t>An interface to show the items in an inventory</w:t>
       </w:r>
     </w:p>
     <w:p>
@@ -729,7 +729,7 @@
       </w:pPr>
       <w:r>
         <w:rPr/>
-        <w:t>An interface to show user interface</w:t>
+        <w:t>A system that search for the items in an inventory</w:t>
       </w:r>
     </w:p>
     <w:p>
@@ -745,7 +745,23 @@
       </w:pPr>
       <w:r>
         <w:rPr/>
-        <w:t>An interface to show the items in an inventory</w:t>
+        <w:t xml:space="preserve">A system that </w:t>
+      </w:r>
+      <w:r>
+        <w:rPr/>
+        <w:t>search</w:t>
+      </w:r>
+      <w:r>
+        <w:rPr/>
+        <w:t xml:space="preserve"> the items by </w:t>
+      </w:r>
+      <w:r>
+        <w:rPr/>
+        <w:t>room, floor,</w:t>
+      </w:r>
+      <w:r>
+        <w:rPr/>
+        <w:t xml:space="preserve"> and categories</w:t>
       </w:r>
     </w:p>
     <w:p>
@@ -761,7 +777,11 @@
       </w:pPr>
       <w:r>
         <w:rPr/>
-        <w:t>A system that search for the items in an inventory</w:t>
+        <w:t xml:space="preserve">A system that create, update, or delete the items, </w:t>
+      </w:r>
+      <w:r>
+        <w:rPr/>
+        <w:t>categories, or locations</w:t>
       </w:r>
     </w:p>
     <w:p>
@@ -777,7 +797,7 @@
       </w:pPr>
       <w:r>
         <w:rPr/>
-        <w:t>A system that organize the items by locations and categories</w:t>
+        <w:t>A system that scan the bar code to grab the items</w:t>
       </w:r>
     </w:p>
     <w:p>
@@ -793,71 +813,7 @@
       </w:pPr>
       <w:r>
         <w:rPr/>
-        <w:t>A system that create, update, or delete the items in an inventory</w:t>
-      </w:r>
-    </w:p>
-    <w:p>
-      <w:pPr>
-        <w:pStyle w:val="Normal"/>
-        <w:numPr>
-          <w:ilvl w:val="0"/>
-          <w:numId w:val="3"/>
-        </w:numPr>
-        <w:bidi w:val="0"/>
-        <w:jc w:val="start"/>
-        <w:rPr/>
-      </w:pPr>
-      <w:r>
-        <w:rPr/>
-        <w:t>A system that scan the bar code to add or grab the items</w:t>
-      </w:r>
-    </w:p>
-    <w:p>
-      <w:pPr>
-        <w:pStyle w:val="Normal"/>
-        <w:numPr>
-          <w:ilvl w:val="0"/>
-          <w:numId w:val="3"/>
-        </w:numPr>
-        <w:bidi w:val="0"/>
-        <w:jc w:val="start"/>
-        <w:rPr/>
-      </w:pPr>
-      <w:r>
-        <w:rPr/>
-        <w:t>A system that calculate the total prices for items that needed</w:t>
-      </w:r>
-    </w:p>
-    <w:p>
-      <w:pPr>
-        <w:pStyle w:val="Normal"/>
-        <w:numPr>
-          <w:ilvl w:val="0"/>
-          <w:numId w:val="3"/>
-        </w:numPr>
-        <w:bidi w:val="0"/>
-        <w:jc w:val="start"/>
-        <w:rPr/>
-      </w:pPr>
-      <w:r>
-        <w:rPr/>
         <w:t>A system that export and import data for easy transfer</w:t>
-      </w:r>
-    </w:p>
-    <w:p>
-      <w:pPr>
-        <w:pStyle w:val="Normal"/>
-        <w:numPr>
-          <w:ilvl w:val="0"/>
-          <w:numId w:val="3"/>
-        </w:numPr>
-        <w:bidi w:val="0"/>
-        <w:jc w:val="start"/>
-        <w:rPr/>
-      </w:pPr>
-      <w:r>
-        <w:rPr/>
-        <w:t>A system that filter the items by specific information</w:t>
       </w:r>
     </w:p>
     <w:p>
@@ -927,7 +883,27 @@
       </w:pPr>
       <w:r>
         <w:rPr/>
-        <w:t>InventBox Backend – The API layer that manage the data on the backend</w:t>
+        <w:t xml:space="preserve">InventBox </w:t>
+      </w:r>
+      <w:r>
+        <w:rPr/>
+        <w:t>Core</w:t>
+      </w:r>
+      <w:r>
+        <w:rPr/>
+        <w:t xml:space="preserve"> – The </w:t>
+      </w:r>
+      <w:r>
+        <w:rPr/>
+        <w:t>core</w:t>
+      </w:r>
+      <w:r>
+        <w:rPr/>
+        <w:t xml:space="preserve"> layer that manage the data on the </w:t>
+      </w:r>
+      <w:r>
+        <w:rPr/>
+        <w:t>application along with other functionality like transferring data, barcode scanner, or other.</w:t>
       </w:r>
     </w:p>
     <w:p>
@@ -944,22 +920,6 @@
       <w:r>
         <w:rPr/>
         <w:t>User – The user that uses the InventBox</w:t>
-      </w:r>
-    </w:p>
-    <w:p>
-      <w:pPr>
-        <w:pStyle w:val="Normal"/>
-        <w:numPr>
-          <w:ilvl w:val="0"/>
-          <w:numId w:val="4"/>
-        </w:numPr>
-        <w:bidi w:val="0"/>
-        <w:jc w:val="start"/>
-        <w:rPr/>
-      </w:pPr>
-      <w:r>
-        <w:rPr/>
-        <w:t>System Admin – The user that is responsible for managing and maintaining the InventBox</w:t>
       </w:r>
     </w:p>
     <w:p>
@@ -1107,7 +1067,15 @@
             </w:pPr>
             <w:r>
               <w:rPr/>
-              <w:t>User can create items into a inventory via manually or scanning through bar code.</w:t>
+              <w:t xml:space="preserve">User can create items into a inventory manually </w:t>
+            </w:r>
+            <w:r>
+              <w:rPr/>
+              <w:t>with category and locations</w:t>
+            </w:r>
+            <w:r>
+              <w:rPr/>
+              <w:t>.</w:t>
             </w:r>
           </w:p>
         </w:tc>
@@ -1129,7 +1097,11 @@
             </w:pPr>
             <w:r>
               <w:rPr/>
-              <w:t>Examine the user’s metadata for the items information</w:t>
+              <w:t xml:space="preserve">Examine the </w:t>
+            </w:r>
+            <w:r>
+              <w:rPr/>
+              <w:t>item’s metadata for information.</w:t>
             </w:r>
           </w:p>
         </w:tc>
@@ -1153,7 +1125,7 @@
             </w:pPr>
             <w:r>
               <w:rPr/>
-              <w:t>System can organize the items into the locations or categories based on what user is inputted</w:t>
+              <w:t>User can create category manually to be added to items</w:t>
             </w:r>
           </w:p>
         </w:tc>
@@ -1175,7 +1147,7 @@
             </w:pPr>
             <w:r>
               <w:rPr/>
-              <w:t>Items categories or locations displayed with organization matter</w:t>
+              <w:t>Examine the categories’ metadata for information</w:t>
             </w:r>
           </w:p>
         </w:tc>
@@ -1199,7 +1171,7 @@
             </w:pPr>
             <w:r>
               <w:rPr/>
-              <w:t>System can calculate the total prices of the items to buy.</w:t>
+              <w:t>User can create locations manually to be added to items</w:t>
             </w:r>
           </w:p>
         </w:tc>
@@ -1221,99 +1193,7 @@
             </w:pPr>
             <w:r>
               <w:rPr/>
-              <w:t>The items price are displayed</w:t>
-            </w:r>
-          </w:p>
-        </w:tc>
-      </w:tr>
-      <w:tr>
-        <w:trPr/>
-        <w:tc>
-          <w:tcPr>
-            <w:tcW w:w="4985" w:type="dxa"/>
-            <w:tcBorders>
-              <w:start w:val="single" w:sz="4" w:space="0" w:color="000000"/>
-              <w:bottom w:val="single" w:sz="4" w:space="0" w:color="000000"/>
-            </w:tcBorders>
-          </w:tcPr>
-          <w:p>
-            <w:pPr>
-              <w:pStyle w:val="TableContents"/>
-              <w:bidi w:val="0"/>
-              <w:jc w:val="start"/>
-              <w:rPr/>
-            </w:pPr>
-            <w:r>
-              <w:rPr/>
-              <w:t>The system is cross platform with self hosting browser, CLI, and mobile</w:t>
-            </w:r>
-          </w:p>
-        </w:tc>
-        <w:tc>
-          <w:tcPr>
-            <w:tcW w:w="4987" w:type="dxa"/>
-            <w:tcBorders>
-              <w:start w:val="single" w:sz="4" w:space="0" w:color="000000"/>
-              <w:bottom w:val="single" w:sz="4" w:space="0" w:color="000000"/>
-              <w:end w:val="single" w:sz="4" w:space="0" w:color="000000"/>
-            </w:tcBorders>
-          </w:tcPr>
-          <w:p>
-            <w:pPr>
-              <w:pStyle w:val="TableContents"/>
-              <w:bidi w:val="0"/>
-              <w:jc w:val="start"/>
-              <w:rPr/>
-            </w:pPr>
-            <w:r>
-              <w:rPr/>
-              <w:t>All of relevant information is reachable from all sort of UI</w:t>
-            </w:r>
-          </w:p>
-        </w:tc>
-      </w:tr>
-      <w:tr>
-        <w:trPr/>
-        <w:tc>
-          <w:tcPr>
-            <w:tcW w:w="4985" w:type="dxa"/>
-            <w:tcBorders>
-              <w:start w:val="single" w:sz="4" w:space="0" w:color="000000"/>
-              <w:bottom w:val="single" w:sz="4" w:space="0" w:color="000000"/>
-            </w:tcBorders>
-          </w:tcPr>
-          <w:p>
-            <w:pPr>
-              <w:pStyle w:val="TableContents"/>
-              <w:bidi w:val="0"/>
-              <w:jc w:val="start"/>
-              <w:rPr/>
-            </w:pPr>
-            <w:r>
-              <w:rPr/>
-              <w:t>The system fail safety when isolated from the backend systems</w:t>
-            </w:r>
-          </w:p>
-        </w:tc>
-        <w:tc>
-          <w:tcPr>
-            <w:tcW w:w="4987" w:type="dxa"/>
-            <w:tcBorders>
-              <w:start w:val="single" w:sz="4" w:space="0" w:color="000000"/>
-              <w:bottom w:val="single" w:sz="4" w:space="0" w:color="000000"/>
-              <w:end w:val="single" w:sz="4" w:space="0" w:color="000000"/>
-            </w:tcBorders>
-          </w:tcPr>
-          <w:p>
-            <w:pPr>
-              <w:pStyle w:val="TableContents"/>
-              <w:bidi w:val="0"/>
-              <w:jc w:val="start"/>
-              <w:rPr/>
-            </w:pPr>
-            <w:r>
-              <w:rPr/>
-              <w:t>The UI is error free when isolated.</w:t>
+              <w:t>Examine the locations’ metadata for information</w:t>
             </w:r>
           </w:p>
         </w:tc>
@@ -1543,7 +1423,7 @@
             </w:pPr>
             <w:r>
               <w:rPr/>
-              <w:t>User can create an account</w:t>
+              <w:t>User can create an items manually</w:t>
             </w:r>
           </w:p>
         </w:tc>
@@ -1564,7 +1444,7 @@
             </w:pPr>
             <w:r>
               <w:rPr/>
-              <w:t>As a user, I want to create an account to store the information about myself</w:t>
+              <w:t>As a user, I want to create an items that I have with information that I put in into the inventory.</w:t>
             </w:r>
           </w:p>
         </w:tc>
@@ -1588,6 +1468,7 @@
             </w:pPr>
             <w:r>
               <w:rPr/>
+              <w:t>Completed</w:t>
             </w:r>
           </w:p>
         </w:tc>
@@ -1611,7 +1492,7 @@
             </w:pPr>
             <w:r>
               <w:rPr/>
-              <w:t>User can manage their data</w:t>
+              <w:t>User can manage their items data</w:t>
             </w:r>
           </w:p>
         </w:tc>
@@ -1632,7 +1513,7 @@
             </w:pPr>
             <w:r>
               <w:rPr/>
-              <w:t>As a user, I want to update and delete the account if I want to edit information or delete the information from the system.</w:t>
+              <w:t>As a user, I want to update the item with the new information that I have.</w:t>
             </w:r>
           </w:p>
         </w:tc>
@@ -1656,6 +1537,7 @@
             </w:pPr>
             <w:r>
               <w:rPr/>
+              <w:t>Completed</w:t>
             </w:r>
           </w:p>
         </w:tc>
@@ -1679,7 +1561,7 @@
             </w:pPr>
             <w:r>
               <w:rPr/>
-              <w:t>User can create an items manually</w:t>
+              <w:t>User can delete their items</w:t>
             </w:r>
           </w:p>
         </w:tc>
@@ -1700,7 +1582,7 @@
             </w:pPr>
             <w:r>
               <w:rPr/>
-              <w:t>As a user, I want to create an items that I have with information that I put in into the inventory.</w:t>
+              <w:t>As a user, I want to delete the items from the inventory.</w:t>
             </w:r>
           </w:p>
         </w:tc>
@@ -1748,7 +1630,7 @@
             </w:pPr>
             <w:r>
               <w:rPr/>
-              <w:t>User can manage their items data</w:t>
+              <w:t>User can search for an item from the query</w:t>
             </w:r>
           </w:p>
         </w:tc>
@@ -1769,7 +1651,7 @@
             </w:pPr>
             <w:r>
               <w:rPr/>
-              <w:t>As a user, I want to update the item with the new information that I have.</w:t>
+              <w:t>As a user, I want to search for the items so I can look for specific items in the list.</w:t>
             </w:r>
           </w:p>
         </w:tc>
@@ -1817,7 +1699,19 @@
             </w:pPr>
             <w:r>
               <w:rPr/>
-              <w:t>User can delete their items</w:t>
+              <w:t xml:space="preserve">User can </w:t>
+            </w:r>
+            <w:r>
+              <w:rPr/>
+              <w:t>search</w:t>
+            </w:r>
+            <w:r>
+              <w:rPr/>
+              <w:t xml:space="preserve"> through the items with specific information </w:t>
+            </w:r>
+            <w:r>
+              <w:rPr/>
+              <w:t>like categories or locations.</w:t>
             </w:r>
           </w:p>
         </w:tc>
@@ -1838,7 +1732,27 @@
             </w:pPr>
             <w:r>
               <w:rPr/>
-              <w:t>As a user, I want to delete the items from the inventory.</w:t>
+              <w:t xml:space="preserve">As a user, I want to </w:t>
+            </w:r>
+            <w:r>
+              <w:rPr/>
+              <w:t>search</w:t>
+            </w:r>
+            <w:r>
+              <w:rPr/>
+              <w:t xml:space="preserve"> the items </w:t>
+            </w:r>
+            <w:r>
+              <w:rPr/>
+              <w:t xml:space="preserve">from categories or locations </w:t>
+            </w:r>
+            <w:r>
+              <w:rPr/>
+              <w:t xml:space="preserve">so I can go through the items </w:t>
+            </w:r>
+            <w:r>
+              <w:rPr/>
+              <w:t>with those information.</w:t>
             </w:r>
           </w:p>
         </w:tc>
@@ -1886,7 +1800,7 @@
             </w:pPr>
             <w:r>
               <w:rPr/>
-              <w:t>User can scan the bar code to add items</w:t>
+              <w:t>User can scan the bar code to get the item from the list</w:t>
             </w:r>
           </w:p>
         </w:tc>
@@ -1907,7 +1821,7 @@
             </w:pPr>
             <w:r>
               <w:rPr/>
-              <w:t>As a user, I want to scan the bar code from the item so I can add items automatically.</w:t>
+              <w:t>As a user, I want to scan the bar code so I can yank the items from the inventory.</w:t>
             </w:r>
           </w:p>
         </w:tc>
@@ -1931,7 +1845,7 @@
             </w:pPr>
             <w:r>
               <w:rPr/>
-              <w:t>In Progress</w:t>
+              <w:t>Completed</w:t>
             </w:r>
           </w:p>
         </w:tc>
@@ -1955,7 +1869,7 @@
             </w:pPr>
             <w:r>
               <w:rPr/>
-              <w:t>User can search for an item from the query</w:t>
+              <w:t>User can export and import the data from or into the app.</w:t>
             </w:r>
           </w:p>
         </w:tc>
@@ -1976,7 +1890,7 @@
             </w:pPr>
             <w:r>
               <w:rPr/>
-              <w:t>As a user, I want to search for the items so I can look for specific items in the list.</w:t>
+              <w:t>As a user, I want to be able to export and import the data from the application so I can transfer from one device to another.</w:t>
             </w:r>
           </w:p>
         </w:tc>
@@ -2024,7 +1938,7 @@
             </w:pPr>
             <w:r>
               <w:rPr/>
-              <w:t>User can filter through the items with specific information</w:t>
+              <w:t>Developer can check the logs file for debugging the application.</w:t>
             </w:r>
           </w:p>
         </w:tc>
@@ -2045,7 +1959,7 @@
             </w:pPr>
             <w:r>
               <w:rPr/>
-              <w:t>As a user, I want to filter the items so I can go through the items with certain type of information.</w:t>
+              <w:t>As a developer, I want to be able to check the log files for any bugs or weird behavior from the systems.</w:t>
             </w:r>
           </w:p>
         </w:tc>
@@ -2069,622 +1983,6 @@
             </w:pPr>
             <w:r>
               <w:rPr/>
-              <w:t>In Progress</w:t>
-            </w:r>
-          </w:p>
-        </w:tc>
-      </w:tr>
-      <w:tr>
-        <w:trPr/>
-        <w:tc>
-          <w:tcPr>
-            <w:tcW w:w="3324" w:type="dxa"/>
-            <w:tcBorders>
-              <w:start w:val="single" w:sz="4" w:space="0" w:color="000000"/>
-              <w:bottom w:val="single" w:sz="4" w:space="0" w:color="000000"/>
-            </w:tcBorders>
-          </w:tcPr>
-          <w:p>
-            <w:pPr>
-              <w:pStyle w:val="TableContents"/>
-              <w:bidi w:val="0"/>
-              <w:jc w:val="start"/>
-              <w:rPr/>
-            </w:pPr>
-            <w:r>
-              <w:rPr/>
-              <w:t>User can scan the bar code to get the item from the list</w:t>
-            </w:r>
-          </w:p>
-        </w:tc>
-        <w:tc>
-          <w:tcPr>
-            <w:tcW w:w="3324" w:type="dxa"/>
-            <w:tcBorders>
-              <w:start w:val="single" w:sz="4" w:space="0" w:color="000000"/>
-              <w:bottom w:val="single" w:sz="4" w:space="0" w:color="000000"/>
-            </w:tcBorders>
-          </w:tcPr>
-          <w:p>
-            <w:pPr>
-              <w:pStyle w:val="TableContents"/>
-              <w:bidi w:val="0"/>
-              <w:jc w:val="start"/>
-              <w:rPr/>
-            </w:pPr>
-            <w:r>
-              <w:rPr/>
-              <w:t>As a user, I want to scan the bar code so I can yank the items from the inventory.</w:t>
-            </w:r>
-          </w:p>
-        </w:tc>
-        <w:tc>
-          <w:tcPr>
-            <w:tcW w:w="3324" w:type="dxa"/>
-            <w:tcBorders>
-              <w:start w:val="single" w:sz="4" w:space="0" w:color="000000"/>
-              <w:bottom w:val="single" w:sz="4" w:space="0" w:color="000000"/>
-              <w:end w:val="single" w:sz="4" w:space="0" w:color="000000"/>
-            </w:tcBorders>
-          </w:tcPr>
-          <w:p>
-            <w:pPr>
-              <w:pStyle w:val="TableContents"/>
-              <w:widowControl w:val="false"/>
-              <w:suppressLineNumbers/>
-              <w:bidi w:val="0"/>
-              <w:jc w:val="start"/>
-              <w:rPr/>
-            </w:pPr>
-            <w:r>
-              <w:rPr/>
-              <w:t>Completed</w:t>
-            </w:r>
-          </w:p>
-        </w:tc>
-      </w:tr>
-      <w:tr>
-        <w:trPr/>
-        <w:tc>
-          <w:tcPr>
-            <w:tcW w:w="3324" w:type="dxa"/>
-            <w:tcBorders>
-              <w:start w:val="single" w:sz="4" w:space="0" w:color="000000"/>
-              <w:bottom w:val="single" w:sz="4" w:space="0" w:color="000000"/>
-            </w:tcBorders>
-          </w:tcPr>
-          <w:p>
-            <w:pPr>
-              <w:pStyle w:val="TableContents"/>
-              <w:bidi w:val="0"/>
-              <w:jc w:val="start"/>
-              <w:rPr/>
-            </w:pPr>
-            <w:r>
-              <w:rPr/>
-              <w:t>User can add the items to the shopping list</w:t>
-            </w:r>
-          </w:p>
-        </w:tc>
-        <w:tc>
-          <w:tcPr>
-            <w:tcW w:w="3324" w:type="dxa"/>
-            <w:tcBorders>
-              <w:start w:val="single" w:sz="4" w:space="0" w:color="000000"/>
-              <w:bottom w:val="single" w:sz="4" w:space="0" w:color="000000"/>
-            </w:tcBorders>
-          </w:tcPr>
-          <w:p>
-            <w:pPr>
-              <w:pStyle w:val="TableContents"/>
-              <w:bidi w:val="0"/>
-              <w:jc w:val="start"/>
-              <w:rPr/>
-            </w:pPr>
-            <w:r>
-              <w:rPr/>
-              <w:t>As a user, I want to add the items to the shopping list so I can look through the list to buy.</w:t>
-            </w:r>
-          </w:p>
-        </w:tc>
-        <w:tc>
-          <w:tcPr>
-            <w:tcW w:w="3324" w:type="dxa"/>
-            <w:tcBorders>
-              <w:start w:val="single" w:sz="4" w:space="0" w:color="000000"/>
-              <w:bottom w:val="single" w:sz="4" w:space="0" w:color="000000"/>
-              <w:end w:val="single" w:sz="4" w:space="0" w:color="000000"/>
-            </w:tcBorders>
-          </w:tcPr>
-          <w:p>
-            <w:pPr>
-              <w:pStyle w:val="TableContents"/>
-              <w:widowControl w:val="false"/>
-              <w:suppressLineNumbers/>
-              <w:bidi w:val="0"/>
-              <w:jc w:val="start"/>
-              <w:rPr/>
-            </w:pPr>
-            <w:r>
-              <w:rPr/>
-            </w:r>
-          </w:p>
-        </w:tc>
-      </w:tr>
-      <w:tr>
-        <w:trPr/>
-        <w:tc>
-          <w:tcPr>
-            <w:tcW w:w="3324" w:type="dxa"/>
-            <w:tcBorders>
-              <w:start w:val="single" w:sz="4" w:space="0" w:color="000000"/>
-              <w:bottom w:val="single" w:sz="4" w:space="0" w:color="000000"/>
-            </w:tcBorders>
-          </w:tcPr>
-          <w:p>
-            <w:pPr>
-              <w:pStyle w:val="TableContents"/>
-              <w:bidi w:val="0"/>
-              <w:jc w:val="start"/>
-              <w:rPr/>
-            </w:pPr>
-            <w:r>
-              <w:rPr/>
-              <w:t>System can organize the items into different locations or categories based on what user have put in.</w:t>
-            </w:r>
-          </w:p>
-        </w:tc>
-        <w:tc>
-          <w:tcPr>
-            <w:tcW w:w="3324" w:type="dxa"/>
-            <w:tcBorders>
-              <w:start w:val="single" w:sz="4" w:space="0" w:color="000000"/>
-              <w:bottom w:val="single" w:sz="4" w:space="0" w:color="000000"/>
-            </w:tcBorders>
-          </w:tcPr>
-          <w:p>
-            <w:pPr>
-              <w:pStyle w:val="TableContents"/>
-              <w:bidi w:val="0"/>
-              <w:jc w:val="start"/>
-              <w:rPr/>
-            </w:pPr>
-            <w:r>
-              <w:rPr/>
-              <w:t>As a system, I want to be able to organize the items into different locations or categories so user can see the items from those information.</w:t>
-            </w:r>
-          </w:p>
-        </w:tc>
-        <w:tc>
-          <w:tcPr>
-            <w:tcW w:w="3324" w:type="dxa"/>
-            <w:tcBorders>
-              <w:start w:val="single" w:sz="4" w:space="0" w:color="000000"/>
-              <w:bottom w:val="single" w:sz="4" w:space="0" w:color="000000"/>
-              <w:end w:val="single" w:sz="4" w:space="0" w:color="000000"/>
-            </w:tcBorders>
-          </w:tcPr>
-          <w:p>
-            <w:pPr>
-              <w:pStyle w:val="TableContents"/>
-              <w:widowControl w:val="false"/>
-              <w:suppressLineNumbers/>
-              <w:bidi w:val="0"/>
-              <w:jc w:val="start"/>
-              <w:rPr/>
-            </w:pPr>
-            <w:r>
-              <w:rPr/>
-              <w:t>In Progress</w:t>
-            </w:r>
-          </w:p>
-        </w:tc>
-      </w:tr>
-      <w:tr>
-        <w:trPr/>
-        <w:tc>
-          <w:tcPr>
-            <w:tcW w:w="3324" w:type="dxa"/>
-            <w:tcBorders>
-              <w:start w:val="single" w:sz="4" w:space="0" w:color="000000"/>
-              <w:bottom w:val="single" w:sz="4" w:space="0" w:color="000000"/>
-            </w:tcBorders>
-          </w:tcPr>
-          <w:p>
-            <w:pPr>
-              <w:pStyle w:val="TableContents"/>
-              <w:bidi w:val="0"/>
-              <w:jc w:val="start"/>
-              <w:rPr/>
-            </w:pPr>
-            <w:r>
-              <w:rPr/>
-              <w:t>System can add the total costs from all of the prices in the shopping lists.</w:t>
-            </w:r>
-          </w:p>
-        </w:tc>
-        <w:tc>
-          <w:tcPr>
-            <w:tcW w:w="3324" w:type="dxa"/>
-            <w:tcBorders>
-              <w:start w:val="single" w:sz="4" w:space="0" w:color="000000"/>
-              <w:bottom w:val="single" w:sz="4" w:space="0" w:color="000000"/>
-            </w:tcBorders>
-          </w:tcPr>
-          <w:p>
-            <w:pPr>
-              <w:pStyle w:val="TableContents"/>
-              <w:bidi w:val="0"/>
-              <w:jc w:val="start"/>
-              <w:rPr/>
-            </w:pPr>
-            <w:r>
-              <w:rPr/>
-              <w:t>As a system, I want to be able to calculate the total prices so the user can see how much it would cost.</w:t>
-            </w:r>
-          </w:p>
-        </w:tc>
-        <w:tc>
-          <w:tcPr>
-            <w:tcW w:w="3324" w:type="dxa"/>
-            <w:tcBorders>
-              <w:start w:val="single" w:sz="4" w:space="0" w:color="000000"/>
-              <w:bottom w:val="single" w:sz="4" w:space="0" w:color="000000"/>
-              <w:end w:val="single" w:sz="4" w:space="0" w:color="000000"/>
-            </w:tcBorders>
-          </w:tcPr>
-          <w:p>
-            <w:pPr>
-              <w:pStyle w:val="TableContents"/>
-              <w:widowControl w:val="false"/>
-              <w:suppressLineNumbers/>
-              <w:bidi w:val="0"/>
-              <w:jc w:val="start"/>
-              <w:rPr/>
-            </w:pPr>
-            <w:r>
-              <w:rPr/>
-            </w:r>
-          </w:p>
-        </w:tc>
-      </w:tr>
-      <w:tr>
-        <w:trPr/>
-        <w:tc>
-          <w:tcPr>
-            <w:tcW w:w="3324" w:type="dxa"/>
-            <w:tcBorders>
-              <w:start w:val="single" w:sz="4" w:space="0" w:color="000000"/>
-              <w:bottom w:val="single" w:sz="4" w:space="0" w:color="000000"/>
-            </w:tcBorders>
-          </w:tcPr>
-          <w:p>
-            <w:pPr>
-              <w:pStyle w:val="TableContents"/>
-              <w:bidi w:val="0"/>
-              <w:jc w:val="start"/>
-              <w:rPr/>
-            </w:pPr>
-            <w:r>
-              <w:rPr/>
-              <w:t>System can add the taxes based on the user’s locations</w:t>
-            </w:r>
-          </w:p>
-        </w:tc>
-        <w:tc>
-          <w:tcPr>
-            <w:tcW w:w="3324" w:type="dxa"/>
-            <w:tcBorders>
-              <w:start w:val="single" w:sz="4" w:space="0" w:color="000000"/>
-              <w:bottom w:val="single" w:sz="4" w:space="0" w:color="000000"/>
-            </w:tcBorders>
-          </w:tcPr>
-          <w:p>
-            <w:pPr>
-              <w:pStyle w:val="TableContents"/>
-              <w:bidi w:val="0"/>
-              <w:jc w:val="start"/>
-              <w:rPr/>
-            </w:pPr>
-            <w:r>
-              <w:rPr/>
-              <w:t>As a system, I want to be able to look for the taxes based on the user’s locations so user can see the taxes that will be added to the product costs.</w:t>
-            </w:r>
-          </w:p>
-        </w:tc>
-        <w:tc>
-          <w:tcPr>
-            <w:tcW w:w="3324" w:type="dxa"/>
-            <w:tcBorders>
-              <w:start w:val="single" w:sz="4" w:space="0" w:color="000000"/>
-              <w:bottom w:val="single" w:sz="4" w:space="0" w:color="000000"/>
-              <w:end w:val="single" w:sz="4" w:space="0" w:color="000000"/>
-            </w:tcBorders>
-          </w:tcPr>
-          <w:p>
-            <w:pPr>
-              <w:pStyle w:val="TableContents"/>
-              <w:widowControl w:val="false"/>
-              <w:suppressLineNumbers/>
-              <w:bidi w:val="0"/>
-              <w:jc w:val="start"/>
-              <w:rPr/>
-            </w:pPr>
-            <w:r>
-              <w:rPr/>
-            </w:r>
-          </w:p>
-        </w:tc>
-      </w:tr>
-      <w:tr>
-        <w:trPr/>
-        <w:tc>
-          <w:tcPr>
-            <w:tcW w:w="3324" w:type="dxa"/>
-            <w:tcBorders>
-              <w:start w:val="single" w:sz="4" w:space="0" w:color="000000"/>
-              <w:bottom w:val="single" w:sz="4" w:space="0" w:color="000000"/>
-            </w:tcBorders>
-          </w:tcPr>
-          <w:p>
-            <w:pPr>
-              <w:pStyle w:val="TableContents"/>
-              <w:bidi w:val="0"/>
-              <w:jc w:val="start"/>
-              <w:rPr/>
-            </w:pPr>
-            <w:r>
-              <w:rPr/>
-              <w:t>Admin can manage the data in the backend</w:t>
-            </w:r>
-          </w:p>
-        </w:tc>
-        <w:tc>
-          <w:tcPr>
-            <w:tcW w:w="3324" w:type="dxa"/>
-            <w:tcBorders>
-              <w:start w:val="single" w:sz="4" w:space="0" w:color="000000"/>
-              <w:bottom w:val="single" w:sz="4" w:space="0" w:color="000000"/>
-            </w:tcBorders>
-          </w:tcPr>
-          <w:p>
-            <w:pPr>
-              <w:pStyle w:val="TableContents"/>
-              <w:bidi w:val="0"/>
-              <w:jc w:val="start"/>
-              <w:rPr/>
-            </w:pPr>
-            <w:r>
-              <w:rPr/>
-              <w:t>As a system administrator, I want to be able to read and manage the data in the backend using the SQL query</w:t>
-            </w:r>
-          </w:p>
-        </w:tc>
-        <w:tc>
-          <w:tcPr>
-            <w:tcW w:w="3324" w:type="dxa"/>
-            <w:tcBorders>
-              <w:start w:val="single" w:sz="4" w:space="0" w:color="000000"/>
-              <w:bottom w:val="single" w:sz="4" w:space="0" w:color="000000"/>
-              <w:end w:val="single" w:sz="4" w:space="0" w:color="000000"/>
-            </w:tcBorders>
-          </w:tcPr>
-          <w:p>
-            <w:pPr>
-              <w:pStyle w:val="TableContents"/>
-              <w:widowControl w:val="false"/>
-              <w:suppressLineNumbers/>
-              <w:bidi w:val="0"/>
-              <w:jc w:val="start"/>
-              <w:rPr/>
-            </w:pPr>
-            <w:r>
-              <w:rPr/>
-            </w:r>
-          </w:p>
-        </w:tc>
-      </w:tr>
-      <w:tr>
-        <w:trPr/>
-        <w:tc>
-          <w:tcPr>
-            <w:tcW w:w="3324" w:type="dxa"/>
-            <w:tcBorders>
-              <w:start w:val="single" w:sz="4" w:space="0" w:color="000000"/>
-              <w:bottom w:val="single" w:sz="4" w:space="0" w:color="000000"/>
-            </w:tcBorders>
-          </w:tcPr>
-          <w:p>
-            <w:pPr>
-              <w:pStyle w:val="TableContents"/>
-              <w:bidi w:val="0"/>
-              <w:jc w:val="start"/>
-              <w:rPr/>
-            </w:pPr>
-            <w:r>
-              <w:rPr/>
-              <w:t>User can export and import the data from or into the app.</w:t>
-            </w:r>
-          </w:p>
-        </w:tc>
-        <w:tc>
-          <w:tcPr>
-            <w:tcW w:w="3324" w:type="dxa"/>
-            <w:tcBorders>
-              <w:start w:val="single" w:sz="4" w:space="0" w:color="000000"/>
-              <w:bottom w:val="single" w:sz="4" w:space="0" w:color="000000"/>
-            </w:tcBorders>
-          </w:tcPr>
-          <w:p>
-            <w:pPr>
-              <w:pStyle w:val="TableContents"/>
-              <w:bidi w:val="0"/>
-              <w:jc w:val="start"/>
-              <w:rPr/>
-            </w:pPr>
-            <w:r>
-              <w:rPr/>
-              <w:t>As a user, I want to be able to export and import the data from the application so I can transfer from one device to another.</w:t>
-            </w:r>
-          </w:p>
-        </w:tc>
-        <w:tc>
-          <w:tcPr>
-            <w:tcW w:w="3324" w:type="dxa"/>
-            <w:tcBorders>
-              <w:start w:val="single" w:sz="4" w:space="0" w:color="000000"/>
-              <w:bottom w:val="single" w:sz="4" w:space="0" w:color="000000"/>
-              <w:end w:val="single" w:sz="4" w:space="0" w:color="000000"/>
-            </w:tcBorders>
-          </w:tcPr>
-          <w:p>
-            <w:pPr>
-              <w:pStyle w:val="TableContents"/>
-              <w:widowControl w:val="false"/>
-              <w:suppressLineNumbers/>
-              <w:bidi w:val="0"/>
-              <w:jc w:val="start"/>
-              <w:rPr/>
-            </w:pPr>
-            <w:r>
-              <w:rPr/>
-              <w:t>Completed</w:t>
-            </w:r>
-          </w:p>
-        </w:tc>
-      </w:tr>
-      <w:tr>
-        <w:trPr/>
-        <w:tc>
-          <w:tcPr>
-            <w:tcW w:w="3324" w:type="dxa"/>
-            <w:tcBorders>
-              <w:start w:val="single" w:sz="4" w:space="0" w:color="000000"/>
-              <w:bottom w:val="single" w:sz="4" w:space="0" w:color="000000"/>
-            </w:tcBorders>
-          </w:tcPr>
-          <w:p>
-            <w:pPr>
-              <w:pStyle w:val="TableContents"/>
-              <w:bidi w:val="0"/>
-              <w:jc w:val="start"/>
-              <w:rPr/>
-            </w:pPr>
-            <w:r>
-              <w:rPr/>
-              <w:t>Admin can self host the backend using the container like Docker.</w:t>
-            </w:r>
-          </w:p>
-        </w:tc>
-        <w:tc>
-          <w:tcPr>
-            <w:tcW w:w="3324" w:type="dxa"/>
-            <w:tcBorders>
-              <w:start w:val="single" w:sz="4" w:space="0" w:color="000000"/>
-              <w:bottom w:val="single" w:sz="4" w:space="0" w:color="000000"/>
-            </w:tcBorders>
-          </w:tcPr>
-          <w:p>
-            <w:pPr>
-              <w:pStyle w:val="TableContents"/>
-              <w:bidi w:val="0"/>
-              <w:jc w:val="start"/>
-              <w:rPr/>
-            </w:pPr>
-            <w:r>
-              <w:rPr/>
-              <w:t>As a system administrator, I want to be able to self hosting using the container so I can manage the data and users can access the app through browser</w:t>
-            </w:r>
-          </w:p>
-        </w:tc>
-        <w:tc>
-          <w:tcPr>
-            <w:tcW w:w="3324" w:type="dxa"/>
-            <w:tcBorders>
-              <w:start w:val="single" w:sz="4" w:space="0" w:color="000000"/>
-              <w:bottom w:val="single" w:sz="4" w:space="0" w:color="000000"/>
-              <w:end w:val="single" w:sz="4" w:space="0" w:color="000000"/>
-            </w:tcBorders>
-          </w:tcPr>
-          <w:p>
-            <w:pPr>
-              <w:pStyle w:val="TableContents"/>
-              <w:widowControl w:val="false"/>
-              <w:suppressLineNumbers/>
-              <w:bidi w:val="0"/>
-              <w:jc w:val="start"/>
-              <w:rPr/>
-            </w:pPr>
-            <w:r>
-              <w:rPr/>
-            </w:r>
-          </w:p>
-        </w:tc>
-      </w:tr>
-      <w:tr>
-        <w:trPr/>
-        <w:tc>
-          <w:tcPr>
-            <w:tcW w:w="3324" w:type="dxa"/>
-            <w:tcBorders>
-              <w:start w:val="single" w:sz="4" w:space="0" w:color="000000"/>
-              <w:bottom w:val="single" w:sz="4" w:space="0" w:color="000000"/>
-            </w:tcBorders>
-          </w:tcPr>
-          <w:p>
-            <w:pPr>
-              <w:pStyle w:val="TableContents"/>
-              <w:bidi w:val="0"/>
-              <w:jc w:val="start"/>
-              <w:rPr/>
-            </w:pPr>
-            <w:r>
-              <w:rPr/>
-              <w:t>Developer can check the logs file for debugging the application.</w:t>
-            </w:r>
-          </w:p>
-        </w:tc>
-        <w:tc>
-          <w:tcPr>
-            <w:tcW w:w="3324" w:type="dxa"/>
-            <w:tcBorders>
-              <w:start w:val="single" w:sz="4" w:space="0" w:color="000000"/>
-              <w:bottom w:val="single" w:sz="4" w:space="0" w:color="000000"/>
-            </w:tcBorders>
-          </w:tcPr>
-          <w:p>
-            <w:pPr>
-              <w:pStyle w:val="TableContents"/>
-              <w:bidi w:val="0"/>
-              <w:jc w:val="start"/>
-              <w:rPr/>
-            </w:pPr>
-            <w:r>
-              <w:rPr/>
-              <w:t>As a developer, I want to be able to check the log files for any bugs or weird behavior from the systems.</w:t>
-            </w:r>
-          </w:p>
-        </w:tc>
-        <w:tc>
-          <w:tcPr>
-            <w:tcW w:w="3324" w:type="dxa"/>
-            <w:tcBorders>
-              <w:start w:val="single" w:sz="4" w:space="0" w:color="000000"/>
-              <w:bottom w:val="single" w:sz="4" w:space="0" w:color="000000"/>
-              <w:end w:val="single" w:sz="4" w:space="0" w:color="000000"/>
-            </w:tcBorders>
-          </w:tcPr>
-          <w:p>
-            <w:pPr>
-              <w:pStyle w:val="TableContents"/>
-              <w:widowControl w:val="false"/>
-              <w:suppressLineNumbers/>
-              <w:bidi w:val="0"/>
-              <w:jc w:val="start"/>
-              <w:rPr/>
-            </w:pPr>
-            <w:r>
-              <w:rPr/>
               <w:t>Completed</w:t>
             </w:r>
           </w:p>
@@ -2859,6 +2157,145 @@
     <w:p>
       <w:pPr>
         <w:pStyle w:val="BodyText"/>
+        <w:numPr>
+          <w:ilvl w:val="0"/>
+          <w:numId w:val="5"/>
+        </w:numPr>
+        <w:bidi w:val="0"/>
+        <w:jc w:val="start"/>
+        <w:rPr>
+          <w:sz w:val="24"/>
+          <w:szCs w:val="24"/>
+        </w:rPr>
+      </w:pPr>
+      <w:r>
+        <w:rPr>
+          <w:sz w:val="24"/>
+          <w:szCs w:val="24"/>
+        </w:rPr>
+        <w:t>User account management</w:t>
+      </w:r>
+    </w:p>
+    <w:p>
+      <w:pPr>
+        <w:pStyle w:val="BodyText"/>
+        <w:numPr>
+          <w:ilvl w:val="0"/>
+          <w:numId w:val="5"/>
+        </w:numPr>
+        <w:bidi w:val="0"/>
+        <w:jc w:val="start"/>
+        <w:rPr>
+          <w:sz w:val="24"/>
+          <w:szCs w:val="24"/>
+        </w:rPr>
+      </w:pPr>
+      <w:r>
+        <w:rPr>
+          <w:sz w:val="24"/>
+          <w:szCs w:val="24"/>
+        </w:rPr>
+        <w:t>adding items via bar code</w:t>
+      </w:r>
+    </w:p>
+    <w:p>
+      <w:pPr>
+        <w:pStyle w:val="BodyText"/>
+        <w:numPr>
+          <w:ilvl w:val="0"/>
+          <w:numId w:val="5"/>
+        </w:numPr>
+        <w:bidi w:val="0"/>
+        <w:jc w:val="start"/>
+        <w:rPr>
+          <w:sz w:val="24"/>
+          <w:szCs w:val="24"/>
+        </w:rPr>
+      </w:pPr>
+      <w:r>
+        <w:rPr>
+          <w:sz w:val="24"/>
+          <w:szCs w:val="24"/>
+        </w:rPr>
+        <w:t>organization by categories and locations</w:t>
+      </w:r>
+    </w:p>
+    <w:p>
+      <w:pPr>
+        <w:pStyle w:val="BodyText"/>
+        <w:numPr>
+          <w:ilvl w:val="0"/>
+          <w:numId w:val="5"/>
+        </w:numPr>
+        <w:bidi w:val="0"/>
+        <w:jc w:val="start"/>
+        <w:rPr>
+          <w:sz w:val="24"/>
+          <w:szCs w:val="24"/>
+        </w:rPr>
+      </w:pPr>
+      <w:r>
+        <w:rPr>
+          <w:sz w:val="24"/>
+          <w:szCs w:val="24"/>
+        </w:rPr>
+        <w:t>Shopping List functionality</w:t>
+      </w:r>
+    </w:p>
+    <w:p>
+      <w:pPr>
+        <w:pStyle w:val="BodyText"/>
+        <w:numPr>
+          <w:ilvl w:val="0"/>
+          <w:numId w:val="5"/>
+        </w:numPr>
+        <w:bidi w:val="0"/>
+        <w:jc w:val="start"/>
+        <w:rPr>
+          <w:sz w:val="24"/>
+          <w:szCs w:val="24"/>
+        </w:rPr>
+      </w:pPr>
+      <w:r>
+        <w:rPr>
+          <w:sz w:val="24"/>
+          <w:szCs w:val="24"/>
+        </w:rPr>
+        <w:t>Cross platform across Desktop, Mobile, TUI, and Browser</w:t>
+      </w:r>
+    </w:p>
+    <w:p>
+      <w:pPr>
+        <w:pStyle w:val="BodyText"/>
+        <w:numPr>
+          <w:ilvl w:val="0"/>
+          <w:numId w:val="5"/>
+        </w:numPr>
+        <w:bidi w:val="0"/>
+        <w:jc w:val="start"/>
+        <w:rPr>
+          <w:sz w:val="24"/>
+          <w:szCs w:val="24"/>
+        </w:rPr>
+      </w:pPr>
+      <w:r>
+        <w:rPr>
+          <w:sz w:val="24"/>
+          <w:szCs w:val="24"/>
+        </w:rPr>
+        <w:t xml:space="preserve">Self Hosting </w:t>
+      </w:r>
+      <w:r>
+        <w:rPr>
+          <w:sz w:val="24"/>
+          <w:szCs w:val="24"/>
+        </w:rPr>
+        <w:t>options</w:t>
+      </w:r>
+    </w:p>
+    <w:p>
+      <w:pPr>
+        <w:pStyle w:val="BodyText"/>
         <w:bidi w:val="0"/>
         <w:jc w:val="end"/>
         <w:rPr>
@@ -2924,7 +2361,7 @@
       </w:pPr>
       <w:r>
         <w:rPr/>
-        <w:t>Docker</w:t>
+        <w:t>ETO.Forms</w:t>
       </w:r>
     </w:p>
     <w:p>
@@ -2940,7 +2377,7 @@
       </w:pPr>
       <w:r>
         <w:rPr/>
-        <w:t>SQLite</w:t>
+        <w:t>Xunit</w:t>
       </w:r>
     </w:p>
     <w:p>
@@ -2956,7 +2393,7 @@
       </w:pPr>
       <w:r>
         <w:rPr/>
-        <w:t>Angular</w:t>
+        <w:t>CsvHelper</w:t>
       </w:r>
     </w:p>
     <w:p>
@@ -2972,7 +2409,7 @@
       </w:pPr>
       <w:r>
         <w:rPr/>
-        <w:t>Bootstrap</w:t>
+        <w:t>FlashCap</w:t>
       </w:r>
     </w:p>
     <w:p>
@@ -2988,7 +2425,7 @@
       </w:pPr>
       <w:r>
         <w:rPr/>
-        <w:t>NodeJS</w:t>
+        <w:t>ZXing.NET</w:t>
       </w:r>
     </w:p>
     <w:p>
@@ -3004,7 +2441,7 @@
       </w:pPr>
       <w:r>
         <w:rPr/>
-        <w:t>ASP.NET</w:t>
+        <w:t>ImageSharp</w:t>
       </w:r>
     </w:p>
     <w:p>
@@ -3020,87 +2457,7 @@
       </w:pPr>
       <w:r>
         <w:rPr/>
-        <w:t>Entity Framework</w:t>
-      </w:r>
-    </w:p>
-    <w:p>
-      <w:pPr>
-        <w:pStyle w:val="Normal"/>
-        <w:numPr>
-          <w:ilvl w:val="0"/>
-          <w:numId w:val="6"/>
-        </w:numPr>
-        <w:bidi w:val="0"/>
-        <w:jc w:val="start"/>
-        <w:rPr/>
-      </w:pPr>
-      <w:r>
-        <w:rPr/>
-        <w:t>ETO.Forms</w:t>
-      </w:r>
-    </w:p>
-    <w:p>
-      <w:pPr>
-        <w:pStyle w:val="Normal"/>
-        <w:numPr>
-          <w:ilvl w:val="0"/>
-          <w:numId w:val="6"/>
-        </w:numPr>
-        <w:bidi w:val="0"/>
-        <w:jc w:val="start"/>
-        <w:rPr/>
-      </w:pPr>
-      <w:r>
-        <w:rPr/>
-        <w:t>Avalonia</w:t>
-      </w:r>
-    </w:p>
-    <w:p>
-      <w:pPr>
-        <w:pStyle w:val="Normal"/>
-        <w:numPr>
-          <w:ilvl w:val="0"/>
-          <w:numId w:val="6"/>
-        </w:numPr>
-        <w:bidi w:val="0"/>
-        <w:jc w:val="start"/>
-        <w:rPr/>
-      </w:pPr>
-      <w:r>
-        <w:rPr/>
-        <w:t>Xunit</w:t>
-      </w:r>
-    </w:p>
-    <w:p>
-      <w:pPr>
-        <w:pStyle w:val="Normal"/>
-        <w:numPr>
-          <w:ilvl w:val="0"/>
-          <w:numId w:val="6"/>
-        </w:numPr>
-        <w:bidi w:val="0"/>
-        <w:jc w:val="start"/>
-        <w:rPr/>
-      </w:pPr>
-      <w:r>
-        <w:rPr/>
-        <w:t>Jasmine</w:t>
-      </w:r>
-    </w:p>
-    <w:p>
-      <w:pPr>
-        <w:pStyle w:val="Normal"/>
-        <w:numPr>
-          <w:ilvl w:val="0"/>
-          <w:numId w:val="6"/>
-        </w:numPr>
-        <w:bidi w:val="0"/>
-        <w:jc w:val="start"/>
-        <w:rPr/>
-      </w:pPr>
-      <w:r>
-        <w:rPr/>
-        <w:t>Vitest</w:t>
+        <w:t>Moq</w:t>
       </w:r>
     </w:p>
     <w:p>
@@ -3182,38 +2539,6 @@
       <w:r>
         <w:rPr/>
         <w:t>The user will provide the metadata needed to manage their inventories.</w:t>
-      </w:r>
-    </w:p>
-    <w:p>
-      <w:pPr>
-        <w:pStyle w:val="Normal"/>
-        <w:numPr>
-          <w:ilvl w:val="0"/>
-          <w:numId w:val="7"/>
-        </w:numPr>
-        <w:bidi w:val="0"/>
-        <w:jc w:val="start"/>
-        <w:rPr/>
-      </w:pPr>
-      <w:r>
-        <w:rPr/>
-        <w:t>The metadata collected for the user will be protected with the data protection schemes.</w:t>
-      </w:r>
-    </w:p>
-    <w:p>
-      <w:pPr>
-        <w:pStyle w:val="Normal"/>
-        <w:numPr>
-          <w:ilvl w:val="0"/>
-          <w:numId w:val="7"/>
-        </w:numPr>
-        <w:bidi w:val="0"/>
-        <w:jc w:val="start"/>
-        <w:rPr/>
-      </w:pPr>
-      <w:r>
-        <w:rPr/>
-        <w:t>The user will provide an options to use CLI, Desktop, Mobile, or self hosting.</w:t>
       </w:r>
     </w:p>
     <w:p>
@@ -3725,7 +3050,7 @@
     </w:r>
     <w:r>
       <w:rPr/>
-      <w:t>9</w:t>
+      <w:t>8</w:t>
     </w:r>
     <w:r>
       <w:rPr/>
@@ -3760,7 +3085,7 @@
     </w:r>
     <w:r>
       <w:rPr/>
-      <w:t>9</w:t>
+      <w:t>8</w:t>
     </w:r>
     <w:r>
       <w:rPr/>
@@ -4753,7 +4078,7 @@
     <w:pPr>
       <w:widowControl/>
       <w:suppressAutoHyphens w:val="true"/>
-      <w:overflowPunct w:val="false"/>
+      <w:overflowPunct w:val="true"/>
       <w:bidi w:val="0"/>
       <w:spacing w:before="0" w:after="0"/>
       <w:jc w:val="start"/>
@@ -4819,8 +4144,8 @@
     <w:qFormat/>
     <w:rPr/>
   </w:style>
-  <w:style w:type="character" w:styleId="Bulletsuser">
-    <w:name w:val="Bullets (user)"/>
+  <w:style w:type="character" w:styleId="Bullets">
+    <w:name w:val="Bullets"/>
     <w:qFormat/>
     <w:rPr>
       <w:rFonts w:ascii="OpenSymbol" w:hAnsi="OpenSymbol" w:eastAsia="OpenSymbol" w:cs="OpenSymbol"/>
@@ -4901,8 +4226,8 @@
       <w:szCs w:val="12"/>
     </w:rPr>
   </w:style>
-  <w:style w:type="paragraph" w:styleId="FrameContentsuser">
-    <w:name w:val="Frame Contents (user)"/>
+  <w:style w:type="paragraph" w:styleId="FrameContents">
+    <w:name w:val="Frame Contents"/>
     <w:basedOn w:val="Normal"/>
     <w:qFormat/>
     <w:pPr/>

</xml_diff>

<commit_message>
Added the menu to Inventory, Categories, and Locations panel
</commit_message>
<xml_diff>
--- a/Documentations/SRS.docx
+++ b/Documentations/SRS.docx
@@ -237,8 +237,6 @@
         <w:p>
           <w:pPr>
             <w:pStyle w:val="TOCHeading"/>
-            <w:bidi w:val="0"/>
-            <w:jc w:val="start"/>
             <w:rPr/>
           </w:pPr>
           <w:r>
@@ -253,8 +251,6 @@
               <w:tab w:val="clear" w:pos="9972"/>
               <w:tab w:val="right" w:pos="9971" w:leader="dot"/>
             </w:tabs>
-            <w:bidi w:val="0"/>
-            <w:jc w:val="start"/>
             <w:rPr/>
           </w:pPr>
           <w:r>
@@ -272,17 +268,16 @@
             </w:rPr>
             <w:fldChar w:fldCharType="separate"/>
           </w:r>
-          <w:r>
-            <w:rPr>
-              <w:rStyle w:val="IndexLink"/>
-            </w:rPr>
-            <w:t>1. Project background and descriptions</w:t>
-          </w:r>
-          <w:r>
-            <w:rPr/>
-            <w:tab/>
-            <w:t>3</w:t>
-          </w:r>
+          <w:hyperlink w:anchor="__RefHeading___Toc1649_1349472584" w:tooltip="1. Project background and descriptions">
+            <w:r>
+              <w:rPr>
+                <w:rStyle w:val="IndexLink"/>
+              </w:rPr>
+              <w:t>1. Project background and descriptions</w:t>
+              <w:tab/>
+              <w:t>3</w:t>
+            </w:r>
+          </w:hyperlink>
         </w:p>
         <w:p>
           <w:pPr>
@@ -291,16 +286,18 @@
               <w:tab w:val="clear" w:pos="9972"/>
               <w:tab w:val="right" w:pos="9971" w:leader="dot"/>
             </w:tabs>
-            <w:bidi w:val="0"/>
-            <w:jc w:val="start"/>
             <w:rPr/>
           </w:pPr>
-          <w:r>
-            <w:rPr/>
-            <w:t>2. Project scope</w:t>
-            <w:tab/>
-            <w:t>3</w:t>
-          </w:r>
+          <w:hyperlink w:anchor="__RefHeading___Toc260_2378469445" w:tooltip="2. Project scope">
+            <w:r>
+              <w:rPr>
+                <w:rStyle w:val="IndexLink"/>
+              </w:rPr>
+              <w:t>2. Project scope</w:t>
+              <w:tab/>
+              <w:t>3</w:t>
+            </w:r>
+          </w:hyperlink>
         </w:p>
         <w:p>
           <w:pPr>
@@ -309,16 +306,18 @@
               <w:tab w:val="clear" w:pos="9972"/>
               <w:tab w:val="right" w:pos="9971" w:leader="dot"/>
             </w:tabs>
-            <w:bidi w:val="0"/>
-            <w:jc w:val="start"/>
             <w:rPr/>
           </w:pPr>
-          <w:r>
-            <w:rPr/>
-            <w:t>3. High-level requirements</w:t>
-            <w:tab/>
-            <w:t>3</w:t>
-          </w:r>
+          <w:hyperlink w:anchor="__RefHeading___Toc1653_1349472584" w:tooltip="3. High-level requirements">
+            <w:r>
+              <w:rPr>
+                <w:rStyle w:val="IndexLink"/>
+              </w:rPr>
+              <w:t>3. High-level requirements</w:t>
+              <w:tab/>
+              <w:t>3</w:t>
+            </w:r>
+          </w:hyperlink>
         </w:p>
         <w:p>
           <w:pPr>
@@ -327,16 +326,18 @@
               <w:tab w:val="clear" w:pos="9972"/>
               <w:tab w:val="right" w:pos="9971" w:leader="dot"/>
             </w:tabs>
-            <w:bidi w:val="0"/>
-            <w:jc w:val="start"/>
             <w:rPr/>
           </w:pPr>
-          <w:r>
-            <w:rPr/>
-            <w:t>4. Entities</w:t>
-            <w:tab/>
-            <w:t>3</w:t>
-          </w:r>
+          <w:hyperlink w:anchor="__RefHeading___Toc1655_1349472584" w:tooltip="4. Entities">
+            <w:r>
+              <w:rPr>
+                <w:rStyle w:val="IndexLink"/>
+              </w:rPr>
+              <w:t>4. Entities</w:t>
+              <w:tab/>
+              <w:t>3</w:t>
+            </w:r>
+          </w:hyperlink>
         </w:p>
         <w:p>
           <w:pPr>
@@ -345,16 +346,18 @@
               <w:tab w:val="clear" w:pos="9972"/>
               <w:tab w:val="right" w:pos="9971" w:leader="dot"/>
             </w:tabs>
-            <w:bidi w:val="0"/>
-            <w:jc w:val="start"/>
             <w:rPr/>
           </w:pPr>
-          <w:r>
-            <w:rPr/>
-            <w:t>5. Success Metrics</w:t>
-            <w:tab/>
-            <w:t>3</w:t>
-          </w:r>
+          <w:hyperlink w:anchor="__RefHeading___Toc1657_1349472584" w:tooltip="5. Success Metrics">
+            <w:r>
+              <w:rPr>
+                <w:rStyle w:val="IndexLink"/>
+              </w:rPr>
+              <w:t>5. Success Metrics</w:t>
+              <w:tab/>
+              <w:t>3</w:t>
+            </w:r>
+          </w:hyperlink>
         </w:p>
         <w:p>
           <w:pPr>
@@ -363,16 +366,18 @@
               <w:tab w:val="clear" w:pos="9972"/>
               <w:tab w:val="right" w:pos="9971" w:leader="dot"/>
             </w:tabs>
-            <w:bidi w:val="0"/>
-            <w:jc w:val="start"/>
             <w:rPr/>
           </w:pPr>
-          <w:r>
-            <w:rPr/>
-            <w:t>6. Considerations</w:t>
-            <w:tab/>
-            <w:t>4</w:t>
-          </w:r>
+          <w:hyperlink w:anchor="__RefHeading___Toc1659_1349472584" w:tooltip="6. Considerations">
+            <w:r>
+              <w:rPr>
+                <w:rStyle w:val="IndexLink"/>
+              </w:rPr>
+              <w:t>6. Considerations</w:t>
+              <w:tab/>
+              <w:t>4</w:t>
+            </w:r>
+          </w:hyperlink>
         </w:p>
         <w:p>
           <w:pPr>
@@ -381,16 +386,18 @@
               <w:tab w:val="clear" w:pos="9972"/>
               <w:tab w:val="right" w:pos="9971" w:leader="dot"/>
             </w:tabs>
-            <w:bidi w:val="0"/>
-            <w:jc w:val="start"/>
             <w:rPr/>
           </w:pPr>
-          <w:r>
-            <w:rPr/>
-            <w:t>7. Specific Exclusion from Project Scope</w:t>
-            <w:tab/>
-            <w:t>5</w:t>
-          </w:r>
+          <w:hyperlink w:anchor="__RefHeading___Toc1661_1349472584" w:tooltip="7. Specific Exclusion from Project Scope">
+            <w:r>
+              <w:rPr>
+                <w:rStyle w:val="IndexLink"/>
+              </w:rPr>
+              <w:t>7. Specific Exclusion from Project Scope</w:t>
+              <w:tab/>
+              <w:t>4</w:t>
+            </w:r>
+          </w:hyperlink>
         </w:p>
         <w:p>
           <w:pPr>
@@ -399,16 +406,18 @@
               <w:tab w:val="clear" w:pos="9972"/>
               <w:tab w:val="right" w:pos="9971" w:leader="dot"/>
             </w:tabs>
-            <w:bidi w:val="0"/>
-            <w:jc w:val="start"/>
             <w:rPr/>
           </w:pPr>
-          <w:r>
-            <w:rPr/>
-            <w:t>8. Dependencies and Technologies</w:t>
-            <w:tab/>
-            <w:t>6</w:t>
-          </w:r>
+          <w:hyperlink w:anchor="__RefHeading___Toc1663_1349472584" w:tooltip="8. Dependencies and Technologies">
+            <w:r>
+              <w:rPr>
+                <w:rStyle w:val="IndexLink"/>
+              </w:rPr>
+              <w:t>8. Dependencies and Technologies</w:t>
+              <w:tab/>
+              <w:t>5</w:t>
+            </w:r>
+          </w:hyperlink>
         </w:p>
         <w:p>
           <w:pPr>
@@ -417,16 +426,18 @@
               <w:tab w:val="clear" w:pos="9972"/>
               <w:tab w:val="right" w:pos="9971" w:leader="dot"/>
             </w:tabs>
-            <w:bidi w:val="0"/>
-            <w:jc w:val="start"/>
             <w:rPr/>
           </w:pPr>
-          <w:r>
-            <w:rPr/>
-            <w:t>9. Assumptions</w:t>
-            <w:tab/>
-            <w:t>6</w:t>
-          </w:r>
+          <w:hyperlink w:anchor="__RefHeading___Toc1665_1349472584" w:tooltip="9. Assumptions">
+            <w:r>
+              <w:rPr>
+                <w:rStyle w:val="IndexLink"/>
+              </w:rPr>
+              <w:t>9. Assumptions</w:t>
+              <w:tab/>
+              <w:t>5</w:t>
+            </w:r>
+          </w:hyperlink>
         </w:p>
         <w:p>
           <w:pPr>
@@ -435,18 +446,22 @@
               <w:tab w:val="clear" w:pos="9972"/>
               <w:tab w:val="right" w:pos="9971" w:leader="dot"/>
             </w:tabs>
-            <w:bidi w:val="0"/>
-            <w:jc w:val="start"/>
             <w:rPr/>
           </w:pPr>
+          <w:hyperlink w:anchor="__RefHeading___Toc1667_1349472584" w:tooltip="10. Designs and Diagrams">
+            <w:r>
+              <w:rPr>
+                <w:rStyle w:val="IndexLink"/>
+              </w:rPr>
+              <w:t>10. Designs and Diagrams</w:t>
+              <w:tab/>
+              <w:t>6</w:t>
+            </w:r>
+          </w:hyperlink>
           <w:r>
-            <w:rPr/>
-            <w:t>10. Designs and Diagrams</w:t>
-            <w:tab/>
-            <w:t>7</w:t>
-          </w:r>
-          <w:r>
-            <w:rPr/>
+            <w:rPr>
+              <w:rStyle w:val="IndexLink"/>
+            </w:rPr>
             <w:fldChar w:fldCharType="end"/>
           </w:r>
         </w:p>
@@ -745,23 +760,7 @@
       </w:pPr>
       <w:r>
         <w:rPr/>
-        <w:t xml:space="preserve">A system that </w:t>
-      </w:r>
-      <w:r>
-        <w:rPr/>
-        <w:t>search</w:t>
-      </w:r>
-      <w:r>
-        <w:rPr/>
-        <w:t xml:space="preserve"> the items by </w:t>
-      </w:r>
-      <w:r>
-        <w:rPr/>
-        <w:t>room, floor,</w:t>
-      </w:r>
-      <w:r>
-        <w:rPr/>
-        <w:t xml:space="preserve"> and categories</w:t>
+        <w:t>A system that search the items by room, floor, and categories</w:t>
       </w:r>
     </w:p>
     <w:p>
@@ -777,11 +776,7 @@
       </w:pPr>
       <w:r>
         <w:rPr/>
-        <w:t xml:space="preserve">A system that create, update, or delete the items, </w:t>
-      </w:r>
-      <w:r>
-        <w:rPr/>
-        <w:t>categories, or locations</w:t>
+        <w:t>A system that create, update, or delete the items, categories, or locations</w:t>
       </w:r>
     </w:p>
     <w:p>
@@ -883,27 +878,7 @@
       </w:pPr>
       <w:r>
         <w:rPr/>
-        <w:t xml:space="preserve">InventBox </w:t>
-      </w:r>
-      <w:r>
-        <w:rPr/>
-        <w:t>Core</w:t>
-      </w:r>
-      <w:r>
-        <w:rPr/>
-        <w:t xml:space="preserve"> – The </w:t>
-      </w:r>
-      <w:r>
-        <w:rPr/>
-        <w:t>core</w:t>
-      </w:r>
-      <w:r>
-        <w:rPr/>
-        <w:t xml:space="preserve"> layer that manage the data on the </w:t>
-      </w:r>
-      <w:r>
-        <w:rPr/>
-        <w:t>application along with other functionality like transferring data, barcode scanner, or other.</w:t>
+        <w:t>InventBox Core – The core layer that manage the data on the application along with other functionality like transferring data, barcode scanner, or other.</w:t>
       </w:r>
     </w:p>
     <w:p>
@@ -1067,15 +1042,7 @@
             </w:pPr>
             <w:r>
               <w:rPr/>
-              <w:t xml:space="preserve">User can create items into a inventory manually </w:t>
-            </w:r>
-            <w:r>
-              <w:rPr/>
-              <w:t>with category and locations</w:t>
-            </w:r>
-            <w:r>
-              <w:rPr/>
-              <w:t>.</w:t>
+              <w:t>User can create items into a inventory manually with category and locations.</w:t>
             </w:r>
           </w:p>
         </w:tc>
@@ -1097,11 +1064,7 @@
             </w:pPr>
             <w:r>
               <w:rPr/>
-              <w:t xml:space="preserve">Examine the </w:t>
-            </w:r>
-            <w:r>
-              <w:rPr/>
-              <w:t>item’s metadata for information.</w:t>
+              <w:t>Examine the item’s metadata for information.</w:t>
             </w:r>
           </w:p>
         </w:tc>
@@ -1699,19 +1662,7 @@
             </w:pPr>
             <w:r>
               <w:rPr/>
-              <w:t xml:space="preserve">User can </w:t>
-            </w:r>
-            <w:r>
-              <w:rPr/>
-              <w:t>search</w:t>
-            </w:r>
-            <w:r>
-              <w:rPr/>
-              <w:t xml:space="preserve"> through the items with specific information </w:t>
-            </w:r>
-            <w:r>
-              <w:rPr/>
-              <w:t>like categories or locations.</w:t>
+              <w:t>User can search through the items with specific information like categories or locations.</w:t>
             </w:r>
           </w:p>
         </w:tc>
@@ -1732,27 +1683,7 @@
             </w:pPr>
             <w:r>
               <w:rPr/>
-              <w:t xml:space="preserve">As a user, I want to </w:t>
-            </w:r>
-            <w:r>
-              <w:rPr/>
-              <w:t>search</w:t>
-            </w:r>
-            <w:r>
-              <w:rPr/>
-              <w:t xml:space="preserve"> the items </w:t>
-            </w:r>
-            <w:r>
-              <w:rPr/>
-              <w:t xml:space="preserve">from categories or locations </w:t>
-            </w:r>
-            <w:r>
-              <w:rPr/>
-              <w:t xml:space="preserve">so I can go through the items </w:t>
-            </w:r>
-            <w:r>
-              <w:rPr/>
-              <w:t>with those information.</w:t>
+              <w:t>As a user, I want to search the items from categories or locations so I can go through the items with those information.</w:t>
             </w:r>
           </w:p>
         </w:tc>
@@ -2283,14 +2214,7 @@
           <w:sz w:val="24"/>
           <w:szCs w:val="24"/>
         </w:rPr>
-        <w:t xml:space="preserve">Self Hosting </w:t>
-      </w:r>
-      <w:r>
-        <w:rPr>
-          <w:sz w:val="24"/>
-          <w:szCs w:val="24"/>
-        </w:rPr>
-        <w:t>options</w:t>
+        <w:t>Self Hosting options</w:t>
       </w:r>
     </w:p>
     <w:p>
@@ -2629,8 +2553,19 @@
       </w:pPr>
       <w:r>
         <w:rPr/>
+      </w:r>
+    </w:p>
+    <w:p>
+      <w:pPr>
+        <w:pStyle w:val="Normal"/>
+        <w:bidi w:val="0"/>
+        <w:jc w:val="center"/>
+        <w:rPr/>
+      </w:pPr>
+      <w:r>
+        <w:rPr/>
         <w:drawing>
-          <wp:anchor distT="0" distB="0" distL="0" distR="0" simplePos="0" relativeHeight="2" behindDoc="0" locked="0" layoutInCell="0" allowOverlap="0">
+          <wp:anchor distT="0" distB="0" distL="0" distR="0" simplePos="0" relativeHeight="3" behindDoc="0" locked="0" layoutInCell="0" allowOverlap="1">
             <wp:simplePos x="0" y="0"/>
             <wp:positionH relativeFrom="column">
               <wp:align>center</wp:align>
@@ -2638,9 +2573,9 @@
             <wp:positionV relativeFrom="paragraph">
               <wp:posOffset>635</wp:posOffset>
             </wp:positionV>
-            <wp:extent cx="4782185" cy="3684905"/>
+            <wp:extent cx="6332220" cy="4276725"/>
             <wp:effectExtent l="0" t="0" r="0" b="0"/>
-            <wp:wrapTopAndBottom/>
+            <wp:wrapSquare wrapText="largest"/>
             <wp:docPr id="1" name="Image1"/>
             <wp:cNvGraphicFramePr>
               <a:graphicFrameLocks xmlns:a="http://schemas.openxmlformats.org/drawingml/2006/main" noChangeAspect="1"/>
@@ -2663,7 +2598,7 @@
                   <pic:spPr bwMode="auto">
                     <a:xfrm>
                       <a:off x="0" y="0"/>
-                      <a:ext cx="4782185" cy="3684905"/>
+                      <a:ext cx="6332220" cy="4276725"/>
                     </a:xfrm>
                     <a:prstGeom prst="rect">
                       <a:avLst/>
@@ -2686,8 +2621,41 @@
       </w:pPr>
       <w:r>
         <w:rPr/>
+      </w:r>
+    </w:p>
+    <w:p>
+      <w:pPr>
+        <w:pStyle w:val="Normal"/>
+        <w:bidi w:val="0"/>
+        <w:jc w:val="center"/>
+        <w:rPr/>
+      </w:pPr>
+      <w:r>
+        <w:rPr/>
+      </w:r>
+    </w:p>
+    <w:p>
+      <w:pPr>
+        <w:pStyle w:val="Normal"/>
+        <w:bidi w:val="0"/>
+        <w:jc w:val="center"/>
+        <w:rPr/>
+      </w:pPr>
+      <w:r>
+        <w:rPr/>
+      </w:r>
+    </w:p>
+    <w:p>
+      <w:pPr>
+        <w:pStyle w:val="Normal"/>
+        <w:bidi w:val="0"/>
+        <w:jc w:val="center"/>
+        <w:rPr/>
+      </w:pPr>
+      <w:r>
+        <w:rPr/>
         <w:drawing>
-          <wp:anchor distT="0" distB="0" distL="0" distR="0" simplePos="0" relativeHeight="3" behindDoc="0" locked="0" layoutInCell="0" allowOverlap="0">
+          <wp:anchor distT="0" distB="0" distL="0" distR="0" simplePos="0" relativeHeight="4" behindDoc="0" locked="0" layoutInCell="0" allowOverlap="1">
             <wp:simplePos x="0" y="0"/>
             <wp:positionH relativeFrom="column">
               <wp:align>center</wp:align>
@@ -2695,9 +2663,9 @@
             <wp:positionV relativeFrom="paragraph">
               <wp:posOffset>635</wp:posOffset>
             </wp:positionV>
-            <wp:extent cx="4763770" cy="3684905"/>
+            <wp:extent cx="6332220" cy="4276725"/>
             <wp:effectExtent l="0" t="0" r="0" b="0"/>
-            <wp:wrapTopAndBottom/>
+            <wp:wrapSquare wrapText="largest"/>
             <wp:docPr id="2" name="Image2"/>
             <wp:cNvGraphicFramePr>
               <a:graphicFrameLocks xmlns:a="http://schemas.openxmlformats.org/drawingml/2006/main" noChangeAspect="1"/>
@@ -2720,7 +2688,7 @@
                   <pic:spPr bwMode="auto">
                     <a:xfrm>
                       <a:off x="0" y="0"/>
-                      <a:ext cx="4763770" cy="3684905"/>
+                      <a:ext cx="6332220" cy="4276725"/>
                     </a:xfrm>
                     <a:prstGeom prst="rect">
                       <a:avLst/>
@@ -2755,7 +2723,7 @@
       <w:r>
         <w:rPr/>
         <w:drawing>
-          <wp:anchor distT="0" distB="0" distL="0" distR="0" simplePos="0" relativeHeight="4" behindDoc="0" locked="0" layoutInCell="0" allowOverlap="0">
+          <wp:anchor distT="0" distB="0" distL="0" distR="0" simplePos="0" relativeHeight="5" behindDoc="0" locked="0" layoutInCell="0" allowOverlap="1">
             <wp:simplePos x="0" y="0"/>
             <wp:positionH relativeFrom="column">
               <wp:align>center</wp:align>
@@ -2763,9 +2731,9 @@
             <wp:positionV relativeFrom="paragraph">
               <wp:posOffset>635</wp:posOffset>
             </wp:positionV>
-            <wp:extent cx="4599305" cy="3684905"/>
+            <wp:extent cx="6332220" cy="4276725"/>
             <wp:effectExtent l="0" t="0" r="0" b="0"/>
-            <wp:wrapTopAndBottom/>
+            <wp:wrapSquare wrapText="largest"/>
             <wp:docPr id="3" name="Image3"/>
             <wp:cNvGraphicFramePr>
               <a:graphicFrameLocks xmlns:a="http://schemas.openxmlformats.org/drawingml/2006/main" noChangeAspect="1"/>
@@ -2788,7 +2756,7 @@
                   <pic:spPr bwMode="auto">
                     <a:xfrm>
                       <a:off x="0" y="0"/>
-                      <a:ext cx="4599305" cy="3684905"/>
+                      <a:ext cx="6332220" cy="4276725"/>
                     </a:xfrm>
                     <a:prstGeom prst="rect">
                       <a:avLst/>
@@ -2811,8 +2779,53 @@
       </w:pPr>
       <w:r>
         <w:rPr/>
+      </w:r>
+    </w:p>
+    <w:p>
+      <w:pPr>
+        <w:pStyle w:val="Normal"/>
+        <w:bidi w:val="0"/>
+        <w:jc w:val="center"/>
+        <w:rPr/>
+      </w:pPr>
+      <w:r>
+        <w:rPr/>
+      </w:r>
+    </w:p>
+    <w:p>
+      <w:pPr>
+        <w:pStyle w:val="Normal"/>
+        <w:bidi w:val="0"/>
+        <w:jc w:val="center"/>
+        <w:rPr/>
+      </w:pPr>
+      <w:r>
+        <w:rPr/>
+        <w:t>InventBox Entity Relationship Diagram</w:t>
+      </w:r>
+    </w:p>
+    <w:p>
+      <w:pPr>
+        <w:pStyle w:val="Normal"/>
+        <w:bidi w:val="0"/>
+        <w:jc w:val="center"/>
+        <w:rPr/>
+      </w:pPr>
+      <w:r>
+        <w:rPr/>
+      </w:r>
+    </w:p>
+    <w:p>
+      <w:pPr>
+        <w:pStyle w:val="Normal"/>
+        <w:bidi w:val="0"/>
+        <w:jc w:val="center"/>
+        <w:rPr/>
+      </w:pPr>
+      <w:r>
+        <w:rPr/>
         <w:drawing>
-          <wp:anchor distT="0" distB="0" distL="0" distR="0" simplePos="0" relativeHeight="5" behindDoc="0" locked="0" layoutInCell="0" allowOverlap="0">
+          <wp:anchor distT="0" distB="0" distL="0" distR="0" simplePos="0" relativeHeight="2" behindDoc="0" locked="0" layoutInCell="0" allowOverlap="1">
             <wp:simplePos x="0" y="0"/>
             <wp:positionH relativeFrom="column">
               <wp:align>center</wp:align>
@@ -2823,7 +2836,7 @@
             <wp:extent cx="4599305" cy="3684905"/>
             <wp:effectExtent l="0" t="0" r="0" b="0"/>
             <wp:wrapTopAndBottom/>
-            <wp:docPr id="4" name="Image4"/>
+            <wp:docPr id="4" name="Image6"/>
             <wp:cNvGraphicFramePr>
               <a:graphicFrameLocks xmlns:a="http://schemas.openxmlformats.org/drawingml/2006/main" noChangeAspect="1"/>
             </wp:cNvGraphicFramePr>
@@ -2831,7 +2844,7 @@
               <a:graphicData uri="http://schemas.openxmlformats.org/drawingml/2006/picture">
                 <pic:pic xmlns:pic="http://schemas.openxmlformats.org/drawingml/2006/picture">
                   <pic:nvPicPr>
-                    <pic:cNvPr id="4" name="Image4"/>
+                    <pic:cNvPr id="4" name="Image6"/>
                     <pic:cNvPicPr>
                       <a:picLocks noChangeAspect="1" noChangeArrowheads="1"/>
                     </pic:cNvPicPr>
@@ -2859,147 +2872,10 @@
         </w:drawing>
       </w:r>
     </w:p>
-    <w:p>
-      <w:pPr>
-        <w:pStyle w:val="Normal"/>
-        <w:bidi w:val="0"/>
-        <w:jc w:val="center"/>
-        <w:rPr/>
-      </w:pPr>
-      <w:r>
-        <w:rPr/>
-        <w:drawing>
-          <wp:anchor distT="0" distB="0" distL="0" distR="0" simplePos="0" relativeHeight="6" behindDoc="0" locked="0" layoutInCell="0" allowOverlap="0">
-            <wp:simplePos x="0" y="0"/>
-            <wp:positionH relativeFrom="column">
-              <wp:align>center</wp:align>
-            </wp:positionH>
-            <wp:positionV relativeFrom="paragraph">
-              <wp:posOffset>635</wp:posOffset>
-            </wp:positionV>
-            <wp:extent cx="4599305" cy="3684905"/>
-            <wp:effectExtent l="0" t="0" r="0" b="0"/>
-            <wp:wrapTopAndBottom/>
-            <wp:docPr id="5" name="Image5"/>
-            <wp:cNvGraphicFramePr>
-              <a:graphicFrameLocks xmlns:a="http://schemas.openxmlformats.org/drawingml/2006/main" noChangeAspect="1"/>
-            </wp:cNvGraphicFramePr>
-            <a:graphic xmlns:a="http://schemas.openxmlformats.org/drawingml/2006/main">
-              <a:graphicData uri="http://schemas.openxmlformats.org/drawingml/2006/picture">
-                <pic:pic xmlns:pic="http://schemas.openxmlformats.org/drawingml/2006/picture">
-                  <pic:nvPicPr>
-                    <pic:cNvPr id="5" name="Image5"/>
-                    <pic:cNvPicPr>
-                      <a:picLocks noChangeAspect="1" noChangeArrowheads="1"/>
-                    </pic:cNvPicPr>
-                  </pic:nvPicPr>
-                  <pic:blipFill>
-                    <a:blip r:embed="rId6"/>
-                    <a:stretch>
-                      <a:fillRect/>
-                    </a:stretch>
-                  </pic:blipFill>
-                  <pic:spPr bwMode="auto">
-                    <a:xfrm>
-                      <a:off x="0" y="0"/>
-                      <a:ext cx="4599305" cy="3684905"/>
-                    </a:xfrm>
-                    <a:prstGeom prst="rect">
-                      <a:avLst/>
-                    </a:prstGeom>
-                    <a:noFill/>
-                  </pic:spPr>
-                </pic:pic>
-              </a:graphicData>
-            </a:graphic>
-          </wp:anchor>
-        </w:drawing>
-      </w:r>
-    </w:p>
-    <w:p>
-      <w:pPr>
-        <w:pStyle w:val="Normal"/>
-        <w:bidi w:val="0"/>
-        <w:jc w:val="center"/>
-        <w:rPr/>
-      </w:pPr>
-      <w:r>
-        <w:rPr/>
-        <w:t>InventBox Entity Relationship Diagram</w:t>
-      </w:r>
-    </w:p>
-    <w:p>
-      <w:pPr>
-        <w:pStyle w:val="Normal"/>
-        <w:bidi w:val="0"/>
-        <w:jc w:val="center"/>
-        <w:rPr/>
-      </w:pPr>
-      <w:r>
-        <w:rPr/>
-      </w:r>
-    </w:p>
-    <w:p>
-      <w:pPr>
-        <w:pStyle w:val="Normal"/>
-        <w:bidi w:val="0"/>
-        <w:jc w:val="center"/>
-        <w:rPr/>
-      </w:pPr>
-      <w:r>
-        <w:rPr/>
-        <w:drawing>
-          <wp:anchor distT="0" distB="0" distL="0" distR="0" simplePos="0" relativeHeight="7" behindDoc="0" locked="0" layoutInCell="0" allowOverlap="1">
-            <wp:simplePos x="0" y="0"/>
-            <wp:positionH relativeFrom="column">
-              <wp:align>center</wp:align>
-            </wp:positionH>
-            <wp:positionV relativeFrom="paragraph">
-              <wp:posOffset>635</wp:posOffset>
-            </wp:positionV>
-            <wp:extent cx="4599305" cy="3684905"/>
-            <wp:effectExtent l="0" t="0" r="0" b="0"/>
-            <wp:wrapTopAndBottom/>
-            <wp:docPr id="6" name="Image6"/>
-            <wp:cNvGraphicFramePr>
-              <a:graphicFrameLocks xmlns:a="http://schemas.openxmlformats.org/drawingml/2006/main" noChangeAspect="1"/>
-            </wp:cNvGraphicFramePr>
-            <a:graphic xmlns:a="http://schemas.openxmlformats.org/drawingml/2006/main">
-              <a:graphicData uri="http://schemas.openxmlformats.org/drawingml/2006/picture">
-                <pic:pic xmlns:pic="http://schemas.openxmlformats.org/drawingml/2006/picture">
-                  <pic:nvPicPr>
-                    <pic:cNvPr id="6" name="Image6"/>
-                    <pic:cNvPicPr>
-                      <a:picLocks noChangeAspect="1" noChangeArrowheads="1"/>
-                    </pic:cNvPicPr>
-                  </pic:nvPicPr>
-                  <pic:blipFill>
-                    <a:blip r:embed="rId7"/>
-                    <a:stretch>
-                      <a:fillRect/>
-                    </a:stretch>
-                  </pic:blipFill>
-                  <pic:spPr bwMode="auto">
-                    <a:xfrm>
-                      <a:off x="0" y="0"/>
-                      <a:ext cx="4599305" cy="3684905"/>
-                    </a:xfrm>
-                    <a:prstGeom prst="rect">
-                      <a:avLst/>
-                    </a:prstGeom>
-                    <a:noFill/>
-                  </pic:spPr>
-                </pic:pic>
-              </a:graphicData>
-            </a:graphic>
-          </wp:anchor>
-        </w:drawing>
-      </w:r>
-    </w:p>
     <w:sectPr>
-      <w:headerReference w:type="even" r:id="rId8"/>
-      <w:headerReference w:type="default" r:id="rId9"/>
-      <w:headerReference w:type="first" r:id="rId10"/>
+      <w:headerReference w:type="even" r:id="rId6"/>
+      <w:headerReference w:type="default" r:id="rId7"/>
+      <w:headerReference w:type="first" r:id="rId8"/>
       <w:type w:val="nextPage"/>
       <w:pgSz w:w="12240" w:h="15840"/>
       <w:pgMar w:left="1134" w:right="1134" w:gutter="0" w:header="1134" w:top="1693" w:footer="0" w:bottom="1134"/>
@@ -3050,7 +2926,7 @@
     </w:r>
     <w:r>
       <w:rPr/>
-      <w:t>8</w:t>
+      <w:t>9</w:t>
     </w:r>
     <w:r>
       <w:rPr/>
@@ -3085,7 +2961,7 @@
     </w:r>
     <w:r>
       <w:rPr/>
-      <w:t>8</w:t>
+      <w:t>9</w:t>
     </w:r>
     <w:r>
       <w:rPr/>
@@ -4078,7 +3954,7 @@
     <w:pPr>
       <w:widowControl/>
       <w:suppressAutoHyphens w:val="true"/>
-      <w:overflowPunct w:val="true"/>
+      <w:overflowPunct w:val="false"/>
       <w:bidi w:val="0"/>
       <w:spacing w:before="0" w:after="0"/>
       <w:jc w:val="start"/>
@@ -4144,8 +4020,8 @@
     <w:qFormat/>
     <w:rPr/>
   </w:style>
-  <w:style w:type="character" w:styleId="Bullets">
-    <w:name w:val="Bullets"/>
+  <w:style w:type="character" w:styleId="Bulletsuser">
+    <w:name w:val="Bullets (user)"/>
     <w:qFormat/>
     <w:rPr>
       <w:rFonts w:ascii="OpenSymbol" w:hAnsi="OpenSymbol" w:eastAsia="OpenSymbol" w:cs="OpenSymbol"/>
@@ -4226,8 +4102,8 @@
       <w:szCs w:val="12"/>
     </w:rPr>
   </w:style>
-  <w:style w:type="paragraph" w:styleId="FrameContents">
-    <w:name w:val="Frame Contents"/>
+  <w:style w:type="paragraph" w:styleId="FrameContentsuser">
+    <w:name w:val="Frame Contents (user)"/>
     <w:basedOn w:val="Normal"/>
     <w:qFormat/>
     <w:pPr/>

</xml_diff>

<commit_message>
Added the testing notes to the projects
</commit_message>
<xml_diff>
--- a/Documentations/SRS.docx
+++ b/Documentations/SRS.docx
@@ -395,7 +395,7 @@
               </w:rPr>
               <w:t>7. Specific Exclusion from Project Scope</w:t>
               <w:tab/>
-              <w:t>4</w:t>
+              <w:t>5</w:t>
             </w:r>
           </w:hyperlink>
         </w:p>
@@ -1919,6 +1919,142 @@
           </w:p>
         </w:tc>
       </w:tr>
+      <w:tr>
+        <w:trPr/>
+        <w:tc>
+          <w:tcPr>
+            <w:tcW w:w="3324" w:type="dxa"/>
+            <w:tcBorders>
+              <w:start w:val="single" w:sz="4" w:space="0" w:color="000000"/>
+              <w:bottom w:val="single" w:sz="4" w:space="0" w:color="000000"/>
+            </w:tcBorders>
+          </w:tcPr>
+          <w:p>
+            <w:pPr>
+              <w:pStyle w:val="TableContents"/>
+              <w:bidi w:val="0"/>
+              <w:jc w:val="start"/>
+              <w:rPr/>
+            </w:pPr>
+            <w:r>
+              <w:rPr/>
+              <w:t>User can upload the image to the items in the inventory</w:t>
+            </w:r>
+          </w:p>
+        </w:tc>
+        <w:tc>
+          <w:tcPr>
+            <w:tcW w:w="3324" w:type="dxa"/>
+            <w:tcBorders>
+              <w:start w:val="single" w:sz="4" w:space="0" w:color="000000"/>
+              <w:bottom w:val="single" w:sz="4" w:space="0" w:color="000000"/>
+            </w:tcBorders>
+          </w:tcPr>
+          <w:p>
+            <w:pPr>
+              <w:pStyle w:val="TableContents"/>
+              <w:bidi w:val="0"/>
+              <w:jc w:val="start"/>
+              <w:rPr/>
+            </w:pPr>
+            <w:r>
+              <w:rPr/>
+              <w:t>As a user, I want to be able to upload the image into the inventory so I can see the picture as well as the information behind the image.</w:t>
+            </w:r>
+          </w:p>
+        </w:tc>
+        <w:tc>
+          <w:tcPr>
+            <w:tcW w:w="3324" w:type="dxa"/>
+            <w:tcBorders>
+              <w:start w:val="single" w:sz="4" w:space="0" w:color="000000"/>
+              <w:bottom w:val="single" w:sz="4" w:space="0" w:color="000000"/>
+              <w:end w:val="single" w:sz="4" w:space="0" w:color="000000"/>
+            </w:tcBorders>
+          </w:tcPr>
+          <w:p>
+            <w:pPr>
+              <w:pStyle w:val="TableContents"/>
+              <w:widowControl w:val="false"/>
+              <w:suppressLineNumbers/>
+              <w:bidi w:val="0"/>
+              <w:jc w:val="start"/>
+              <w:rPr/>
+            </w:pPr>
+            <w:r>
+              <w:rPr/>
+            </w:r>
+          </w:p>
+        </w:tc>
+      </w:tr>
+      <w:tr>
+        <w:trPr/>
+        <w:tc>
+          <w:tcPr>
+            <w:tcW w:w="3324" w:type="dxa"/>
+            <w:tcBorders>
+              <w:start w:val="single" w:sz="4" w:space="0" w:color="000000"/>
+              <w:bottom w:val="single" w:sz="4" w:space="0" w:color="000000"/>
+            </w:tcBorders>
+          </w:tcPr>
+          <w:p>
+            <w:pPr>
+              <w:pStyle w:val="TableContents"/>
+              <w:bidi w:val="0"/>
+              <w:jc w:val="start"/>
+              <w:rPr/>
+            </w:pPr>
+            <w:r>
+              <w:rPr/>
+              <w:t>User can copy and paste the information from either the inventories section, categories section, or locations section with a right click function.</w:t>
+            </w:r>
+          </w:p>
+        </w:tc>
+        <w:tc>
+          <w:tcPr>
+            <w:tcW w:w="3324" w:type="dxa"/>
+            <w:tcBorders>
+              <w:start w:val="single" w:sz="4" w:space="0" w:color="000000"/>
+              <w:bottom w:val="single" w:sz="4" w:space="0" w:color="000000"/>
+            </w:tcBorders>
+          </w:tcPr>
+          <w:p>
+            <w:pPr>
+              <w:pStyle w:val="TableContents"/>
+              <w:bidi w:val="0"/>
+              <w:jc w:val="start"/>
+              <w:rPr/>
+            </w:pPr>
+            <w:r>
+              <w:rPr/>
+              <w:t>As a user, I want to be able to right click the selected items, categories, or locations so I can copy the information from the one that I selected and paste it elsewhere.</w:t>
+            </w:r>
+          </w:p>
+        </w:tc>
+        <w:tc>
+          <w:tcPr>
+            <w:tcW w:w="3324" w:type="dxa"/>
+            <w:tcBorders>
+              <w:start w:val="single" w:sz="4" w:space="0" w:color="000000"/>
+              <w:bottom w:val="single" w:sz="4" w:space="0" w:color="000000"/>
+              <w:end w:val="single" w:sz="4" w:space="0" w:color="000000"/>
+            </w:tcBorders>
+          </w:tcPr>
+          <w:p>
+            <w:pPr>
+              <w:pStyle w:val="TableContents"/>
+              <w:widowControl w:val="false"/>
+              <w:suppressLineNumbers/>
+              <w:bidi w:val="0"/>
+              <w:jc w:val="start"/>
+              <w:rPr/>
+            </w:pPr>
+            <w:r>
+              <w:rPr/>
+            </w:r>
+          </w:p>
+        </w:tc>
+      </w:tr>
     </w:tbl>
     <w:p>
       <w:pPr>
@@ -2479,31 +2615,6 @@
       <w:r>
         <w:rPr/>
         <w:t>The data from the bar code is accurate as technically possible.</w:t>
-      </w:r>
-    </w:p>
-    <w:p>
-      <w:pPr>
-        <w:pStyle w:val="Heading1"/>
-        <w:numPr>
-          <w:ilvl w:val="0"/>
-          <w:numId w:val="0"/>
-        </w:numPr>
-        <w:bidi w:val="0"/>
-        <w:ind w:hanging="0" w:start="0"/>
-        <w:jc w:val="start"/>
-        <w:rPr>
-          <w:sz w:val="24"/>
-          <w:szCs w:val="24"/>
-        </w:rPr>
-      </w:pPr>
-      <w:r>
-        <w:rPr>
-          <w:sz w:val="24"/>
-          <w:szCs w:val="24"/>
-        </w:rPr>
-      </w:r>
-      <w:r>
-        <w:br w:type="page"/>
       </w:r>
     </w:p>
     <w:p>
@@ -3954,7 +4065,7 @@
     <w:pPr>
       <w:widowControl/>
       <w:suppressAutoHyphens w:val="true"/>
-      <w:overflowPunct w:val="false"/>
+      <w:overflowPunct w:val="true"/>
       <w:bidi w:val="0"/>
       <w:spacing w:before="0" w:after="0"/>
       <w:jc w:val="start"/>
@@ -4020,8 +4131,8 @@
     <w:qFormat/>
     <w:rPr/>
   </w:style>
-  <w:style w:type="character" w:styleId="Bulletsuser">
-    <w:name w:val="Bullets (user)"/>
+  <w:style w:type="character" w:styleId="Bullets">
+    <w:name w:val="Bullets"/>
     <w:qFormat/>
     <w:rPr>
       <w:rFonts w:ascii="OpenSymbol" w:hAnsi="OpenSymbol" w:eastAsia="OpenSymbol" w:cs="OpenSymbol"/>
@@ -4102,8 +4213,8 @@
       <w:szCs w:val="12"/>
     </w:rPr>
   </w:style>
-  <w:style w:type="paragraph" w:styleId="FrameContentsuser">
-    <w:name w:val="Frame Contents (user)"/>
+  <w:style w:type="paragraph" w:styleId="FrameContents">
+    <w:name w:val="Frame Contents"/>
     <w:basedOn w:val="Normal"/>
     <w:qFormat/>
     <w:pPr/>

</xml_diff>

<commit_message>
Added the copy functionality from the application itself
</commit_message>
<xml_diff>
--- a/Documentations/SRS.docx
+++ b/Documentations/SRS.docx
@@ -268,16 +268,17 @@
             </w:rPr>
             <w:fldChar w:fldCharType="separate"/>
           </w:r>
-          <w:hyperlink w:anchor="__RefHeading___Toc1649_1349472584" w:tooltip="1. Project background and descriptions">
-            <w:r>
-              <w:rPr>
-                <w:rStyle w:val="IndexLink"/>
-              </w:rPr>
-              <w:t>1. Project background and descriptions</w:t>
-              <w:tab/>
-              <w:t>3</w:t>
-            </w:r>
-          </w:hyperlink>
+          <w:r>
+            <w:rPr>
+              <w:rStyle w:val="IndexLink"/>
+            </w:rPr>
+            <w:t>1. Project background and descriptions</w:t>
+          </w:r>
+          <w:r>
+            <w:rPr/>
+            <w:tab/>
+            <w:t>3</w:t>
+          </w:r>
         </w:p>
         <w:p>
           <w:pPr>
@@ -288,16 +289,12 @@
             </w:tabs>
             <w:rPr/>
           </w:pPr>
-          <w:hyperlink w:anchor="__RefHeading___Toc260_2378469445" w:tooltip="2. Project scope">
-            <w:r>
-              <w:rPr>
-                <w:rStyle w:val="IndexLink"/>
-              </w:rPr>
-              <w:t>2. Project scope</w:t>
-              <w:tab/>
-              <w:t>3</w:t>
-            </w:r>
-          </w:hyperlink>
+          <w:r>
+            <w:rPr/>
+            <w:t>2. Project scope</w:t>
+            <w:tab/>
+            <w:t>3</w:t>
+          </w:r>
         </w:p>
         <w:p>
           <w:pPr>
@@ -308,16 +305,12 @@
             </w:tabs>
             <w:rPr/>
           </w:pPr>
-          <w:hyperlink w:anchor="__RefHeading___Toc1653_1349472584" w:tooltip="3. High-level requirements">
-            <w:r>
-              <w:rPr>
-                <w:rStyle w:val="IndexLink"/>
-              </w:rPr>
-              <w:t>3. High-level requirements</w:t>
-              <w:tab/>
-              <w:t>3</w:t>
-            </w:r>
-          </w:hyperlink>
+          <w:r>
+            <w:rPr/>
+            <w:t>3. High-level requirements</w:t>
+            <w:tab/>
+            <w:t>3</w:t>
+          </w:r>
         </w:p>
         <w:p>
           <w:pPr>
@@ -328,16 +321,12 @@
             </w:tabs>
             <w:rPr/>
           </w:pPr>
-          <w:hyperlink w:anchor="__RefHeading___Toc1655_1349472584" w:tooltip="4. Entities">
-            <w:r>
-              <w:rPr>
-                <w:rStyle w:val="IndexLink"/>
-              </w:rPr>
-              <w:t>4. Entities</w:t>
-              <w:tab/>
-              <w:t>3</w:t>
-            </w:r>
-          </w:hyperlink>
+          <w:r>
+            <w:rPr/>
+            <w:t>4. Entities</w:t>
+            <w:tab/>
+            <w:t>3</w:t>
+          </w:r>
         </w:p>
         <w:p>
           <w:pPr>
@@ -348,16 +337,12 @@
             </w:tabs>
             <w:rPr/>
           </w:pPr>
-          <w:hyperlink w:anchor="__RefHeading___Toc1657_1349472584" w:tooltip="5. Success Metrics">
-            <w:r>
-              <w:rPr>
-                <w:rStyle w:val="IndexLink"/>
-              </w:rPr>
-              <w:t>5. Success Metrics</w:t>
-              <w:tab/>
-              <w:t>3</w:t>
-            </w:r>
-          </w:hyperlink>
+          <w:r>
+            <w:rPr/>
+            <w:t>5. Success Metrics</w:t>
+            <w:tab/>
+            <w:t>3</w:t>
+          </w:r>
         </w:p>
         <w:p>
           <w:pPr>
@@ -368,16 +353,12 @@
             </w:tabs>
             <w:rPr/>
           </w:pPr>
-          <w:hyperlink w:anchor="__RefHeading___Toc1659_1349472584" w:tooltip="6. Considerations">
-            <w:r>
-              <w:rPr>
-                <w:rStyle w:val="IndexLink"/>
-              </w:rPr>
-              <w:t>6. Considerations</w:t>
-              <w:tab/>
-              <w:t>4</w:t>
-            </w:r>
-          </w:hyperlink>
+          <w:r>
+            <w:rPr/>
+            <w:t>6. Considerations</w:t>
+            <w:tab/>
+            <w:t>4</w:t>
+          </w:r>
         </w:p>
         <w:p>
           <w:pPr>
@@ -388,16 +369,12 @@
             </w:tabs>
             <w:rPr/>
           </w:pPr>
-          <w:hyperlink w:anchor="__RefHeading___Toc1661_1349472584" w:tooltip="7. Specific Exclusion from Project Scope">
-            <w:r>
-              <w:rPr>
-                <w:rStyle w:val="IndexLink"/>
-              </w:rPr>
-              <w:t>7. Specific Exclusion from Project Scope</w:t>
-              <w:tab/>
-              <w:t>5</w:t>
-            </w:r>
-          </w:hyperlink>
+          <w:r>
+            <w:rPr/>
+            <w:t>7. Specific Exclusion from Project Scope</w:t>
+            <w:tab/>
+            <w:t>5</w:t>
+          </w:r>
         </w:p>
         <w:p>
           <w:pPr>
@@ -408,16 +385,12 @@
             </w:tabs>
             <w:rPr/>
           </w:pPr>
-          <w:hyperlink w:anchor="__RefHeading___Toc1663_1349472584" w:tooltip="8. Dependencies and Technologies">
-            <w:r>
-              <w:rPr>
-                <w:rStyle w:val="IndexLink"/>
-              </w:rPr>
-              <w:t>8. Dependencies and Technologies</w:t>
-              <w:tab/>
-              <w:t>5</w:t>
-            </w:r>
-          </w:hyperlink>
+          <w:r>
+            <w:rPr/>
+            <w:t>8. Dependencies and Technologies</w:t>
+            <w:tab/>
+            <w:t>5</w:t>
+          </w:r>
         </w:p>
         <w:p>
           <w:pPr>
@@ -428,16 +401,12 @@
             </w:tabs>
             <w:rPr/>
           </w:pPr>
-          <w:hyperlink w:anchor="__RefHeading___Toc1665_1349472584" w:tooltip="9. Assumptions">
-            <w:r>
-              <w:rPr>
-                <w:rStyle w:val="IndexLink"/>
-              </w:rPr>
-              <w:t>9. Assumptions</w:t>
-              <w:tab/>
-              <w:t>5</w:t>
-            </w:r>
-          </w:hyperlink>
+          <w:r>
+            <w:rPr/>
+            <w:t>9. Assumptions</w:t>
+            <w:tab/>
+            <w:t>5</w:t>
+          </w:r>
         </w:p>
         <w:p>
           <w:pPr>
@@ -448,20 +417,14 @@
             </w:tabs>
             <w:rPr/>
           </w:pPr>
-          <w:hyperlink w:anchor="__RefHeading___Toc1667_1349472584" w:tooltip="10. Designs and Diagrams">
-            <w:r>
-              <w:rPr>
-                <w:rStyle w:val="IndexLink"/>
-              </w:rPr>
-              <w:t>10. Designs and Diagrams</w:t>
-              <w:tab/>
-              <w:t>6</w:t>
-            </w:r>
-          </w:hyperlink>
           <w:r>
-            <w:rPr>
-              <w:rStyle w:val="IndexLink"/>
-            </w:rPr>
+            <w:rPr/>
+            <w:t>10. Designs and Diagrams</w:t>
+            <w:tab/>
+            <w:t>6</w:t>
+          </w:r>
+          <w:r>
+            <w:rPr/>
             <w:fldChar w:fldCharType="end"/>
           </w:r>
         </w:p>
@@ -2006,7 +1969,7 @@
             </w:pPr>
             <w:r>
               <w:rPr/>
-              <w:t>User can copy and paste the information from either the inventories section, categories section, or locations section with a right click function.</w:t>
+              <w:t>User can copy the information from either the inventories section, categories section, or locations section with a right click function.</w:t>
             </w:r>
           </w:p>
         </w:tc>
@@ -2051,6 +2014,7 @@
             </w:pPr>
             <w:r>
               <w:rPr/>
+              <w:t>Completed</w:t>
             </w:r>
           </w:p>
         </w:tc>

</xml_diff>

<commit_message>
Added a functionality to recover the data if the application crashed or if the user did not save the data
</commit_message>
<xml_diff>
--- a/Documentations/SRS.docx
+++ b/Documentations/SRS.docx
@@ -1901,74 +1901,6 @@
             </w:pPr>
             <w:r>
               <w:rPr/>
-              <w:t>User can upload the image to the items in the inventory</w:t>
-            </w:r>
-          </w:p>
-        </w:tc>
-        <w:tc>
-          <w:tcPr>
-            <w:tcW w:w="3324" w:type="dxa"/>
-            <w:tcBorders>
-              <w:start w:val="single" w:sz="4" w:space="0" w:color="000000"/>
-              <w:bottom w:val="single" w:sz="4" w:space="0" w:color="000000"/>
-            </w:tcBorders>
-          </w:tcPr>
-          <w:p>
-            <w:pPr>
-              <w:pStyle w:val="TableContents"/>
-              <w:bidi w:val="0"/>
-              <w:jc w:val="start"/>
-              <w:rPr/>
-            </w:pPr>
-            <w:r>
-              <w:rPr/>
-              <w:t>As a user, I want to be able to upload the image into the inventory so I can see the picture as well as the information behind the image.</w:t>
-            </w:r>
-          </w:p>
-        </w:tc>
-        <w:tc>
-          <w:tcPr>
-            <w:tcW w:w="3324" w:type="dxa"/>
-            <w:tcBorders>
-              <w:start w:val="single" w:sz="4" w:space="0" w:color="000000"/>
-              <w:bottom w:val="single" w:sz="4" w:space="0" w:color="000000"/>
-              <w:end w:val="single" w:sz="4" w:space="0" w:color="000000"/>
-            </w:tcBorders>
-          </w:tcPr>
-          <w:p>
-            <w:pPr>
-              <w:pStyle w:val="TableContents"/>
-              <w:widowControl w:val="false"/>
-              <w:suppressLineNumbers/>
-              <w:bidi w:val="0"/>
-              <w:jc w:val="start"/>
-              <w:rPr/>
-            </w:pPr>
-            <w:r>
-              <w:rPr/>
-            </w:r>
-          </w:p>
-        </w:tc>
-      </w:tr>
-      <w:tr>
-        <w:trPr/>
-        <w:tc>
-          <w:tcPr>
-            <w:tcW w:w="3324" w:type="dxa"/>
-            <w:tcBorders>
-              <w:start w:val="single" w:sz="4" w:space="0" w:color="000000"/>
-              <w:bottom w:val="single" w:sz="4" w:space="0" w:color="000000"/>
-            </w:tcBorders>
-          </w:tcPr>
-          <w:p>
-            <w:pPr>
-              <w:pStyle w:val="TableContents"/>
-              <w:bidi w:val="0"/>
-              <w:jc w:val="start"/>
-              <w:rPr/>
-            </w:pPr>
-            <w:r>
-              <w:rPr/>
               <w:t>User can copy the information from either the inventories section, categories section, or locations section with a right click function.</w:t>
             </w:r>
           </w:p>
@@ -2315,6 +2247,28 @@
           <w:szCs w:val="24"/>
         </w:rPr>
         <w:t>Self Hosting options</w:t>
+      </w:r>
+    </w:p>
+    <w:p>
+      <w:pPr>
+        <w:pStyle w:val="BodyText"/>
+        <w:numPr>
+          <w:ilvl w:val="0"/>
+          <w:numId w:val="5"/>
+        </w:numPr>
+        <w:bidi w:val="0"/>
+        <w:jc w:val="start"/>
+        <w:rPr>
+          <w:sz w:val="24"/>
+          <w:szCs w:val="24"/>
+        </w:rPr>
+      </w:pPr>
+      <w:r>
+        <w:rPr>
+          <w:sz w:val="24"/>
+          <w:szCs w:val="24"/>
+        </w:rPr>
+        <w:t>Image Support</w:t>
       </w:r>
     </w:p>
     <w:p>
@@ -4029,7 +3983,7 @@
     <w:pPr>
       <w:widowControl/>
       <w:suppressAutoHyphens w:val="true"/>
-      <w:overflowPunct w:val="true"/>
+      <w:overflowPunct w:val="false"/>
       <w:bidi w:val="0"/>
       <w:spacing w:before="0" w:after="0"/>
       <w:jc w:val="start"/>
@@ -4095,8 +4049,8 @@
     <w:qFormat/>
     <w:rPr/>
   </w:style>
-  <w:style w:type="character" w:styleId="Bullets">
-    <w:name w:val="Bullets"/>
+  <w:style w:type="character" w:styleId="Bulletsuser">
+    <w:name w:val="Bullets (user)"/>
     <w:qFormat/>
     <w:rPr>
       <w:rFonts w:ascii="OpenSymbol" w:hAnsi="OpenSymbol" w:eastAsia="OpenSymbol" w:cs="OpenSymbol"/>
@@ -4177,8 +4131,8 @@
       <w:szCs w:val="12"/>
     </w:rPr>
   </w:style>
-  <w:style w:type="paragraph" w:styleId="FrameContents">
-    <w:name w:val="Frame Contents"/>
+  <w:style w:type="paragraph" w:styleId="FrameContentsuser">
+    <w:name w:val="Frame Contents (user)"/>
     <w:basedOn w:val="Normal"/>
     <w:qFormat/>
     <w:pPr/>

</xml_diff>

<commit_message>
Added the detail for README.md, edited the design in SRS.docx, and fixed the build error in InventBox.Test
</commit_message>
<xml_diff>
--- a/Documentations/SRS.docx
+++ b/Documentations/SRS.docx
@@ -268,17 +268,16 @@
             </w:rPr>
             <w:fldChar w:fldCharType="separate"/>
           </w:r>
-          <w:r>
-            <w:rPr>
-              <w:rStyle w:val="IndexLink"/>
-            </w:rPr>
-            <w:t>1. Project background and descriptions</w:t>
-          </w:r>
-          <w:r>
-            <w:rPr/>
-            <w:tab/>
-            <w:t>3</w:t>
-          </w:r>
+          <w:hyperlink w:anchor="__RefHeading___Toc1649_1349472584" w:tooltip="1. Project background and descriptions">
+            <w:r>
+              <w:rPr>
+                <w:rStyle w:val="IndexLink"/>
+              </w:rPr>
+              <w:t>1. Project background and descriptions</w:t>
+              <w:tab/>
+              <w:t>3</w:t>
+            </w:r>
+          </w:hyperlink>
         </w:p>
         <w:p>
           <w:pPr>
@@ -289,12 +288,16 @@
             </w:tabs>
             <w:rPr/>
           </w:pPr>
-          <w:r>
-            <w:rPr/>
-            <w:t>2. Project scope</w:t>
-            <w:tab/>
-            <w:t>3</w:t>
-          </w:r>
+          <w:hyperlink w:anchor="__RefHeading___Toc260_2378469445" w:tooltip="2. Project scope">
+            <w:r>
+              <w:rPr>
+                <w:rStyle w:val="IndexLink"/>
+              </w:rPr>
+              <w:t>2. Project scope</w:t>
+              <w:tab/>
+              <w:t>3</w:t>
+            </w:r>
+          </w:hyperlink>
         </w:p>
         <w:p>
           <w:pPr>
@@ -305,12 +308,16 @@
             </w:tabs>
             <w:rPr/>
           </w:pPr>
-          <w:r>
-            <w:rPr/>
-            <w:t>3. High-level requirements</w:t>
-            <w:tab/>
-            <w:t>3</w:t>
-          </w:r>
+          <w:hyperlink w:anchor="__RefHeading___Toc1653_1349472584" w:tooltip="3. High-level requirements">
+            <w:r>
+              <w:rPr>
+                <w:rStyle w:val="IndexLink"/>
+              </w:rPr>
+              <w:t>3. High-level requirements</w:t>
+              <w:tab/>
+              <w:t>3</w:t>
+            </w:r>
+          </w:hyperlink>
         </w:p>
         <w:p>
           <w:pPr>
@@ -321,12 +328,16 @@
             </w:tabs>
             <w:rPr/>
           </w:pPr>
-          <w:r>
-            <w:rPr/>
-            <w:t>4. Entities</w:t>
-            <w:tab/>
-            <w:t>3</w:t>
-          </w:r>
+          <w:hyperlink w:anchor="__RefHeading___Toc1655_1349472584" w:tooltip="4. Entities">
+            <w:r>
+              <w:rPr>
+                <w:rStyle w:val="IndexLink"/>
+              </w:rPr>
+              <w:t>4. Entities</w:t>
+              <w:tab/>
+              <w:t>3</w:t>
+            </w:r>
+          </w:hyperlink>
         </w:p>
         <w:p>
           <w:pPr>
@@ -337,12 +348,16 @@
             </w:tabs>
             <w:rPr/>
           </w:pPr>
-          <w:r>
-            <w:rPr/>
-            <w:t>5. Success Metrics</w:t>
-            <w:tab/>
-            <w:t>3</w:t>
-          </w:r>
+          <w:hyperlink w:anchor="__RefHeading___Toc1657_1349472584" w:tooltip="5. Success Metrics">
+            <w:r>
+              <w:rPr>
+                <w:rStyle w:val="IndexLink"/>
+              </w:rPr>
+              <w:t>5. Success Metrics</w:t>
+              <w:tab/>
+              <w:t>3</w:t>
+            </w:r>
+          </w:hyperlink>
         </w:p>
         <w:p>
           <w:pPr>
@@ -353,12 +368,16 @@
             </w:tabs>
             <w:rPr/>
           </w:pPr>
-          <w:r>
-            <w:rPr/>
-            <w:t>6. Considerations</w:t>
-            <w:tab/>
-            <w:t>4</w:t>
-          </w:r>
+          <w:hyperlink w:anchor="__RefHeading___Toc1659_1349472584" w:tooltip="6. Considerations">
+            <w:r>
+              <w:rPr>
+                <w:rStyle w:val="IndexLink"/>
+              </w:rPr>
+              <w:t>6. Considerations</w:t>
+              <w:tab/>
+              <w:t>4</w:t>
+            </w:r>
+          </w:hyperlink>
         </w:p>
         <w:p>
           <w:pPr>
@@ -369,12 +388,16 @@
             </w:tabs>
             <w:rPr/>
           </w:pPr>
-          <w:r>
-            <w:rPr/>
-            <w:t>7. Specific Exclusion from Project Scope</w:t>
-            <w:tab/>
-            <w:t>5</w:t>
-          </w:r>
+          <w:hyperlink w:anchor="__RefHeading___Toc1661_1349472584" w:tooltip="7. Specific Exclusion from Project Scope">
+            <w:r>
+              <w:rPr>
+                <w:rStyle w:val="IndexLink"/>
+              </w:rPr>
+              <w:t>7. Specific Exclusion from Project Scope</w:t>
+              <w:tab/>
+              <w:t>5</w:t>
+            </w:r>
+          </w:hyperlink>
         </w:p>
         <w:p>
           <w:pPr>
@@ -385,12 +408,16 @@
             </w:tabs>
             <w:rPr/>
           </w:pPr>
-          <w:r>
-            <w:rPr/>
-            <w:t>8. Dependencies and Technologies</w:t>
-            <w:tab/>
-            <w:t>5</w:t>
-          </w:r>
+          <w:hyperlink w:anchor="__RefHeading___Toc1663_1349472584" w:tooltip="8. Dependencies and Technologies">
+            <w:r>
+              <w:rPr>
+                <w:rStyle w:val="IndexLink"/>
+              </w:rPr>
+              <w:t>8. Dependencies and Technologies</w:t>
+              <w:tab/>
+              <w:t>5</w:t>
+            </w:r>
+          </w:hyperlink>
         </w:p>
         <w:p>
           <w:pPr>
@@ -401,12 +428,16 @@
             </w:tabs>
             <w:rPr/>
           </w:pPr>
-          <w:r>
-            <w:rPr/>
-            <w:t>9. Assumptions</w:t>
-            <w:tab/>
-            <w:t>5</w:t>
-          </w:r>
+          <w:hyperlink w:anchor="__RefHeading___Toc1665_1349472584" w:tooltip="9. Assumptions">
+            <w:r>
+              <w:rPr>
+                <w:rStyle w:val="IndexLink"/>
+              </w:rPr>
+              <w:t>9. Assumptions</w:t>
+              <w:tab/>
+              <w:t>5</w:t>
+            </w:r>
+          </w:hyperlink>
         </w:p>
         <w:p>
           <w:pPr>
@@ -417,14 +448,20 @@
             </w:tabs>
             <w:rPr/>
           </w:pPr>
+          <w:hyperlink w:anchor="__RefHeading___Toc1667_1349472584" w:tooltip="10. Designs and Diagrams">
+            <w:r>
+              <w:rPr>
+                <w:rStyle w:val="IndexLink"/>
+              </w:rPr>
+              <w:t>10. Designs and Diagrams</w:t>
+              <w:tab/>
+              <w:t>5</w:t>
+            </w:r>
+          </w:hyperlink>
           <w:r>
-            <w:rPr/>
-            <w:t>10. Designs and Diagrams</w:t>
-            <w:tab/>
-            <w:t>6</w:t>
-          </w:r>
-          <w:r>
-            <w:rPr/>
+            <w:rPr>
+              <w:rStyle w:val="IndexLink"/>
+            </w:rPr>
             <w:fldChar w:fldCharType="end"/>
           </w:r>
         </w:p>
@@ -633,11 +670,7 @@
       <w:r>
         <w:rPr/>
         <w:tab/>
-        <w:t xml:space="preserve">InventBox was the inventory management that aims to create, delete, manage, or search the </w:t>
-        <w:tab/>
-        <w:t xml:space="preserve">inventory of items or part of the items and display them in an organized way with categories </w:t>
-        <w:tab/>
-        <w:t>and locations.</w:t>
+        <w:t>InventBox was the inventory management that aims to create, delete, manage, or search the inventory of items for the user’s home and display them in an organized way with categories and locations.</w:t>
       </w:r>
     </w:p>
     <w:p>
@@ -1051,7 +1084,7 @@
             </w:pPr>
             <w:r>
               <w:rPr/>
-              <w:t>User can create category manually to be added to items</w:t>
+              <w:t>User can create category manually to be added to items.</w:t>
             </w:r>
           </w:p>
         </w:tc>
@@ -1073,7 +1106,7 @@
             </w:pPr>
             <w:r>
               <w:rPr/>
-              <w:t>Examine the categories’ metadata for information</w:t>
+              <w:t>Examine the categories’ metadata for information.</w:t>
             </w:r>
           </w:p>
         </w:tc>
@@ -1119,7 +1152,7 @@
             </w:pPr>
             <w:r>
               <w:rPr/>
-              <w:t>Examine the locations’ metadata for information</w:t>
+              <w:t>Examine the locations’ metadata for information.</w:t>
             </w:r>
           </w:p>
         </w:tc>
@@ -1143,6 +1176,7 @@
             </w:pPr>
             <w:r>
               <w:rPr/>
+              <w:t>User can save and load the data from the file.</w:t>
             </w:r>
           </w:p>
         </w:tc>
@@ -1164,6 +1198,7 @@
             </w:pPr>
             <w:r>
               <w:rPr/>
+              <w:t>Examine the file’s metadata and content.</w:t>
             </w:r>
           </w:p>
         </w:tc>
@@ -2435,7 +2470,7 @@
       </w:pPr>
       <w:r>
         <w:rPr/>
-        <w:t>Moq</w:t>
+        <w:t>JSON</w:t>
       </w:r>
     </w:p>
     <w:p>
@@ -2594,7 +2629,7 @@
       <w:r>
         <w:rPr/>
         <w:drawing>
-          <wp:anchor distT="0" distB="0" distL="0" distR="0" simplePos="0" relativeHeight="3" behindDoc="0" locked="0" layoutInCell="0" allowOverlap="1">
+          <wp:anchor distT="0" distB="0" distL="0" distR="0" simplePos="0" relativeHeight="4" behindDoc="0" locked="0" layoutInCell="0" allowOverlap="1">
             <wp:simplePos x="0" y="0"/>
             <wp:positionH relativeFrom="column">
               <wp:align>center</wp:align>
@@ -2602,7 +2637,7 @@
             <wp:positionV relativeFrom="paragraph">
               <wp:posOffset>635</wp:posOffset>
             </wp:positionV>
-            <wp:extent cx="6332220" cy="4276725"/>
+            <wp:extent cx="6332220" cy="5356860"/>
             <wp:effectExtent l="0" t="0" r="0" b="0"/>
             <wp:wrapSquare wrapText="largest"/>
             <wp:docPr id="1" name="Image1"/>
@@ -2627,7 +2662,7 @@
                   <pic:spPr bwMode="auto">
                     <a:xfrm>
                       <a:off x="0" y="0"/>
-                      <a:ext cx="6332220" cy="4276725"/>
+                      <a:ext cx="6332220" cy="5356860"/>
                     </a:xfrm>
                     <a:prstGeom prst="rect">
                       <a:avLst/>
@@ -2683,8 +2718,30 @@
       </w:pPr>
       <w:r>
         <w:rPr/>
+      </w:r>
+    </w:p>
+    <w:p>
+      <w:pPr>
+        <w:pStyle w:val="Normal"/>
+        <w:bidi w:val="0"/>
+        <w:jc w:val="center"/>
+        <w:rPr/>
+      </w:pPr>
+      <w:r>
+        <w:rPr/>
+      </w:r>
+    </w:p>
+    <w:p>
+      <w:pPr>
+        <w:pStyle w:val="Normal"/>
+        <w:bidi w:val="0"/>
+        <w:jc w:val="center"/>
+        <w:rPr/>
+      </w:pPr>
+      <w:r>
+        <w:rPr/>
         <w:drawing>
-          <wp:anchor distT="0" distB="0" distL="0" distR="0" simplePos="0" relativeHeight="4" behindDoc="0" locked="0" layoutInCell="0" allowOverlap="1">
+          <wp:anchor distT="0" distB="0" distL="0" distR="0" simplePos="0" relativeHeight="3" behindDoc="0" locked="0" layoutInCell="0" allowOverlap="1">
             <wp:simplePos x="0" y="0"/>
             <wp:positionH relativeFrom="column">
               <wp:align>center</wp:align>
@@ -2694,8 +2751,8 @@
             </wp:positionV>
             <wp:extent cx="6332220" cy="4276725"/>
             <wp:effectExtent l="0" t="0" r="0" b="0"/>
-            <wp:wrapSquare wrapText="largest"/>
-            <wp:docPr id="2" name="Image2"/>
+            <wp:wrapTopAndBottom/>
+            <wp:docPr id="2" name="Image3"/>
             <wp:cNvGraphicFramePr>
               <a:graphicFrameLocks xmlns:a="http://schemas.openxmlformats.org/drawingml/2006/main" noChangeAspect="1"/>
             </wp:cNvGraphicFramePr>
@@ -2703,7 +2760,7 @@
               <a:graphicData uri="http://schemas.openxmlformats.org/drawingml/2006/picture">
                 <pic:pic xmlns:pic="http://schemas.openxmlformats.org/drawingml/2006/picture">
                   <pic:nvPicPr>
-                    <pic:cNvPr id="2" name="Image2"/>
+                    <pic:cNvPr id="2" name="Image3"/>
                     <pic:cNvPicPr>
                       <a:picLocks noChangeAspect="1" noChangeArrowheads="1"/>
                     </pic:cNvPicPr>
@@ -2751,6 +2808,17 @@
       </w:pPr>
       <w:r>
         <w:rPr/>
+      </w:r>
+    </w:p>
+    <w:p>
+      <w:pPr>
+        <w:pStyle w:val="Normal"/>
+        <w:bidi w:val="0"/>
+        <w:jc w:val="center"/>
+        <w:rPr/>
+      </w:pPr>
+      <w:r>
+        <w:rPr/>
         <w:drawing>
           <wp:anchor distT="0" distB="0" distL="0" distR="0" simplePos="0" relativeHeight="5" behindDoc="0" locked="0" layoutInCell="0" allowOverlap="1">
             <wp:simplePos x="0" y="0"/>
@@ -2760,10 +2828,10 @@
             <wp:positionV relativeFrom="paragraph">
               <wp:posOffset>635</wp:posOffset>
             </wp:positionV>
-            <wp:extent cx="6332220" cy="4276725"/>
+            <wp:extent cx="6332220" cy="5375910"/>
             <wp:effectExtent l="0" t="0" r="0" b="0"/>
             <wp:wrapSquare wrapText="largest"/>
-            <wp:docPr id="3" name="Image3"/>
+            <wp:docPr id="3" name="Image2"/>
             <wp:cNvGraphicFramePr>
               <a:graphicFrameLocks xmlns:a="http://schemas.openxmlformats.org/drawingml/2006/main" noChangeAspect="1"/>
             </wp:cNvGraphicFramePr>
@@ -2771,7 +2839,7 @@
               <a:graphicData uri="http://schemas.openxmlformats.org/drawingml/2006/picture">
                 <pic:pic xmlns:pic="http://schemas.openxmlformats.org/drawingml/2006/picture">
                   <pic:nvPicPr>
-                    <pic:cNvPr id="3" name="Image3"/>
+                    <pic:cNvPr id="3" name="Image2"/>
                     <pic:cNvPicPr>
                       <a:picLocks noChangeAspect="1" noChangeArrowheads="1"/>
                     </pic:cNvPicPr>
@@ -2785,7 +2853,7 @@
                   <pic:spPr bwMode="auto">
                     <a:xfrm>
                       <a:off x="0" y="0"/>
-                      <a:ext cx="6332220" cy="4276725"/>
+                      <a:ext cx="6332220" cy="5375910"/>
                     </a:xfrm>
                     <a:prstGeom prst="rect">
                       <a:avLst/>

</xml_diff>

<commit_message>
Moved the Conditions.cs and Status.cs to Enums folder
</commit_message>
<xml_diff>
--- a/Documentations/SRS.docx
+++ b/Documentations/SRS.docx
@@ -268,16 +268,17 @@
             </w:rPr>
             <w:fldChar w:fldCharType="separate"/>
           </w:r>
-          <w:hyperlink w:anchor="__RefHeading___Toc1649_1349472584" w:tooltip="1. Project background and descriptions">
-            <w:r>
-              <w:rPr>
-                <w:rStyle w:val="IndexLink"/>
-              </w:rPr>
-              <w:t>1. Project background and descriptions</w:t>
-              <w:tab/>
-              <w:t>3</w:t>
-            </w:r>
-          </w:hyperlink>
+          <w:r>
+            <w:rPr>
+              <w:rStyle w:val="IndexLink"/>
+            </w:rPr>
+            <w:t>1. Project background and descriptions</w:t>
+          </w:r>
+          <w:r>
+            <w:rPr/>
+            <w:tab/>
+            <w:t>3</w:t>
+          </w:r>
         </w:p>
         <w:p>
           <w:pPr>
@@ -288,16 +289,12 @@
             </w:tabs>
             <w:rPr/>
           </w:pPr>
-          <w:hyperlink w:anchor="__RefHeading___Toc260_2378469445" w:tooltip="2. Project scope">
-            <w:r>
-              <w:rPr>
-                <w:rStyle w:val="IndexLink"/>
-              </w:rPr>
-              <w:t>2. Project scope</w:t>
-              <w:tab/>
-              <w:t>3</w:t>
-            </w:r>
-          </w:hyperlink>
+          <w:r>
+            <w:rPr/>
+            <w:t>2. Project scope</w:t>
+            <w:tab/>
+            <w:t>3</w:t>
+          </w:r>
         </w:p>
         <w:p>
           <w:pPr>
@@ -308,16 +305,12 @@
             </w:tabs>
             <w:rPr/>
           </w:pPr>
-          <w:hyperlink w:anchor="__RefHeading___Toc1653_1349472584" w:tooltip="3. High-level requirements">
-            <w:r>
-              <w:rPr>
-                <w:rStyle w:val="IndexLink"/>
-              </w:rPr>
-              <w:t>3. High-level requirements</w:t>
-              <w:tab/>
-              <w:t>3</w:t>
-            </w:r>
-          </w:hyperlink>
+          <w:r>
+            <w:rPr/>
+            <w:t>3. High-level requirements</w:t>
+            <w:tab/>
+            <w:t>3</w:t>
+          </w:r>
         </w:p>
         <w:p>
           <w:pPr>
@@ -328,16 +321,12 @@
             </w:tabs>
             <w:rPr/>
           </w:pPr>
-          <w:hyperlink w:anchor="__RefHeading___Toc1655_1349472584" w:tooltip="4. Entities">
-            <w:r>
-              <w:rPr>
-                <w:rStyle w:val="IndexLink"/>
-              </w:rPr>
-              <w:t>4. Entities</w:t>
-              <w:tab/>
-              <w:t>3</w:t>
-            </w:r>
-          </w:hyperlink>
+          <w:r>
+            <w:rPr/>
+            <w:t>4. Entities</w:t>
+            <w:tab/>
+            <w:t>3</w:t>
+          </w:r>
         </w:p>
         <w:p>
           <w:pPr>
@@ -348,16 +337,12 @@
             </w:tabs>
             <w:rPr/>
           </w:pPr>
-          <w:hyperlink w:anchor="__RefHeading___Toc1657_1349472584" w:tooltip="5. Success Metrics">
-            <w:r>
-              <w:rPr>
-                <w:rStyle w:val="IndexLink"/>
-              </w:rPr>
-              <w:t>5. Success Metrics</w:t>
-              <w:tab/>
-              <w:t>3</w:t>
-            </w:r>
-          </w:hyperlink>
+          <w:r>
+            <w:rPr/>
+            <w:t>5. Success Metrics</w:t>
+            <w:tab/>
+            <w:t>3</w:t>
+          </w:r>
         </w:p>
         <w:p>
           <w:pPr>
@@ -368,16 +353,12 @@
             </w:tabs>
             <w:rPr/>
           </w:pPr>
-          <w:hyperlink w:anchor="__RefHeading___Toc1659_1349472584" w:tooltip="6. Considerations">
-            <w:r>
-              <w:rPr>
-                <w:rStyle w:val="IndexLink"/>
-              </w:rPr>
-              <w:t>6. Considerations</w:t>
-              <w:tab/>
-              <w:t>4</w:t>
-            </w:r>
-          </w:hyperlink>
+          <w:r>
+            <w:rPr/>
+            <w:t>6. Considerations</w:t>
+            <w:tab/>
+            <w:t>4</w:t>
+          </w:r>
         </w:p>
         <w:p>
           <w:pPr>
@@ -388,16 +369,12 @@
             </w:tabs>
             <w:rPr/>
           </w:pPr>
-          <w:hyperlink w:anchor="__RefHeading___Toc1661_1349472584" w:tooltip="7. Specific Exclusion from Project Scope">
-            <w:r>
-              <w:rPr>
-                <w:rStyle w:val="IndexLink"/>
-              </w:rPr>
-              <w:t>7. Specific Exclusion from Project Scope</w:t>
-              <w:tab/>
-              <w:t>5</w:t>
-            </w:r>
-          </w:hyperlink>
+          <w:r>
+            <w:rPr/>
+            <w:t>7. Specific Exclusion from Project Scope</w:t>
+            <w:tab/>
+            <w:t>5</w:t>
+          </w:r>
         </w:p>
         <w:p>
           <w:pPr>
@@ -408,16 +385,12 @@
             </w:tabs>
             <w:rPr/>
           </w:pPr>
-          <w:hyperlink w:anchor="__RefHeading___Toc1663_1349472584" w:tooltip="8. Dependencies and Technologies">
-            <w:r>
-              <w:rPr>
-                <w:rStyle w:val="IndexLink"/>
-              </w:rPr>
-              <w:t>8. Dependencies and Technologies</w:t>
-              <w:tab/>
-              <w:t>5</w:t>
-            </w:r>
-          </w:hyperlink>
+          <w:r>
+            <w:rPr/>
+            <w:t>8. Dependencies and Technologies</w:t>
+            <w:tab/>
+            <w:t>5</w:t>
+          </w:r>
         </w:p>
         <w:p>
           <w:pPr>
@@ -428,16 +401,12 @@
             </w:tabs>
             <w:rPr/>
           </w:pPr>
-          <w:hyperlink w:anchor="__RefHeading___Toc1665_1349472584" w:tooltip="9. Assumptions">
-            <w:r>
-              <w:rPr>
-                <w:rStyle w:val="IndexLink"/>
-              </w:rPr>
-              <w:t>9. Assumptions</w:t>
-              <w:tab/>
-              <w:t>5</w:t>
-            </w:r>
-          </w:hyperlink>
+          <w:r>
+            <w:rPr/>
+            <w:t>9. Assumptions</w:t>
+            <w:tab/>
+            <w:t>5</w:t>
+          </w:r>
         </w:p>
         <w:p>
           <w:pPr>
@@ -448,20 +417,14 @@
             </w:tabs>
             <w:rPr/>
           </w:pPr>
-          <w:hyperlink w:anchor="__RefHeading___Toc1667_1349472584" w:tooltip="10. Designs and Diagrams">
-            <w:r>
-              <w:rPr>
-                <w:rStyle w:val="IndexLink"/>
-              </w:rPr>
-              <w:t>10. Designs and Diagrams</w:t>
-              <w:tab/>
-              <w:t>5</w:t>
-            </w:r>
-          </w:hyperlink>
           <w:r>
-            <w:rPr>
-              <w:rStyle w:val="IndexLink"/>
-            </w:rPr>
+            <w:rPr/>
+            <w:t>10. Designs and Diagrams</w:t>
+            <w:tab/>
+            <w:t>5</w:t>
+          </w:r>
+          <w:r>
+            <w:rPr/>
             <w:fldChar w:fldCharType="end"/>
           </w:r>
         </w:p>
@@ -670,7 +633,19 @@
       <w:r>
         <w:rPr/>
         <w:tab/>
-        <w:t>InventBox was the inventory management that aims to create, delete, manage, or search the inventory of items for the user’s home and display them in an organized way with categories and locations.</w:t>
+        <w:t xml:space="preserve">InventBox was the inventory management that aims to create, delete, manage, or search the inventory of items </w:t>
+      </w:r>
+      <w:r>
+        <w:rPr/>
+        <w:t>with categories and places</w:t>
+      </w:r>
+      <w:r>
+        <w:rPr/>
+        <w:t xml:space="preserve"> for the user’s home and display them </w:t>
+      </w:r>
+      <w:r>
+        <w:rPr/>
+        <w:t>in a list.</w:t>
       </w:r>
     </w:p>
     <w:p>
@@ -804,7 +779,23 @@
       </w:pPr>
       <w:r>
         <w:rPr/>
-        <w:t>A system that export and import data for easy transfer</w:t>
+        <w:t xml:space="preserve">A system that </w:t>
+      </w:r>
+      <w:r>
+        <w:rPr/>
+        <w:t>save</w:t>
+      </w:r>
+      <w:r>
+        <w:rPr/>
+        <w:t xml:space="preserve"> and </w:t>
+      </w:r>
+      <w:r>
+        <w:rPr/>
+        <w:t>load</w:t>
+      </w:r>
+      <w:r>
+        <w:rPr/>
+        <w:t xml:space="preserve"> data for easy transfer</w:t>
       </w:r>
     </w:p>
     <w:p>
@@ -2535,7 +2526,7 @@
       </w:pPr>
       <w:r>
         <w:rPr/>
-        <w:t>The system will be used to manage the inventory in their home or businesses.</w:t>
+        <w:t>The system will be used to manage the inventory in their home.</w:t>
       </w:r>
     </w:p>
     <w:p>
@@ -2629,7 +2620,7 @@
       <w:r>
         <w:rPr/>
         <w:drawing>
-          <wp:anchor distT="0" distB="0" distL="0" distR="0" simplePos="0" relativeHeight="4" behindDoc="0" locked="0" layoutInCell="0" allowOverlap="1">
+          <wp:anchor distT="0" distB="0" distL="0" distR="0" simplePos="0" relativeHeight="3" behindDoc="0" locked="0" layoutInCell="0" allowOverlap="1">
             <wp:simplePos x="0" y="0"/>
             <wp:positionH relativeFrom="column">
               <wp:align>center</wp:align>
@@ -2741,7 +2732,7 @@
       <w:r>
         <w:rPr/>
         <w:drawing>
-          <wp:anchor distT="0" distB="0" distL="0" distR="0" simplePos="0" relativeHeight="3" behindDoc="0" locked="0" layoutInCell="0" allowOverlap="1">
+          <wp:anchor distT="0" distB="0" distL="0" distR="0" simplePos="0" relativeHeight="2" behindDoc="0" locked="0" layoutInCell="0" allowOverlap="1">
             <wp:simplePos x="0" y="0"/>
             <wp:positionH relativeFrom="column">
               <wp:align>center</wp:align>
@@ -2820,7 +2811,7 @@
       <w:r>
         <w:rPr/>
         <w:drawing>
-          <wp:anchor distT="0" distB="0" distL="0" distR="0" simplePos="0" relativeHeight="5" behindDoc="0" locked="0" layoutInCell="0" allowOverlap="1">
+          <wp:anchor distT="0" distB="0" distL="0" distR="0" simplePos="0" relativeHeight="4" behindDoc="0" locked="0" layoutInCell="0" allowOverlap="1">
             <wp:simplePos x="0" y="0"/>
             <wp:positionH relativeFrom="column">
               <wp:align>center</wp:align>
@@ -2922,7 +2913,7 @@
       <w:r>
         <w:rPr/>
         <w:drawing>
-          <wp:anchor distT="0" distB="0" distL="0" distR="0" simplePos="0" relativeHeight="2" behindDoc="0" locked="0" layoutInCell="0" allowOverlap="1">
+          <wp:anchor distT="0" distB="0" distL="0" distR="0" simplePos="0" relativeHeight="5" behindDoc="0" locked="0" layoutInCell="0" allowOverlap="1">
             <wp:simplePos x="0" y="0"/>
             <wp:positionH relativeFrom="column">
               <wp:align>center</wp:align>
@@ -2930,10 +2921,10 @@
             <wp:positionV relativeFrom="paragraph">
               <wp:posOffset>635</wp:posOffset>
             </wp:positionV>
-            <wp:extent cx="4599305" cy="3684905"/>
+            <wp:extent cx="6332220" cy="4493260"/>
             <wp:effectExtent l="0" t="0" r="0" b="0"/>
-            <wp:wrapTopAndBottom/>
-            <wp:docPr id="4" name="Image6"/>
+            <wp:wrapSquare wrapText="largest"/>
+            <wp:docPr id="4" name="Image4"/>
             <wp:cNvGraphicFramePr>
               <a:graphicFrameLocks xmlns:a="http://schemas.openxmlformats.org/drawingml/2006/main" noChangeAspect="1"/>
             </wp:cNvGraphicFramePr>
@@ -2941,7 +2932,7 @@
               <a:graphicData uri="http://schemas.openxmlformats.org/drawingml/2006/picture">
                 <pic:pic xmlns:pic="http://schemas.openxmlformats.org/drawingml/2006/picture">
                   <pic:nvPicPr>
-                    <pic:cNvPr id="4" name="Image6"/>
+                    <pic:cNvPr id="4" name="Image4"/>
                     <pic:cNvPicPr>
                       <a:picLocks noChangeAspect="1" noChangeArrowheads="1"/>
                     </pic:cNvPicPr>
@@ -2955,7 +2946,7 @@
                   <pic:spPr bwMode="auto">
                     <a:xfrm>
                       <a:off x="0" y="0"/>
-                      <a:ext cx="4599305" cy="3684905"/>
+                      <a:ext cx="6332220" cy="4493260"/>
                     </a:xfrm>
                     <a:prstGeom prst="rect">
                       <a:avLst/>
@@ -4051,7 +4042,7 @@
     <w:pPr>
       <w:widowControl/>
       <w:suppressAutoHyphens w:val="true"/>
-      <w:overflowPunct w:val="false"/>
+      <w:overflowPunct w:val="true"/>
       <w:bidi w:val="0"/>
       <w:spacing w:before="0" w:after="0"/>
       <w:jc w:val="start"/>
@@ -4117,8 +4108,8 @@
     <w:qFormat/>
     <w:rPr/>
   </w:style>
-  <w:style w:type="character" w:styleId="Bulletsuser">
-    <w:name w:val="Bullets (user)"/>
+  <w:style w:type="character" w:styleId="Bullets">
+    <w:name w:val="Bullets"/>
     <w:qFormat/>
     <w:rPr>
       <w:rFonts w:ascii="OpenSymbol" w:hAnsi="OpenSymbol" w:eastAsia="OpenSymbol" w:cs="OpenSymbol"/>
@@ -4199,8 +4190,8 @@
       <w:szCs w:val="12"/>
     </w:rPr>
   </w:style>
-  <w:style w:type="paragraph" w:styleId="FrameContentsuser">
-    <w:name w:val="Frame Contents (user)"/>
+  <w:style w:type="paragraph" w:styleId="FrameContents">
+    <w:name w:val="Frame Contents"/>
     <w:basedOn w:val="Normal"/>
     <w:qFormat/>
     <w:pPr/>

</xml_diff>